<commit_message>
Fracture Lines: the corridors chapter, and fewer six-limbed species
A new chapter explains the corridors: hidden geometry and stable folds,
mouths, depth and the deep metric, drift and collapse, junctions, and
deep-metric communication (the user's write-up), with rules for plotting
transits, running deep, travel times, collapse clocks and messages. The
Veyari become bipeds, the Draelin serpentine, the Zethri four-limbed
with a prehensile tail, and the Vesh use head-tendrils; only the Ozhvek,
Dresh and Brulvek keep six limbs.

Co-Authored-By: Claude Opus 5.5 <noreply@anthropic.com>
Claude-Session: https://claude.ai/code/session_015SADCFzhKijkC2foUmXrpC
</commit_message>
<xml_diff>
--- a/legend-dynamics/spaceopera/Fracture_Lines_Players_Guide.docx
+++ b/legend-dynamics/spaceopera/Fracture_Lines_Players_Guide.docx
@@ -12984,22 +12984,13 @@
     </w:p>
     <w:bookmarkEnd w:id="75"/>
     <w:bookmarkEnd w:id="76"/>
-    <w:bookmarkStart w:id="78" w:name="the-galaxy"/>
+    <w:bookmarkStart w:id="86" w:name="the-corridors"/>
     <w:p>
       <w:pPr>
         <w:pStyle w:val="Heading1"/>
       </w:pPr>
       <w:r>
-        <w:t xml:space="preserve">The galaxy</w:t>
-      </w:r>
-    </w:p>
-    <w:bookmarkStart w:id="77" w:name="the-gravimetric-corridors"/>
-    <w:p>
-      <w:pPr>
-        <w:pStyle w:val="Heading2"/>
-      </w:pPr>
-      <w:r>
-        <w:t xml:space="preserve">The gravimetric corridors</w:t>
+        <w:t xml:space="preserve">The corridors</w:t>
       </w:r>
     </w:p>
     <w:p>
@@ -13007,7 +12998,7 @@
         <w:pStyle w:val="FirstParagraph"/>
       </w:pPr>
       <w:r>
-        <w:t xml:space="preserve">Ships cross interstellar space through</w:t>
+        <w:t xml:space="preserve">Everything in known space (trade, war, news, debt) moves along the</w:t>
       </w:r>
       <w:r>
         <w:t xml:space="preserve"> </w:t>
@@ -13020,7 +13011,53 @@
         <w:t xml:space="preserve">gravimetric corridors</w:t>
       </w:r>
       <w:r>
-        <w:t xml:space="preserve">: natural channels through which a ship can travel between systems in days instead of centuries. The corridors are not fixed. They drift, collapse and reconnect over years or centuries. A journey between two nearby systems can require a lengthy detour, while a deep corridor can connect civilizations thousands of light-years apart. A new connection can turn an isolated world into a strategic prize overnight, and a collapse can strand a fleet, or a whole province, for generations.</w:t>
+        <w:t xml:space="preserve">.</w:t>
+      </w:r>
+    </w:p>
+    <w:bookmarkStart w:id="77" w:name="what-the-corridors-are"/>
+    <w:p>
+      <w:pPr>
+        <w:pStyle w:val="Heading2"/>
+      </w:pPr>
+      <w:r>
+        <w:t xml:space="preserve">What the corridors are</w:t>
+      </w:r>
+    </w:p>
+    <w:p>
+      <w:pPr>
+        <w:pStyle w:val="FirstParagraph"/>
+      </w:pPr>
+      <w:r>
+        <w:t xml:space="preserve">Spacetime has a hidden geometry. Where the combined gravity of stars, dark-matter filaments and the galaxy’s own structure folds it, distant points lie close together, and a</w:t>
+      </w:r>
+      <w:r>
+        <w:t xml:space="preserve"> </w:t>
+      </w:r>
+      <w:r>
+        <w:rPr>
+          <w:bCs/>
+          <w:b/>
+        </w:rPr>
+        <w:t xml:space="preserve">corridor</w:t>
+      </w:r>
+      <w:r>
+        <w:t xml:space="preserve"> </w:t>
+      </w:r>
+      <w:r>
+        <w:t xml:space="preserve">is a stable channel through that fold. Ships do not outrun light. A corridor drive detects a corridor, builds the field needed to enter it at its</w:t>
+      </w:r>
+      <w:r>
+        <w:t xml:space="preserve"> </w:t>
+      </w:r>
+      <w:r>
+        <w:rPr>
+          <w:bCs/>
+          <w:b/>
+        </w:rPr>
+        <w:t xml:space="preserve">mouth</w:t>
+      </w:r>
+      <w:r>
+        <w:t xml:space="preserve">, and protects the ship against its stresses while the fold carries the ship across light-years in hours or days. Outside the corridors, ships are bound to sublight speeds: crossing a system takes days, and crossing between stars without a corridor takes generations, which is how the Vael fleets began.</w:t>
       </w:r>
     </w:p>
     <w:p>
@@ -13028,12 +13065,543 @@
         <w:pStyle w:val="BodyText"/>
       </w:pPr>
       <w:r>
-        <w:t xml:space="preserve">Navigation in the corridors is a skill, a science and a business. The Draelin guilds sell the best charts; the Sen keep the oldest records; the Thrum heard the first patterns in corridor fluctuations; Mirrun instruments detect resonance no one else can.</w:t>
+        <w:t xml:space="preserve">Corridor mouths sit at gravitational balance points, often far out from the star. That is where the stations, toll gates, fortresses and Mandate checkpoints are built.</w:t>
       </w:r>
     </w:p>
     <w:bookmarkEnd w:id="77"/>
+    <w:bookmarkStart w:id="78" w:name="depth"/>
+    <w:p>
+      <w:pPr>
+        <w:pStyle w:val="Heading2"/>
+      </w:pPr>
+      <w:r>
+        <w:t xml:space="preserve">Depth</w:t>
+      </w:r>
+    </w:p>
+    <w:p>
+      <w:pPr>
+        <w:pStyle w:val="FirstParagraph"/>
+      </w:pPr>
+      <w:r>
+        <w:t xml:space="preserve">Corridors are not uniform tunnels: they have</w:t>
+      </w:r>
+      <w:r>
+        <w:t xml:space="preserve"> </w:t>
+      </w:r>
+      <w:r>
+        <w:rPr>
+          <w:bCs/>
+          <w:b/>
+        </w:rPr>
+        <w:t xml:space="preserve">depth</w:t>
+      </w:r>
+      <w:r>
+        <w:t xml:space="preserve">. As a ship descends, spacetime becomes more compressed and gravimetric stress rises sharply. Ships normally travel the upper, navigable layers. Running deeper can cut a transit dramatically, but eventually the pressure exceeds anything a ship and its fields can withstand. Below the navigable layers lies what physicists call the</w:t>
+      </w:r>
+      <w:r>
+        <w:t xml:space="preserve"> </w:t>
+      </w:r>
+      <w:r>
+        <w:rPr>
+          <w:bCs/>
+          <w:b/>
+        </w:rPr>
+        <w:t xml:space="preserve">deep metric</w:t>
+      </w:r>
+      <w:r>
+        <w:t xml:space="preserve">, where two points hundreds or thousands of light-years apart in ordinary space may be very close indeed.</w:t>
+      </w:r>
+    </w:p>
     <w:bookmarkEnd w:id="78"/>
-    <w:bookmarkStart w:id="108" w:name="peoples-of-the-corridors"/>
+    <w:bookmarkStart w:id="79" w:name="drift-collapse-and-junctions"/>
+    <w:p>
+      <w:pPr>
+        <w:pStyle w:val="Heading2"/>
+      </w:pPr>
+      <w:r>
+        <w:t xml:space="preserve">Drift, collapse and junctions</w:t>
+      </w:r>
+    </w:p>
+    <w:p>
+      <w:pPr>
+        <w:pStyle w:val="FirstParagraph"/>
+      </w:pPr>
+      <w:r>
+        <w:t xml:space="preserve">The corridors move. As stars drift relative to one another, the folds shift over centuries; some break suddenly when the balance that held them fails, and new ones open. The Thrum first heard structure in corridor fluctuations, the Sen keep the longest records, and Draelin guilds sell the most current charts, but forecasting a collapse is still an imperfect science. Most scholars say the network is natural; a few find it suspiciously convenient.</w:t>
+      </w:r>
+    </w:p>
+    <w:p>
+      <w:pPr>
+        <w:pStyle w:val="BodyText"/>
+      </w:pPr>
+      <w:r>
+        <w:t xml:space="preserve">Where several corridors meet, at a</w:t>
+      </w:r>
+      <w:r>
+        <w:t xml:space="preserve"> </w:t>
+      </w:r>
+      <w:r>
+        <w:rPr>
+          <w:bCs/>
+          <w:b/>
+        </w:rPr>
+        <w:t xml:space="preserve">junction</w:t>
+      </w:r>
+      <w:r>
+        <w:t xml:space="preserve">, power gathers: every ship and every message between those regions must pass through.</w:t>
+      </w:r>
+    </w:p>
+    <w:bookmarkEnd w:id="79"/>
+    <w:bookmarkStart w:id="84" w:name="deep-metric-communication"/>
+    <w:p>
+      <w:pPr>
+        <w:pStyle w:val="Heading2"/>
+      </w:pPr>
+      <w:r>
+        <w:t xml:space="preserve">Deep-metric communication</w:t>
+      </w:r>
+    </w:p>
+    <w:p>
+      <w:pPr>
+        <w:pStyle w:val="FirstParagraph"/>
+      </w:pPr>
+      <w:r>
+        <w:t xml:space="preserve">The civilizations of known space do not rely on conventional radio for interstellar communication. Instead, advanced societies exploit a phenomenon associated with the same hidden geometry that makes corridor travel possible.</w:t>
+      </w:r>
+    </w:p>
+    <w:bookmarkStart w:id="80" w:name="quantum-gravimetric-communication"/>
+    <w:p>
+      <w:pPr>
+        <w:pStyle w:val="Heading3"/>
+      </w:pPr>
+      <w:r>
+        <w:t xml:space="preserve">Quantum-gravimetric communication</w:t>
+      </w:r>
+    </w:p>
+    <w:p>
+      <w:pPr>
+        <w:pStyle w:val="FirstParagraph"/>
+      </w:pPr>
+      <w:r>
+        <w:t xml:space="preserve">Quantum entanglement alone cannot transmit information. This remains true even for civilizations thousands of years more technologically advanced than humanity. The breakthrough comes from combining quantum systems with the deep metric.</w:t>
+      </w:r>
+    </w:p>
+    <w:p>
+      <w:pPr>
+        <w:pStyle w:val="BodyText"/>
+      </w:pPr>
+      <w:r>
+        <w:t xml:space="preserve">Specialized transmitters generate precisely controlled quantum states coupled to minute gravimetric disturbances. Under the correct conditions, these disturbances enter a propagating mode within the deep metric. The entangled quantum systems provide synchronization, discrimination and extreme sensitivity. The</w:t>
+      </w:r>
+      <w:r>
+        <w:t xml:space="preserve"> </w:t>
+      </w:r>
+      <w:r>
+        <w:rPr>
+          <w:bCs/>
+          <w:b/>
+        </w:rPr>
+        <w:t xml:space="preserve">gravimetric disturbance actually carries the information</w:t>
+      </w:r>
+      <w:r>
+        <w:t xml:space="preserve">.</w:t>
+      </w:r>
+    </w:p>
+    <w:p>
+      <w:pPr>
+        <w:pStyle w:val="BodyText"/>
+      </w:pPr>
+      <w:r>
+        <w:t xml:space="preserve">Consequently, quantum-gravimetric communication does not depend upon instantaneous communication through entanglement. The signal physically travels between transmitter and receiver, but through a region of spacetime in which the effective distance between the two points is enormously reduced. To observers limited to normal space, the result can appear to be faster-than-light communication.</w:t>
+      </w:r>
+    </w:p>
+    <w:bookmarkEnd w:id="80"/>
+    <w:bookmarkStart w:id="81" w:name="why-humanity-didnt-discover-it"/>
+    <w:p>
+      <w:pPr>
+        <w:pStyle w:val="Heading3"/>
+      </w:pPr>
+      <w:r>
+        <w:t xml:space="preserve">Why humanity didn’t discover it</w:t>
+      </w:r>
+    </w:p>
+    <w:p>
+      <w:pPr>
+        <w:pStyle w:val="FirstParagraph"/>
+      </w:pPr>
+      <w:r>
+        <w:t xml:space="preserve">Humanity discovered corridor travel through comparatively large-scale manipulation of spacetime. Human drives could detect corridors, create the fields necessary to enter them and protect spacecraft against their stresses. None of this required access to the deep metric.</w:t>
+      </w:r>
+    </w:p>
+    <w:p>
+      <w:pPr>
+        <w:pStyle w:val="BodyText"/>
+      </w:pPr>
+      <w:r>
+        <w:t xml:space="preserve">Human scientists improved radio, laser, quantum and gravimetric communications for centuries. They even detected minute fluctuations originating within corridors, but those fluctuations appeared natural: background gravimetric noise, turbulence from stellar masses, corridor interactions and poorly understood processes below navigable depths. Human physics also correctly showed that entanglement could not, by itself, transmit information faster than light, so there was little reason to read random-seeming quantum-scale fluctuations as communication.</w:t>
+      </w:r>
+    </w:p>
+    <w:p>
+      <w:pPr>
+        <w:pStyle w:val="BodyText"/>
+      </w:pPr>
+      <w:r>
+        <w:t xml:space="preserve">Humanity wasn’t failing to build the right radio.</w:t>
+      </w:r>
+      <w:r>
+        <w:t xml:space="preserve"> </w:t>
+      </w:r>
+      <w:r>
+        <w:rPr>
+          <w:bCs/>
+          <w:b/>
+        </w:rPr>
+        <w:t xml:space="preserve">Humanity didn’t know the communications medium existed.</w:t>
+      </w:r>
+    </w:p>
+    <w:bookmarkEnd w:id="81"/>
+    <w:bookmarkStart w:id="82" w:name="the-antenna"/>
+    <w:p>
+      <w:pPr>
+        <w:pStyle w:val="Heading3"/>
+      </w:pPr>
+      <w:r>
+        <w:t xml:space="preserve">The antenna</w:t>
+      </w:r>
+    </w:p>
+    <w:p>
+      <w:pPr>
+        <w:pStyle w:val="FirstParagraph"/>
+      </w:pPr>
+      <w:r>
+        <w:t xml:space="preserve">The mystery became apparent after humanity met its first extraterrestrial spacecraft. The Kel explorers, a people economically subordinate to the Tessan, were clearly coordinating with parties who were not present. Human sensors detected no radio, laser or neutrino signals, or any other recognizable carrier. Yet the Kel were communicating with someone.</w:t>
+      </w:r>
+    </w:p>
+    <w:p>
+      <w:pPr>
+        <w:pStyle w:val="BodyText"/>
+      </w:pPr>
+      <w:r>
+        <w:t xml:space="preserve">Examination of their technology revealed sophisticated quantum apparatus tied to extremely small distortions of the local gravitational field. Human scientists variously identified it as navigation hardware, exotic computing machinery, or part of the corridor drive. The critical realization came later:</w:t>
+      </w:r>
+      <w:r>
+        <w:t xml:space="preserve"> </w:t>
+      </w:r>
+      <w:r>
+        <w:rPr>
+          <w:bCs/>
+          <w:b/>
+        </w:rPr>
+        <w:t xml:space="preserve">it was an antenna.</w:t>
+      </w:r>
+      <w:r>
+        <w:t xml:space="preserve"> </w:t>
+      </w:r>
+      <w:r>
+        <w:t xml:space="preserve">The random gravimetric background of the corridors contained structured information.</w:t>
+      </w:r>
+    </w:p>
+    <w:p>
+      <w:pPr>
+        <w:pStyle w:val="BodyText"/>
+      </w:pPr>
+      <w:r>
+        <w:t xml:space="preserve">Humanity had spent centuries listening for voices among the stars. The galaxy had never been silent. Humanity had simply been listening to the wrong part of the universe.</w:t>
+      </w:r>
+    </w:p>
+    <w:bookmarkEnd w:id="82"/>
+    <w:bookmarkStart w:id="83" w:name="the-network-is-the-map"/>
+    <w:p>
+      <w:pPr>
+        <w:pStyle w:val="Heading3"/>
+      </w:pPr>
+      <w:r>
+        <w:t xml:space="preserve">The network is the map</w:t>
+      </w:r>
+    </w:p>
+    <w:p>
+      <w:pPr>
+        <w:pStyle w:val="FirstParagraph"/>
+      </w:pPr>
+      <w:r>
+        <w:t xml:space="preserve">Deep-metric signals do not propagate equally well everywhere. They follow the underlying geometry of the corridors and converge on major junctions, so the transportation map of known space is also, broadly, its communications map. A junction has three kinds of strategic value:</w:t>
+      </w:r>
+    </w:p>
+    <w:p>
+      <w:pPr>
+        <w:numPr>
+          <w:ilvl w:val="0"/>
+          <w:numId w:val="1012"/>
+        </w:numPr>
+        <w:pStyle w:val="Compact"/>
+      </w:pPr>
+      <w:r>
+        <w:rPr>
+          <w:bCs/>
+          <w:b/>
+        </w:rPr>
+        <w:t xml:space="preserve">Transportation.</w:t>
+      </w:r>
+      <w:r>
+        <w:t xml:space="preserve"> </w:t>
+      </w:r>
+      <w:r>
+        <w:t xml:space="preserve">Ships and commerce must pass through it.</w:t>
+      </w:r>
+    </w:p>
+    <w:p>
+      <w:pPr>
+        <w:numPr>
+          <w:ilvl w:val="0"/>
+          <w:numId w:val="1012"/>
+        </w:numPr>
+        <w:pStyle w:val="Compact"/>
+      </w:pPr>
+      <w:r>
+        <w:rPr>
+          <w:bCs/>
+          <w:b/>
+        </w:rPr>
+        <w:t xml:space="preserve">Communication.</w:t>
+      </w:r>
+      <w:r>
+        <w:t xml:space="preserve"> </w:t>
+      </w:r>
+      <w:r>
+        <w:t xml:space="preserve">Deep-metric traffic naturally converges on it.</w:t>
+      </w:r>
+    </w:p>
+    <w:p>
+      <w:pPr>
+        <w:numPr>
+          <w:ilvl w:val="0"/>
+          <w:numId w:val="1012"/>
+        </w:numPr>
+        <w:pStyle w:val="Compact"/>
+      </w:pPr>
+      <w:r>
+        <w:rPr>
+          <w:bCs/>
+          <w:b/>
+        </w:rPr>
+        <w:t xml:space="preserve">Information.</w:t>
+      </w:r>
+      <w:r>
+        <w:t xml:space="preserve"> </w:t>
+      </w:r>
+      <w:r>
+        <w:t xml:space="preserve">Whoever controls it can relay, restrict, monitor or disrupt enormous quantities of interstellar communication.</w:t>
+      </w:r>
+    </w:p>
+    <w:p>
+      <w:pPr>
+        <w:pStyle w:val="FirstParagraph"/>
+      </w:pPr>
+      <w:r>
+        <w:t xml:space="preserve">Control of corridor intersections is one of the fundamental sources of political and economic power in known space. For civilizations such as the Tessan, power does not require conquest: control over contracts, debt, corridor access and communications can bind entire worlds without a Tessan soldier ever setting foot on them.</w:t>
+      </w:r>
+    </w:p>
+    <w:bookmarkEnd w:id="83"/>
+    <w:bookmarkEnd w:id="84"/>
+    <w:bookmarkStart w:id="85" w:name="corridors-in-play"/>
+    <w:p>
+      <w:pPr>
+        <w:pStyle w:val="Heading2"/>
+      </w:pPr>
+      <w:r>
+        <w:t xml:space="preserve">Corridors in play</w:t>
+      </w:r>
+    </w:p>
+    <w:p>
+      <w:pPr>
+        <w:numPr>
+          <w:ilvl w:val="0"/>
+          <w:numId w:val="1013"/>
+        </w:numPr>
+        <w:pStyle w:val="Compact"/>
+      </w:pPr>
+      <w:r>
+        <w:rPr>
+          <w:bCs/>
+          <w:b/>
+        </w:rPr>
+        <w:t xml:space="preserve">Plotting a transit.</w:t>
+      </w:r>
+      <w:r>
+        <w:t xml:space="preserve"> </w:t>
+      </w:r>
+      <w:r>
+        <w:t xml:space="preserve">The navigator rolls</w:t>
+      </w:r>
+      <w:r>
+        <w:t xml:space="preserve"> </w:t>
+      </w:r>
+      <w:r>
+        <w:rPr>
+          <w:bCs/>
+          <w:b/>
+        </w:rPr>
+        <w:t xml:space="preserve">Navigation</w:t>
+      </w:r>
+      <w:r>
+        <w:t xml:space="preserve">. Fresh guild charts are ordinary; charts a few months old give −2; charts years old, or an unstable corridor, give −4. Failure costs time, delivers the ship to the wrong mouth, or ticks a danger clock; a natural 18 is a misjump into the unknown.</w:t>
+      </w:r>
+    </w:p>
+    <w:p>
+      <w:pPr>
+        <w:numPr>
+          <w:ilvl w:val="0"/>
+          <w:numId w:val="1013"/>
+        </w:numPr>
+        <w:pStyle w:val="Compact"/>
+      </w:pPr>
+      <w:r>
+        <w:rPr>
+          <w:bCs/>
+          <w:b/>
+        </w:rPr>
+        <w:t xml:space="preserve">Running deep.</w:t>
+      </w:r>
+      <w:r>
+        <w:t xml:space="preserve"> </w:t>
+      </w:r>
+      <w:r>
+        <w:t xml:space="preserve">Each step below the usual layers halves the transit time and gives −2 to the Navigation roll. Failing by 3 or more while deep means gravimetric stress: everyone aboard rolls Body or marks a box, and the ship needs repairs (Engineering) before its next transit.</w:t>
+      </w:r>
+    </w:p>
+    <w:p>
+      <w:pPr>
+        <w:numPr>
+          <w:ilvl w:val="0"/>
+          <w:numId w:val="1013"/>
+        </w:numPr>
+        <w:pStyle w:val="Compact"/>
+      </w:pPr>
+      <w:r>
+        <w:rPr>
+          <w:bCs/>
+          <w:b/>
+        </w:rPr>
+        <w:t xml:space="preserve">Travel times.</w:t>
+      </w:r>
+      <w:r>
+        <w:t xml:space="preserve"> </w:t>
+      </w:r>
+      <w:r>
+        <w:t xml:space="preserve">Between neighboring systems: hours. Across a region: one to three days. A long haul through several junctions: one to two weeks.</w:t>
+      </w:r>
+    </w:p>
+    <w:p>
+      <w:pPr>
+        <w:numPr>
+          <w:ilvl w:val="0"/>
+          <w:numId w:val="1013"/>
+        </w:numPr>
+        <w:pStyle w:val="Compact"/>
+      </w:pPr>
+      <w:r>
+        <w:rPr>
+          <w:bCs/>
+          <w:b/>
+        </w:rPr>
+        <w:t xml:space="preserve">Collapse.</w:t>
+      </w:r>
+      <w:r>
+        <w:t xml:space="preserve"> </w:t>
+      </w:r>
+      <w:r>
+        <w:t xml:space="preserve">An unstable corridor is a danger clock (usually 6 segments) that ticks with time and every failed transit; when it fills, the corridor closes, with whoever is inside.</w:t>
+      </w:r>
+    </w:p>
+    <w:p>
+      <w:pPr>
+        <w:numPr>
+          <w:ilvl w:val="0"/>
+          <w:numId w:val="1013"/>
+        </w:numPr>
+        <w:pStyle w:val="Compact"/>
+      </w:pPr>
+      <w:r>
+        <w:rPr>
+          <w:bCs/>
+          <w:b/>
+        </w:rPr>
+        <w:t xml:space="preserve">Messages.</w:t>
+      </w:r>
+      <w:r>
+        <w:t xml:space="preserve"> </w:t>
+      </w:r>
+      <w:r>
+        <w:t xml:space="preserve">A deep-metric transceiver reaches anywhere on the network: within a junction’s region in minutes, across several junctions in hours. Worlds behind collapsed corridors can’t be reached at all. Every message passes through junctions, and their owners listen: sending something sensitive through a hostile junction takes a</w:t>
+      </w:r>
+      <w:r>
+        <w:t xml:space="preserve"> </w:t>
+      </w:r>
+      <w:r>
+        <w:rPr>
+          <w:bCs/>
+          <w:b/>
+        </w:rPr>
+        <w:t xml:space="preserve">Computers</w:t>
+      </w:r>
+      <w:r>
+        <w:t xml:space="preserve"> </w:t>
+      </w:r>
+      <w:r>
+        <w:t xml:space="preserve">roll to hide it, and a failure marks</w:t>
+      </w:r>
+      <w:r>
+        <w:t xml:space="preserve"> </w:t>
+      </w:r>
+      <w:r>
+        <w:rPr>
+          <w:bCs/>
+          <w:b/>
+        </w:rPr>
+        <w:t xml:space="preserve">Heat</w:t>
+      </w:r>
+      <w:r>
+        <w:t xml:space="preserve">.</w:t>
+      </w:r>
+    </w:p>
+    <w:p>
+      <w:pPr>
+        <w:numPr>
+          <w:ilvl w:val="0"/>
+          <w:numId w:val="1013"/>
+        </w:numPr>
+        <w:pStyle w:val="Compact"/>
+      </w:pPr>
+      <w:r>
+        <w:rPr>
+          <w:bCs/>
+          <w:b/>
+        </w:rPr>
+        <w:t xml:space="preserve">Mouths and junctions.</w:t>
+      </w:r>
+      <w:r>
+        <w:t xml:space="preserve"> </w:t>
+      </w:r>
+      <w:r>
+        <w:t xml:space="preserve">Expect papers, tolls (which can mark</w:t>
+      </w:r>
+      <w:r>
+        <w:t xml:space="preserve"> </w:t>
+      </w:r>
+      <w:r>
+        <w:rPr>
+          <w:bCs/>
+          <w:b/>
+        </w:rPr>
+        <w:t xml:space="preserve">Debt</w:t>
+      </w:r>
+      <w:r>
+        <w:t xml:space="preserve">) and Mandate screenings.</w:t>
+      </w:r>
+    </w:p>
+    <w:bookmarkEnd w:id="85"/>
+    <w:bookmarkEnd w:id="86"/>
+    <w:bookmarkStart w:id="116" w:name="peoples-of-the-corridors"/>
     <w:p>
       <w:pPr>
         <w:pStyle w:val="Heading1"/>
@@ -13079,7 +13647,7 @@
         <w:t xml:space="preserve">chapter.</w:t>
       </w:r>
     </w:p>
-    <w:bookmarkStart w:id="79" w:name="the-political-landscape"/>
+    <w:bookmarkStart w:id="87" w:name="the-political-landscape"/>
     <w:p>
       <w:pPr>
         <w:pStyle w:val="Heading2"/>
@@ -13136,8 +13704,8 @@
         <w:t xml:space="preserve">No power controls the entire corridor network, and no species has a monopoly on intelligence, technological innovation, or ambition.</w:t>
       </w:r>
     </w:p>
-    <w:bookmarkEnd w:id="79"/>
-    <w:bookmarkStart w:id="85" w:name="the-established-and-emerging-powers"/>
+    <w:bookmarkEnd w:id="87"/>
+    <w:bookmarkStart w:id="93" w:name="the-established-and-emerging-powers"/>
     <w:p>
       <w:pPr>
         <w:pStyle w:val="Heading2"/>
@@ -13146,7 +13714,7 @@
         <w:t xml:space="preserve">The established and emerging powers</w:t>
       </w:r>
     </w:p>
-    <w:bookmarkStart w:id="80" w:name="humans"/>
+    <w:bookmarkStart w:id="88" w:name="humans"/>
     <w:p>
       <w:pPr>
         <w:pStyle w:val="Heading3"/>
@@ -13187,8 +13755,8 @@
         <w:t xml:space="preserve">Humanity’s economic innovations have begun influencing Tessan institutions, while its explorers and entrepreneurs push into regions older civilizations consider unprofitable or dangerous.</w:t>
       </w:r>
     </w:p>
-    <w:bookmarkEnd w:id="80"/>
-    <w:bookmarkStart w:id="81" w:name="tessan"/>
+    <w:bookmarkEnd w:id="88"/>
+    <w:bookmarkStart w:id="89" w:name="tessan"/>
     <w:p>
       <w:pPr>
         <w:pStyle w:val="Heading3"/>
@@ -13229,8 +13797,8 @@
         <w:t xml:space="preserve">Contact with humanity has introduced new economic thinking into Tessan society, creating a growing division between traditional creditors and reformers who question the profitability of perpetual debt.</w:t>
       </w:r>
     </w:p>
-    <w:bookmarkEnd w:id="81"/>
-    <w:bookmarkStart w:id="82" w:name="kel"/>
+    <w:bookmarkEnd w:id="89"/>
+    <w:bookmarkStart w:id="90" w:name="kel"/>
     <w:p>
       <w:pPr>
         <w:pStyle w:val="Heading3"/>
@@ -13271,8 +13839,8 @@
         <w:t xml:space="preserve">Today, Kel society is divided between contractual loyalists, reformers seeking negotiated emancipation, and radicals who believe their world’s debts can only be ended through force.</w:t>
       </w:r>
     </w:p>
-    <w:bookmarkEnd w:id="82"/>
-    <w:bookmarkStart w:id="83" w:name="mirrun"/>
+    <w:bookmarkEnd w:id="90"/>
+    <w:bookmarkStart w:id="91" w:name="mirrun"/>
     <w:p>
       <w:pPr>
         <w:pStyle w:val="Heading3"/>
@@ -13313,8 +13881,8 @@
         <w:t xml:space="preserve">Mirrun researchers are among the leading specialists in gravimetric resonance detection. Their biological sensitivity inspired several important improvements in corridor instrumentation. Their principal strategic concern is the protection of ocean worlds from extractive industries.</w:t>
       </w:r>
     </w:p>
-    <w:bookmarkEnd w:id="83"/>
-    <w:bookmarkStart w:id="84" w:name="ylith"/>
+    <w:bookmarkEnd w:id="91"/>
+    <w:bookmarkStart w:id="92" w:name="ylith"/>
     <w:p>
       <w:pPr>
         <w:pStyle w:val="Heading3"/>
@@ -13355,9 +13923,9 @@
         <w:t xml:space="preserve">Their independent city-states are renowned for navigation, long-range observation, and exploratory cartography. Ylith navigators have discovered corridors that conventional instruments initially failed to identify.</w:t>
       </w:r>
     </w:p>
-    <w:bookmarkEnd w:id="84"/>
-    <w:bookmarkEnd w:id="85"/>
-    <w:bookmarkStart w:id="91" w:name="Xff4a93679c910774e2f02ac587efedb0ceda74a"/>
+    <w:bookmarkEnd w:id="92"/>
+    <w:bookmarkEnd w:id="93"/>
+    <w:bookmarkStart w:id="99" w:name="Xff4a93679c910774e2f02ac587efedb0ceda74a"/>
     <w:p>
       <w:pPr>
         <w:pStyle w:val="Heading2"/>
@@ -13390,7 +13958,7 @@
         <w:t xml:space="preserve">Both its internal factions and external enemies have exploited the shifting gravimetric corridors. An imperial province isolated for centuries can become an independent civilization. When its corridor reopens, the Hegemony may return to reclaim it.</w:t>
       </w:r>
     </w:p>
-    <w:bookmarkStart w:id="86" w:name="ozhvek-the-imperial-founders"/>
+    <w:bookmarkStart w:id="94" w:name="ozhvek-the-imperial-founders"/>
     <w:p>
       <w:pPr>
         <w:pStyle w:val="Heading3"/>
@@ -13439,8 +14007,8 @@
         <w:t xml:space="preserve">The greatest threat to Ozhvek dominance is not necessarily another species. It is the inability of their ruling houses to agree on what the Hegemony should become.</w:t>
       </w:r>
     </w:p>
-    <w:bookmarkEnd w:id="86"/>
-    <w:bookmarkStart w:id="87" w:name="dresh-the-imperial-soldiers"/>
+    <w:bookmarkEnd w:id="94"/>
+    <w:bookmarkStart w:id="95" w:name="dresh-the-imperial-soldiers"/>
     <w:p>
       <w:pPr>
         <w:pStyle w:val="Heading3"/>
@@ -13489,8 +14057,8 @@
         <w:t xml:space="preserve">Dresh military society prizes competence and mutual obligation. Their greatest political dispute concerns whether soldiers owe allegiance to the imperial throne, their commanders, or the populations they protect.</w:t>
       </w:r>
     </w:p>
-    <w:bookmarkEnd w:id="87"/>
-    <w:bookmarkStart w:id="88" w:name="shivar-the-keepers-of-orthodoxy"/>
+    <w:bookmarkEnd w:id="95"/>
+    <w:bookmarkStart w:id="96" w:name="shivar-the-keepers-of-orthodoxy"/>
     <w:p>
       <w:pPr>
         <w:pStyle w:val="Heading3"/>
@@ -13547,8 +14115,8 @@
         <w:t xml:space="preserve">The resulting religious schism has fueled uprisings, political assassinations, and wars within the Hegemony.</w:t>
       </w:r>
     </w:p>
-    <w:bookmarkEnd w:id="88"/>
-    <w:bookmarkStart w:id="89" w:name="brulvek-the-industrial-survivors"/>
+    <w:bookmarkEnd w:id="96"/>
+    <w:bookmarkStart w:id="97" w:name="brulvek-the-industrial-survivors"/>
     <w:p>
       <w:pPr>
         <w:pStyle w:val="Heading3"/>
@@ -13605,8 +14173,8 @@
         <w:t xml:space="preserve">Brulvek engineers are highly sought after throughout known space, particularly for their ability to restore machinery that has operated for centuries without replacement parts.</w:t>
       </w:r>
     </w:p>
-    <w:bookmarkEnd w:id="89"/>
-    <w:bookmarkStart w:id="90" w:name="zhaq-the-lost-province"/>
+    <w:bookmarkEnd w:id="97"/>
+    <w:bookmarkStart w:id="98" w:name="zhaq-the-lost-province"/>
     <w:p>
       <w:pPr>
         <w:pStyle w:val="Heading3"/>
@@ -13679,9 +14247,9 @@
         <w:t xml:space="preserve">Their continuing resistance has become a symbol for separatist movements throughout imperial space.</w:t>
       </w:r>
     </w:p>
-    <w:bookmarkEnd w:id="90"/>
-    <w:bookmarkEnd w:id="91"/>
-    <w:bookmarkStart w:id="107" w:name="X7cf45656e26c6332fca34295f43177ee2dc74b7"/>
+    <w:bookmarkEnd w:id="98"/>
+    <w:bookmarkEnd w:id="99"/>
+    <w:bookmarkStart w:id="115" w:name="X7cf45656e26c6332fca34295f43177ee2dc74b7"/>
     <w:p>
       <w:pPr>
         <w:pStyle w:val="Heading2"/>
@@ -13690,7 +14258,7 @@
         <w:t xml:space="preserve">Independent civilizations and regional powers</w:t>
       </w:r>
     </w:p>
-    <w:bookmarkStart w:id="92" w:name="veyari-the-memory-keepers"/>
+    <w:bookmarkStart w:id="100" w:name="veyari-the-memory-keepers"/>
     <w:p>
       <w:pPr>
         <w:pStyle w:val="Heading3"/>
@@ -13712,7 +14280,7 @@
         <w:pStyle w:val="BodyText"/>
       </w:pPr>
       <w:r>
-        <w:t xml:space="preserve">Small, six-limbed beings with soft protective scales and unusually developed sensory organs. Veyari brains possess specialized structures for organizing long-term associative memory, allowing individuals to retain remarkable quantities of experiential information.</w:t>
+        <w:t xml:space="preserve">Small bipeds with long, delicate fingers, soft protective scales, large dark eyes and unusually developed sensory organs. Veyari brains possess specialized structures for organizing long-term associative memory, allowing individuals to retain remarkable quantities of experiential information.</w:t>
       </w:r>
     </w:p>
     <w:p>
@@ -13747,8 +14315,8 @@
         <w:t xml:space="preserve">Their greatest strength is knowledge. Their greatest vulnerability is the assumption that knowledge should be preserved even when powerful civilizations would prefer it forgotten.</w:t>
       </w:r>
     </w:p>
-    <w:bookmarkEnd w:id="92"/>
-    <w:bookmarkStart w:id="93" w:name="eshuum-the-distributed-minds"/>
+    <w:bookmarkEnd w:id="100"/>
+    <w:bookmarkStart w:id="101" w:name="eshuum-the-distributed-minds"/>
     <w:p>
       <w:pPr>
         <w:pStyle w:val="Heading3"/>
@@ -13805,8 +14373,8 @@
         <w:t xml:space="preserve">Their political institutions strongly oppose forced separation, biological experimentation without consent, and the ownership of intelligent organisms. These positions have brought them into direct conflict with several Hegemony research authorities.</w:t>
       </w:r>
     </w:p>
-    <w:bookmarkEnd w:id="93"/>
-    <w:bookmarkStart w:id="94" w:name="khaum-the-deep-dwellers"/>
+    <w:bookmarkEnd w:id="101"/>
+    <w:bookmarkStart w:id="102" w:name="khaum-the-deep-dwellers"/>
     <w:p>
       <w:pPr>
         <w:pStyle w:val="Heading3"/>
@@ -13871,8 +14439,8 @@
         <w:t xml:space="preserve">Their underground refuges have sheltered refugees from multiple Hegemony campaigns.</w:t>
       </w:r>
     </w:p>
-    <w:bookmarkEnd w:id="94"/>
-    <w:bookmarkStart w:id="95" w:name="vael-the-living-fleets"/>
+    <w:bookmarkEnd w:id="102"/>
+    <w:bookmarkStart w:id="103" w:name="vael-the-living-fleets"/>
     <w:p>
       <w:pPr>
         <w:pStyle w:val="Heading3"/>
@@ -13929,8 +14497,8 @@
         <w:t xml:space="preserve">Vael flotillas have repeatedly been caught between Hegemony forces and separatist territories. Their determination to remain politically independent has made them both valuable intermediaries and frequent targets of suspicion.</w:t>
       </w:r>
     </w:p>
-    <w:bookmarkEnd w:id="95"/>
-    <w:bookmarkStart w:id="96" w:name="thrum-the-resonant-people"/>
+    <w:bookmarkEnd w:id="103"/>
+    <w:bookmarkStart w:id="104" w:name="thrum-the-resonant-people"/>
     <w:p>
       <w:pPr>
         <w:pStyle w:val="Heading3"/>
@@ -13995,8 +14563,8 @@
         <w:t xml:space="preserve">Their technology is widely respected, although their reluctance to permit military applications has strained relations with several governments.</w:t>
       </w:r>
     </w:p>
-    <w:bookmarkEnd w:id="96"/>
-    <w:bookmarkStart w:id="97" w:name="corvani-the-ecological-architects"/>
+    <w:bookmarkEnd w:id="104"/>
+    <w:bookmarkStart w:id="105" w:name="corvani-the-ecological-architects"/>
     <w:p>
       <w:pPr>
         <w:pStyle w:val="Heading3"/>
@@ -14053,8 +14621,8 @@
         <w:t xml:space="preserve">Corvani restoration teams operate on worlds devastated by Hegemony industrial extraction, although their insistence on ecological safeguards frequently brings them into conflict with mining corporations and colonial governments.</w:t>
       </w:r>
     </w:p>
-    <w:bookmarkEnd w:id="97"/>
-    <w:bookmarkStart w:id="98" w:name="uxarra-the-shifting-ones"/>
+    <w:bookmarkEnd w:id="105"/>
+    <w:bookmarkStart w:id="106" w:name="uxarra-the-shifting-ones"/>
     <w:p>
       <w:pPr>
         <w:pStyle w:val="Heading3"/>
@@ -14111,8 +14679,8 @@
         <w:t xml:space="preserve">Uxarra explorers and rescue specialists are highly valued for operations in unstable environments, particularly worlds affected by corridor disruptions or natural disasters.</w:t>
       </w:r>
     </w:p>
-    <w:bookmarkEnd w:id="98"/>
-    <w:bookmarkStart w:id="99" w:name="sen-the-patient-observers"/>
+    <w:bookmarkEnd w:id="106"/>
+    <w:bookmarkStart w:id="107" w:name="sen-the-patient-observers"/>
     <w:p>
       <w:pPr>
         <w:pStyle w:val="Heading3"/>
@@ -14177,8 +14745,8 @@
         <w:t xml:space="preserve">Their governments rarely intervene in external affairs, but their warnings concerning corridor instability carry considerable weight among navigators and scientists.</w:t>
       </w:r>
     </w:p>
-    <w:bookmarkEnd w:id="99"/>
-    <w:bookmarkStart w:id="100" w:name="joruun-the-borderland-confederates"/>
+    <w:bookmarkEnd w:id="107"/>
+    <w:bookmarkStart w:id="108" w:name="joruun-the-borderland-confederates"/>
     <w:p>
       <w:pPr>
         <w:pStyle w:val="Heading3"/>
@@ -14243,8 +14811,8 @@
         <w:t xml:space="preserve">Their greatest political challenge is maintaining unity during periods when the imperial threat appears to recede.</w:t>
       </w:r>
     </w:p>
-    <w:bookmarkEnd w:id="100"/>
-    <w:bookmarkStart w:id="101" w:name="qor-the-silicon-minds"/>
+    <w:bookmarkEnd w:id="108"/>
+    <w:bookmarkStart w:id="109" w:name="qor-the-silicon-minds"/>
     <w:p>
       <w:pPr>
         <w:pStyle w:val="Heading3"/>
@@ -14317,8 +14885,8 @@
         <w:t xml:space="preserve">Their relationship with the Tessan is complex: Tessan capital has helped expand Qor industry, but Qor political leaders refuse to permit debt arrangements that threaten planetary sovereignty.</w:t>
       </w:r>
     </w:p>
-    <w:bookmarkEnd w:id="101"/>
-    <w:bookmarkStart w:id="102" w:name="ommek-the-makers-of-machines"/>
+    <w:bookmarkEnd w:id="109"/>
+    <w:bookmarkStart w:id="110" w:name="ommek-the-makers-of-machines"/>
     <w:p>
       <w:pPr>
         <w:pStyle w:val="Heading3"/>
@@ -14391,8 +14959,8 @@
         <w:t xml:space="preserve">Ommek defensive systems have made direct conquest prohibitively expensive.</w:t>
       </w:r>
     </w:p>
-    <w:bookmarkEnd w:id="102"/>
-    <w:bookmarkStart w:id="103" w:name="vesh-the-newcomers"/>
+    <w:bookmarkEnd w:id="110"/>
+    <w:bookmarkStart w:id="111" w:name="vesh-the-newcomers"/>
     <w:p>
       <w:pPr>
         <w:pStyle w:val="Heading3"/>
@@ -14414,7 +14982,7 @@
         <w:pStyle w:val="BodyText"/>
       </w:pPr>
       <w:r>
-        <w:t xml:space="preserve">Vesh are slender, quadrupedal beings with two additional manipulator limbs and delicate sensory filaments extending from their heads.</w:t>
+        <w:t xml:space="preserve">Vesh are slender quadrupeds who handle tools with the delicate, prehensile sensory tendrils that extend from their heads.</w:t>
       </w:r>
     </w:p>
     <w:p>
@@ -14465,8 +15033,8 @@
         <w:t xml:space="preserve">Human diplomats have developed a particularly strong interest in Vesh affairs, recognizing many of the difficulties humanity experienced during its own early expansion.</w:t>
       </w:r>
     </w:p>
-    <w:bookmarkEnd w:id="103"/>
-    <w:bookmarkStart w:id="104" w:name="uth-the-refugees-of-empire"/>
+    <w:bookmarkEnd w:id="111"/>
+    <w:bookmarkStart w:id="112" w:name="uth-the-refugees-of-empire"/>
     <w:p>
       <w:pPr>
         <w:pStyle w:val="Heading3"/>
@@ -14539,8 +15107,8 @@
         <w:t xml:space="preserve">Uth activists are prominent in anti-Hegemony movements, although many Uth reject the idea that their people should be defined exclusively by historical suffering.</w:t>
       </w:r>
     </w:p>
-    <w:bookmarkEnd w:id="104"/>
-    <w:bookmarkStart w:id="105" w:name="draelin-the-corridor-cartographers"/>
+    <w:bookmarkEnd w:id="112"/>
+    <w:bookmarkStart w:id="113" w:name="draelin-the-corridor-cartographers"/>
     <w:p>
       <w:pPr>
         <w:pStyle w:val="Heading3"/>
@@ -14562,7 +15130,7 @@
         <w:pStyle w:val="BodyText"/>
       </w:pPr>
       <w:r>
-        <w:t xml:space="preserve">Draelin are elongated, six-limbed organisms with specialized electromagnetic sensory structures and unusually flexible skeletal systems.</w:t>
+        <w:t xml:space="preserve">Draelin are long, serpentine beings with no legs and two long arms, who move by undulating their flexible bodies; specialized structures along their length sense electromagnetic fields.</w:t>
       </w:r>
     </w:p>
     <w:p>
@@ -14621,8 +15189,8 @@
         <w:t xml:space="preserve">Their internal politics are shaped by a central question: whether knowledge of safe passage should be treated as a public good or a commercial asset.</w:t>
       </w:r>
     </w:p>
-    <w:bookmarkEnd w:id="105"/>
-    <w:bookmarkStart w:id="106" w:name="zethri-the-children-of-the-collapse"/>
+    <w:bookmarkEnd w:id="113"/>
+    <w:bookmarkStart w:id="114" w:name="zethri-the-children-of-the-collapse"/>
     <w:p>
       <w:pPr>
         <w:pStyle w:val="Heading3"/>
@@ -14644,7 +15212,7 @@
         <w:pStyle w:val="BodyText"/>
       </w:pPr>
       <w:r>
-        <w:t xml:space="preserve">Zethri are small, agile organisms with six limbs, broad reflective eyes, and fine sensory structures adapted to dim environments.</w:t>
+        <w:t xml:space="preserve">Zethri are small, agile organisms with four limbs, a prehensile tail, broad reflective eyes, and fine sensory structures adapted to dim environments.</w:t>
       </w:r>
     </w:p>
     <w:p>
@@ -14703,10 +15271,10 @@
         <w:t xml:space="preserve">Zethri engineers and planners specialize in building settlements capable of surviving prolonged isolation.</w:t>
       </w:r>
     </w:p>
-    <w:bookmarkEnd w:id="106"/>
-    <w:bookmarkEnd w:id="107"/>
-    <w:bookmarkEnd w:id="108"/>
-    <w:bookmarkStart w:id="112" w:name="X3145843e1df3f61def4f8ab8c5430269a2a5813"/>
+    <w:bookmarkEnd w:id="114"/>
+    <w:bookmarkEnd w:id="115"/>
+    <w:bookmarkEnd w:id="116"/>
+    <w:bookmarkStart w:id="120" w:name="X3145843e1df3f61def4f8ab8c5430269a2a5813"/>
     <w:p>
       <w:pPr>
         <w:pStyle w:val="Heading1"/>
@@ -14723,7 +15291,7 @@
         <w:t xml:space="preserve">The Hegemony deserves particular attention because its decline influences nearly every civilization in Fracture Lines.</w:t>
       </w:r>
     </w:p>
-    <w:bookmarkStart w:id="109" w:name="the-five-eras"/>
+    <w:bookmarkStart w:id="117" w:name="the-five-eras"/>
     <w:p>
       <w:pPr>
         <w:pStyle w:val="Heading2"/>
@@ -14736,7 +15304,7 @@
       <w:pPr>
         <w:numPr>
           <w:ilvl w:val="0"/>
-          <w:numId w:val="1012"/>
+          <w:numId w:val="1014"/>
         </w:numPr>
       </w:pPr>
       <w:r>
@@ -14757,7 +15325,7 @@
       <w:pPr>
         <w:numPr>
           <w:ilvl w:val="0"/>
-          <w:numId w:val="1012"/>
+          <w:numId w:val="1014"/>
         </w:numPr>
       </w:pPr>
       <w:r>
@@ -14778,7 +15346,7 @@
       <w:pPr>
         <w:numPr>
           <w:ilvl w:val="0"/>
-          <w:numId w:val="1012"/>
+          <w:numId w:val="1014"/>
         </w:numPr>
       </w:pPr>
       <w:r>
@@ -14799,7 +15367,7 @@
       <w:pPr>
         <w:numPr>
           <w:ilvl w:val="0"/>
-          <w:numId w:val="1012"/>
+          <w:numId w:val="1014"/>
         </w:numPr>
       </w:pPr>
       <w:r>
@@ -14820,7 +15388,7 @@
       <w:pPr>
         <w:numPr>
           <w:ilvl w:val="0"/>
-          <w:numId w:val="1012"/>
+          <w:numId w:val="1014"/>
         </w:numPr>
       </w:pPr>
       <w:r>
@@ -14901,8 +15469,8 @@
         <w:t xml:space="preserve">And an imperial fleet may emerge to announce that the worlds beyond it still belong to the Emperor.</w:t>
       </w:r>
     </w:p>
-    <w:bookmarkEnd w:id="109"/>
-    <w:bookmarkStart w:id="110" w:name="species-and-political-affiliations"/>
+    <w:bookmarkEnd w:id="117"/>
+    <w:bookmarkStart w:id="118" w:name="species-and-political-affiliations"/>
     <w:p>
       <w:pPr>
         <w:pStyle w:val="Heading2"/>
@@ -15211,8 +15779,8 @@
         </w:tc>
       </w:tr>
     </w:tbl>
-    <w:bookmarkEnd w:id="110"/>
-    <w:bookmarkStart w:id="111" w:name="the-galaxy-as-a-setting-for-adventure"/>
+    <w:bookmarkEnd w:id="118"/>
+    <w:bookmarkStart w:id="119" w:name="the-galaxy-as-a-setting-for-adventure"/>
     <w:p>
       <w:pPr>
         <w:pStyle w:val="Heading2"/>
@@ -15269,9 +15837,9 @@
         <w:t xml:space="preserve">The central conflict of Fracture Lines is not simply the struggle between civilizations. It is the struggle between established power and an interstellar order that refuses to remain static.</w:t>
       </w:r>
     </w:p>
-    <w:bookmarkEnd w:id="111"/>
-    <w:bookmarkEnd w:id="112"/>
-    <w:bookmarkStart w:id="113" w:name="psionics-and-the-mandates"/>
+    <w:bookmarkEnd w:id="119"/>
+    <w:bookmarkEnd w:id="120"/>
+    <w:bookmarkStart w:id="121" w:name="psionics-and-the-mandates"/>
     <w:p>
       <w:pPr>
         <w:pStyle w:val="Heading1"/>
@@ -15358,7 +15926,7 @@
       <w:pPr>
         <w:numPr>
           <w:ilvl w:val="0"/>
-          <w:numId w:val="1013"/>
+          <w:numId w:val="1015"/>
         </w:numPr>
         <w:pStyle w:val="Compact"/>
       </w:pPr>
@@ -15428,7 +15996,7 @@
       <w:pPr>
         <w:numPr>
           <w:ilvl w:val="0"/>
-          <w:numId w:val="1013"/>
+          <w:numId w:val="1015"/>
         </w:numPr>
         <w:pStyle w:val="Compact"/>
       </w:pPr>
@@ -15463,7 +16031,7 @@
       <w:pPr>
         <w:numPr>
           <w:ilvl w:val="0"/>
-          <w:numId w:val="1013"/>
+          <w:numId w:val="1015"/>
         </w:numPr>
         <w:pStyle w:val="Compact"/>
       </w:pPr>
@@ -15501,7 +16069,7 @@
       <w:pPr>
         <w:numPr>
           <w:ilvl w:val="0"/>
-          <w:numId w:val="1013"/>
+          <w:numId w:val="1015"/>
         </w:numPr>
         <w:pStyle w:val="Compact"/>
       </w:pPr>
@@ -15976,8 +16544,8 @@
         </w:tc>
       </w:tr>
     </w:tbl>
-    <w:bookmarkEnd w:id="113"/>
-    <w:bookmarkStart w:id="114" w:name="technology"/>
+    <w:bookmarkEnd w:id="121"/>
+    <w:bookmarkStart w:id="122" w:name="technology"/>
     <w:p>
       <w:pPr>
         <w:pStyle w:val="Heading1"/>
@@ -15990,7 +16558,7 @@
       <w:pPr>
         <w:numPr>
           <w:ilvl w:val="0"/>
-          <w:numId w:val="1014"/>
+          <w:numId w:val="1016"/>
         </w:numPr>
         <w:pStyle w:val="Compact"/>
       </w:pPr>
@@ -16060,7 +16628,7 @@
       <w:pPr>
         <w:numPr>
           <w:ilvl w:val="0"/>
-          <w:numId w:val="1014"/>
+          <w:numId w:val="1016"/>
         </w:numPr>
         <w:pStyle w:val="Compact"/>
       </w:pPr>
@@ -16130,7 +16698,7 @@
       <w:pPr>
         <w:numPr>
           <w:ilvl w:val="0"/>
-          <w:numId w:val="1014"/>
+          <w:numId w:val="1016"/>
         </w:numPr>
         <w:pStyle w:val="Compact"/>
       </w:pPr>
@@ -16152,7 +16720,7 @@
       <w:pPr>
         <w:numPr>
           <w:ilvl w:val="0"/>
-          <w:numId w:val="1014"/>
+          <w:numId w:val="1016"/>
         </w:numPr>
         <w:pStyle w:val="Compact"/>
       </w:pPr>
@@ -16190,7 +16758,7 @@
       <w:pPr>
         <w:numPr>
           <w:ilvl w:val="0"/>
-          <w:numId w:val="1014"/>
+          <w:numId w:val="1016"/>
         </w:numPr>
         <w:pStyle w:val="Compact"/>
       </w:pPr>
@@ -16237,8 +16805,8 @@
         <w:t xml:space="preserve">advantage starts the crew with a ship and a box of Debt. Ship fights and chases run as clocks, with Piloting, Engineering, Sensors and Firearms rolls.</w:t>
       </w:r>
     </w:p>
-    <w:bookmarkEnd w:id="114"/>
-    <w:bookmarkStart w:id="115" w:name="threats"/>
+    <w:bookmarkEnd w:id="122"/>
+    <w:bookmarkStart w:id="123" w:name="threats"/>
     <w:p>
       <w:pPr>
         <w:pStyle w:val="Heading1"/>
@@ -17723,8 +18291,8 @@
         <w:t xml:space="preserve">For a tougher version, add +1 to its targets and one box; for a weaker one, subtract.</w:t>
       </w:r>
     </w:p>
-    <w:bookmarkEnd w:id="115"/>
-    <w:bookmarkStart w:id="123" w:name="ready-made-characters"/>
+    <w:bookmarkEnd w:id="123"/>
+    <w:bookmarkStart w:id="131" w:name="ready-made-characters"/>
     <w:p>
       <w:pPr>
         <w:pStyle w:val="Heading1"/>
@@ -17741,7 +18309,7 @@
         <w:t xml:space="preserve">Characters ready to play, for one-shots, new players, or a group in a hurry. Each follows the creation rules exactly, and their connections tie them together. In the creator, choose one from the ready-made list to open it and make it your own.</w:t>
       </w:r>
     </w:p>
-    <w:bookmarkStart w:id="116" w:name="thessk-varo-hun"/>
+    <w:bookmarkStart w:id="124" w:name="thessk-varo-hun"/>
     <w:p>
       <w:pPr>
         <w:pStyle w:val="Heading2"/>
@@ -17772,7 +18340,7 @@
       <w:pPr>
         <w:numPr>
           <w:ilvl w:val="0"/>
-          <w:numId w:val="1015"/>
+          <w:numId w:val="1017"/>
         </w:numPr>
         <w:pStyle w:val="Compact"/>
       </w:pPr>
@@ -17810,7 +18378,7 @@
       <w:pPr>
         <w:numPr>
           <w:ilvl w:val="0"/>
-          <w:numId w:val="1015"/>
+          <w:numId w:val="1017"/>
         </w:numPr>
         <w:pStyle w:val="Compact"/>
       </w:pPr>
@@ -17832,7 +18400,7 @@
       <w:pPr>
         <w:numPr>
           <w:ilvl w:val="0"/>
-          <w:numId w:val="1015"/>
+          <w:numId w:val="1017"/>
         </w:numPr>
         <w:pStyle w:val="Compact"/>
       </w:pPr>
@@ -17854,7 +18422,7 @@
       <w:pPr>
         <w:numPr>
           <w:ilvl w:val="0"/>
-          <w:numId w:val="1015"/>
+          <w:numId w:val="1017"/>
         </w:numPr>
         <w:pStyle w:val="Compact"/>
       </w:pPr>
@@ -17892,7 +18460,7 @@
       <w:pPr>
         <w:numPr>
           <w:ilvl w:val="0"/>
-          <w:numId w:val="1015"/>
+          <w:numId w:val="1017"/>
         </w:numPr>
         <w:pStyle w:val="Compact"/>
       </w:pPr>
@@ -17926,8 +18494,8 @@
         <w:t xml:space="preserve">She sold Mara Okonkwo the first debt Mara forgave. Neither regrets it.</w:t>
       </w:r>
     </w:p>
-    <w:bookmarkEnd w:id="116"/>
-    <w:bookmarkStart w:id="117" w:name="kesh-of-the-seventh-hive"/>
+    <w:bookmarkEnd w:id="124"/>
+    <w:bookmarkStart w:id="125" w:name="kesh-of-the-seventh-hive"/>
     <w:p>
       <w:pPr>
         <w:pStyle w:val="Heading2"/>
@@ -17958,7 +18526,7 @@
       <w:pPr>
         <w:numPr>
           <w:ilvl w:val="0"/>
-          <w:numId w:val="1016"/>
+          <w:numId w:val="1018"/>
         </w:numPr>
         <w:pStyle w:val="Compact"/>
       </w:pPr>
@@ -17996,7 +18564,7 @@
       <w:pPr>
         <w:numPr>
           <w:ilvl w:val="0"/>
-          <w:numId w:val="1016"/>
+          <w:numId w:val="1018"/>
         </w:numPr>
         <w:pStyle w:val="Compact"/>
       </w:pPr>
@@ -18018,7 +18586,7 @@
       <w:pPr>
         <w:numPr>
           <w:ilvl w:val="0"/>
-          <w:numId w:val="1016"/>
+          <w:numId w:val="1018"/>
         </w:numPr>
         <w:pStyle w:val="Compact"/>
       </w:pPr>
@@ -18040,7 +18608,7 @@
       <w:pPr>
         <w:numPr>
           <w:ilvl w:val="0"/>
-          <w:numId w:val="1016"/>
+          <w:numId w:val="1018"/>
         </w:numPr>
         <w:pStyle w:val="Compact"/>
       </w:pPr>
@@ -18078,7 +18646,7 @@
       <w:pPr>
         <w:numPr>
           <w:ilvl w:val="0"/>
-          <w:numId w:val="1016"/>
+          <w:numId w:val="1018"/>
         </w:numPr>
         <w:pStyle w:val="Compact"/>
       </w:pPr>
@@ -18112,8 +18680,8 @@
         <w:t xml:space="preserve">Ilvi Saradh’s AI found the corridor Kesh’s hive needed; Kesh owes them both.</w:t>
       </w:r>
     </w:p>
-    <w:bookmarkEnd w:id="117"/>
-    <w:bookmarkStart w:id="118" w:name="rook"/>
+    <w:bookmarkEnd w:id="125"/>
+    <w:bookmarkStart w:id="126" w:name="rook"/>
     <w:p>
       <w:pPr>
         <w:pStyle w:val="Heading2"/>
@@ -18144,7 +18712,7 @@
       <w:pPr>
         <w:numPr>
           <w:ilvl w:val="0"/>
-          <w:numId w:val="1017"/>
+          <w:numId w:val="1019"/>
         </w:numPr>
         <w:pStyle w:val="Compact"/>
       </w:pPr>
@@ -18182,7 +18750,7 @@
       <w:pPr>
         <w:numPr>
           <w:ilvl w:val="0"/>
-          <w:numId w:val="1017"/>
+          <w:numId w:val="1019"/>
         </w:numPr>
         <w:pStyle w:val="Compact"/>
       </w:pPr>
@@ -18204,7 +18772,7 @@
       <w:pPr>
         <w:numPr>
           <w:ilvl w:val="0"/>
-          <w:numId w:val="1017"/>
+          <w:numId w:val="1019"/>
         </w:numPr>
         <w:pStyle w:val="Compact"/>
       </w:pPr>
@@ -18226,7 +18794,7 @@
       <w:pPr>
         <w:numPr>
           <w:ilvl w:val="0"/>
-          <w:numId w:val="1017"/>
+          <w:numId w:val="1019"/>
         </w:numPr>
         <w:pStyle w:val="Compact"/>
       </w:pPr>
@@ -18264,7 +18832,7 @@
       <w:pPr>
         <w:numPr>
           <w:ilvl w:val="0"/>
-          <w:numId w:val="1017"/>
+          <w:numId w:val="1019"/>
         </w:numPr>
         <w:pStyle w:val="Compact"/>
       </w:pPr>
@@ -18298,8 +18866,8 @@
         <w:t xml:space="preserve">Brakka was on the other side of that border war. They found out over a drink, and stayed friends.</w:t>
       </w:r>
     </w:p>
-    <w:bookmarkEnd w:id="118"/>
-    <w:bookmarkStart w:id="119" w:name="ilvi-saradh"/>
+    <w:bookmarkEnd w:id="126"/>
+    <w:bookmarkStart w:id="127" w:name="ilvi-saradh"/>
     <w:p>
       <w:pPr>
         <w:pStyle w:val="Heading2"/>
@@ -18330,7 +18898,7 @@
       <w:pPr>
         <w:numPr>
           <w:ilvl w:val="0"/>
-          <w:numId w:val="1018"/>
+          <w:numId w:val="1020"/>
         </w:numPr>
         <w:pStyle w:val="Compact"/>
       </w:pPr>
@@ -18368,7 +18936,7 @@
       <w:pPr>
         <w:numPr>
           <w:ilvl w:val="0"/>
-          <w:numId w:val="1018"/>
+          <w:numId w:val="1020"/>
         </w:numPr>
         <w:pStyle w:val="Compact"/>
       </w:pPr>
@@ -18390,7 +18958,7 @@
       <w:pPr>
         <w:numPr>
           <w:ilvl w:val="0"/>
-          <w:numId w:val="1018"/>
+          <w:numId w:val="1020"/>
         </w:numPr>
         <w:pStyle w:val="Compact"/>
       </w:pPr>
@@ -18412,7 +18980,7 @@
       <w:pPr>
         <w:numPr>
           <w:ilvl w:val="0"/>
-          <w:numId w:val="1018"/>
+          <w:numId w:val="1020"/>
         </w:numPr>
         <w:pStyle w:val="Compact"/>
       </w:pPr>
@@ -18450,7 +19018,7 @@
       <w:pPr>
         <w:numPr>
           <w:ilvl w:val="0"/>
-          <w:numId w:val="1018"/>
+          <w:numId w:val="1020"/>
         </w:numPr>
         <w:pStyle w:val="Compact"/>
       </w:pPr>
@@ -18484,8 +19052,8 @@
         <w:t xml:space="preserve">Quill found the corridor Kesh’s hive needed. Ilvi never told the guild.</w:t>
       </w:r>
     </w:p>
-    <w:bookmarkEnd w:id="119"/>
-    <w:bookmarkStart w:id="120" w:name="dr.-anwe-tal"/>
+    <w:bookmarkEnd w:id="127"/>
+    <w:bookmarkStart w:id="128" w:name="dr.-anwe-tal"/>
     <w:p>
       <w:pPr>
         <w:pStyle w:val="Heading2"/>
@@ -18516,7 +19084,7 @@
       <w:pPr>
         <w:numPr>
           <w:ilvl w:val="0"/>
-          <w:numId w:val="1019"/>
+          <w:numId w:val="1021"/>
         </w:numPr>
         <w:pStyle w:val="Compact"/>
       </w:pPr>
@@ -18554,7 +19122,7 @@
       <w:pPr>
         <w:numPr>
           <w:ilvl w:val="0"/>
-          <w:numId w:val="1019"/>
+          <w:numId w:val="1021"/>
         </w:numPr>
         <w:pStyle w:val="Compact"/>
       </w:pPr>
@@ -18576,7 +19144,7 @@
       <w:pPr>
         <w:numPr>
           <w:ilvl w:val="0"/>
-          <w:numId w:val="1019"/>
+          <w:numId w:val="1021"/>
         </w:numPr>
         <w:pStyle w:val="Compact"/>
       </w:pPr>
@@ -18598,7 +19166,7 @@
       <w:pPr>
         <w:numPr>
           <w:ilvl w:val="0"/>
-          <w:numId w:val="1019"/>
+          <w:numId w:val="1021"/>
         </w:numPr>
         <w:pStyle w:val="Compact"/>
       </w:pPr>
@@ -18636,7 +19204,7 @@
       <w:pPr>
         <w:numPr>
           <w:ilvl w:val="0"/>
-          <w:numId w:val="1019"/>
+          <w:numId w:val="1021"/>
         </w:numPr>
         <w:pStyle w:val="Compact"/>
       </w:pPr>
@@ -18670,8 +19238,8 @@
         <w:t xml:space="preserve">Sable cleaned up the corporation’s files that proved Anwe’s case, and asked nothing for it.</w:t>
       </w:r>
     </w:p>
-    <w:bookmarkEnd w:id="120"/>
-    <w:bookmarkStart w:id="121" w:name="brakka"/>
+    <w:bookmarkEnd w:id="128"/>
+    <w:bookmarkStart w:id="129" w:name="brakka"/>
     <w:p>
       <w:pPr>
         <w:pStyle w:val="Heading2"/>
@@ -18702,7 +19270,7 @@
       <w:pPr>
         <w:numPr>
           <w:ilvl w:val="0"/>
-          <w:numId w:val="1020"/>
+          <w:numId w:val="1022"/>
         </w:numPr>
         <w:pStyle w:val="Compact"/>
       </w:pPr>
@@ -18740,7 +19308,7 @@
       <w:pPr>
         <w:numPr>
           <w:ilvl w:val="0"/>
-          <w:numId w:val="1020"/>
+          <w:numId w:val="1022"/>
         </w:numPr>
         <w:pStyle w:val="Compact"/>
       </w:pPr>
@@ -18762,7 +19330,7 @@
       <w:pPr>
         <w:numPr>
           <w:ilvl w:val="0"/>
-          <w:numId w:val="1020"/>
+          <w:numId w:val="1022"/>
         </w:numPr>
         <w:pStyle w:val="Compact"/>
       </w:pPr>
@@ -18784,7 +19352,7 @@
       <w:pPr>
         <w:numPr>
           <w:ilvl w:val="0"/>
-          <w:numId w:val="1020"/>
+          <w:numId w:val="1022"/>
         </w:numPr>
         <w:pStyle w:val="Compact"/>
       </w:pPr>
@@ -18822,7 +19390,7 @@
       <w:pPr>
         <w:numPr>
           <w:ilvl w:val="0"/>
-          <w:numId w:val="1020"/>
+          <w:numId w:val="1022"/>
         </w:numPr>
         <w:pStyle w:val="Compact"/>
       </w:pPr>
@@ -18856,8 +19424,8 @@
         <w:t xml:space="preserve">Rook fought him across the Zhaq border once. Now Rook watches his back.</w:t>
       </w:r>
     </w:p>
-    <w:bookmarkEnd w:id="121"/>
-    <w:bookmarkStart w:id="122" w:name="sable"/>
+    <w:bookmarkEnd w:id="129"/>
+    <w:bookmarkStart w:id="130" w:name="sable"/>
     <w:p>
       <w:pPr>
         <w:pStyle w:val="Heading2"/>
@@ -18888,7 +19456,7 @@
       <w:pPr>
         <w:numPr>
           <w:ilvl w:val="0"/>
-          <w:numId w:val="1021"/>
+          <w:numId w:val="1023"/>
         </w:numPr>
         <w:pStyle w:val="Compact"/>
       </w:pPr>
@@ -18926,7 +19494,7 @@
       <w:pPr>
         <w:numPr>
           <w:ilvl w:val="0"/>
-          <w:numId w:val="1021"/>
+          <w:numId w:val="1023"/>
         </w:numPr>
         <w:pStyle w:val="Compact"/>
       </w:pPr>
@@ -18948,7 +19516,7 @@
       <w:pPr>
         <w:numPr>
           <w:ilvl w:val="0"/>
-          <w:numId w:val="1021"/>
+          <w:numId w:val="1023"/>
         </w:numPr>
         <w:pStyle w:val="Compact"/>
       </w:pPr>
@@ -18970,7 +19538,7 @@
       <w:pPr>
         <w:numPr>
           <w:ilvl w:val="0"/>
-          <w:numId w:val="1021"/>
+          <w:numId w:val="1023"/>
         </w:numPr>
         <w:pStyle w:val="Compact"/>
       </w:pPr>
@@ -19008,7 +19576,7 @@
       <w:pPr>
         <w:numPr>
           <w:ilvl w:val="0"/>
-          <w:numId w:val="1021"/>
+          <w:numId w:val="1023"/>
         </w:numPr>
         <w:pStyle w:val="Compact"/>
       </w:pPr>
@@ -19042,9 +19610,9 @@
         <w:t xml:space="preserve">Sable cleaned up the files that proved Dr. Anwe Tal’s case, for nothing. Anwe wonders why.</w:t>
       </w:r>
     </w:p>
-    <w:bookmarkEnd w:id="122"/>
-    <w:bookmarkEnd w:id="123"/>
-    <w:bookmarkStart w:id="124" w:name="advantages"/>
+    <w:bookmarkEnd w:id="130"/>
+    <w:bookmarkEnd w:id="131"/>
+    <w:bookmarkStart w:id="132" w:name="advantages"/>
     <w:p>
       <w:pPr>
         <w:pStyle w:val="Heading1"/>
@@ -19943,8 +20511,8 @@
         <w:t xml:space="preserve">belongs to the whole crew once it’s taken.</w:t>
       </w:r>
     </w:p>
-    <w:bookmarkEnd w:id="124"/>
-    <w:bookmarkStart w:id="150" w:name="species"/>
+    <w:bookmarkEnd w:id="132"/>
+    <w:bookmarkStart w:id="158" w:name="species"/>
     <w:p>
       <w:pPr>
         <w:pStyle w:val="Heading1"/>
@@ -21627,7 +22195,7 @@
         </w:tc>
       </w:tr>
     </w:tbl>
-    <w:bookmarkStart w:id="125" w:name="human"/>
+    <w:bookmarkStart w:id="133" w:name="human"/>
     <w:p>
       <w:pPr>
         <w:pStyle w:val="Heading2"/>
@@ -21940,8 +22508,8 @@
         </w:tc>
       </w:tr>
     </w:tbl>
-    <w:bookmarkEnd w:id="125"/>
-    <w:bookmarkStart w:id="126" w:name="vesh"/>
+    <w:bookmarkEnd w:id="133"/>
+    <w:bookmarkStart w:id="134" w:name="vesh"/>
     <w:p>
       <w:pPr>
         <w:pStyle w:val="Heading2"/>
@@ -21967,7 +22535,7 @@
         <w:pStyle w:val="BodyText"/>
       </w:pPr>
       <w:r>
-        <w:t xml:space="preserve">Slender quadrupeds with two manipulator limbs and delicate sensory filaments, who reached the corridors only 24 years ago. Their governments struggle to stay independent while learning from civilizations thousands of years older, and humans recognize the struggle.</w:t>
+        <w:t xml:space="preserve">Slender quadrupeds who handle tools with prehensile sensory tendrils, and who reached the corridors only 24 years ago. Their governments struggle to stay independent while learning from civilizations thousands of years older, and humans recognize the struggle.</w:t>
       </w:r>
     </w:p>
     <w:p>
@@ -22142,7 +22710,7 @@
                 <w:b/>
                 <w:sz w:val="19"/>
               </w:rPr>
-              <w:t xml:space="preserve">Sensory Filaments</w:t>
+              <w:t xml:space="preserve">Sensory Tendrils</w:t>
             </w:r>
           </w:p>
         </w:tc>
@@ -22254,8 +22822,8 @@
         </w:tc>
       </w:tr>
     </w:tbl>
-    <w:bookmarkEnd w:id="126"/>
-    <w:bookmarkStart w:id="127" w:name="brulvek"/>
+    <w:bookmarkEnd w:id="134"/>
+    <w:bookmarkStart w:id="135" w:name="brulvek"/>
     <w:p>
       <w:pPr>
         <w:pStyle w:val="Heading2"/>
@@ -22300,7 +22868,7 @@
       <w:pPr>
         <w:numPr>
           <w:ilvl w:val="0"/>
-          <w:numId w:val="1022"/>
+          <w:numId w:val="1024"/>
         </w:numPr>
         <w:pStyle w:val="Compact"/>
       </w:pPr>
@@ -22592,8 +23160,8 @@
         </w:tc>
       </w:tr>
     </w:tbl>
-    <w:bookmarkEnd w:id="127"/>
-    <w:bookmarkStart w:id="128" w:name="corvani"/>
+    <w:bookmarkEnd w:id="135"/>
+    <w:bookmarkStart w:id="136" w:name="corvani"/>
     <w:p>
       <w:pPr>
         <w:pStyle w:val="Heading2"/>
@@ -22638,7 +23206,7 @@
       <w:pPr>
         <w:numPr>
           <w:ilvl w:val="0"/>
-          <w:numId w:val="1023"/>
+          <w:numId w:val="1025"/>
         </w:numPr>
         <w:pStyle w:val="Compact"/>
       </w:pPr>
@@ -22930,8 +23498,8 @@
         </w:tc>
       </w:tr>
     </w:tbl>
-    <w:bookmarkEnd w:id="128"/>
-    <w:bookmarkStart w:id="129" w:name="draelin"/>
+    <w:bookmarkEnd w:id="136"/>
+    <w:bookmarkStart w:id="137" w:name="draelin"/>
     <w:p>
       <w:pPr>
         <w:pStyle w:val="Heading2"/>
@@ -22957,7 +23525,7 @@
         <w:pStyle w:val="BodyText"/>
       </w:pPr>
       <w:r>
-        <w:t xml:space="preserve">Elongated, six-limbed beings with flexible skeletons and electromagnetic senses, from a world of wild magnetic fields. Their cartographic guilds keep the best corridor charts in known space, and have sold them to both sides of more than one war.</w:t>
+        <w:t xml:space="preserve">Long, serpentine beings with two long arms and no legs, who sense electromagnetic fields, from a world of wild magnetic fields. Their cartographic guilds keep the best corridor charts in known space, and have sold them to both sides of more than one war.</w:t>
       </w:r>
     </w:p>
     <w:p>
@@ -22976,7 +23544,7 @@
       <w:pPr>
         <w:numPr>
           <w:ilvl w:val="0"/>
-          <w:numId w:val="1024"/>
+          <w:numId w:val="1026"/>
         </w:numPr>
         <w:pStyle w:val="Compact"/>
       </w:pPr>
@@ -22988,7 +23556,7 @@
       <w:pPr>
         <w:numPr>
           <w:ilvl w:val="0"/>
-          <w:numId w:val="1024"/>
+          <w:numId w:val="1026"/>
         </w:numPr>
         <w:pStyle w:val="Compact"/>
       </w:pPr>
@@ -23248,22 +23816,22 @@
                 <w:b/>
                 <w:sz w:val="19"/>
               </w:rPr>
-              <w:t xml:space="preserve">Flexible Frame</w:t>
-            </w:r>
-          </w:p>
-        </w:tc>
-        <w:tc>
-          <w:tcPr/>
-          <w:p>
-            <w:pPr>
-              <w:pStyle w:val="Compact"/>
-              <w:jc w:val="left"/>
-            </w:pPr>
-            <w:r>
-              <w:rPr>
-                <w:sz w:val="19"/>
-              </w:rPr>
-              <w:t xml:space="preserve">+2 to Athletics to squeeze through narrow spaces.</w:t>
+              <w:t xml:space="preserve">Serpentine</w:t>
+            </w:r>
+          </w:p>
+        </w:tc>
+        <w:tc>
+          <w:tcPr/>
+          <w:p>
+            <w:pPr>
+              <w:pStyle w:val="Compact"/>
+              <w:jc w:val="left"/>
+            </w:pPr>
+            <w:r>
+              <w:rPr>
+                <w:sz w:val="19"/>
+              </w:rPr>
+              <w:t xml:space="preserve">+2 to Athletics to squeeze, coil and climb where legs can’t.</w:t>
             </w:r>
           </w:p>
         </w:tc>
@@ -23298,8 +23866,8 @@
         </w:tc>
       </w:tr>
     </w:tbl>
-    <w:bookmarkEnd w:id="129"/>
-    <w:bookmarkStart w:id="130" w:name="joruun"/>
+    <w:bookmarkEnd w:id="137"/>
+    <w:bookmarkStart w:id="138" w:name="joruun"/>
     <w:p>
       <w:pPr>
         <w:pStyle w:val="Heading2"/>
@@ -23344,7 +23912,7 @@
       <w:pPr>
         <w:numPr>
           <w:ilvl w:val="0"/>
-          <w:numId w:val="1025"/>
+          <w:numId w:val="1027"/>
         </w:numPr>
         <w:pStyle w:val="Compact"/>
       </w:pPr>
@@ -23636,8 +24204,8 @@
         </w:tc>
       </w:tr>
     </w:tbl>
-    <w:bookmarkEnd w:id="130"/>
-    <w:bookmarkStart w:id="131" w:name="kel-1"/>
+    <w:bookmarkEnd w:id="138"/>
+    <w:bookmarkStart w:id="139" w:name="kel-1"/>
     <w:p>
       <w:pPr>
         <w:pStyle w:val="Heading2"/>
@@ -23682,7 +24250,7 @@
       <w:pPr>
         <w:numPr>
           <w:ilvl w:val="0"/>
-          <w:numId w:val="1026"/>
+          <w:numId w:val="1028"/>
         </w:numPr>
         <w:pStyle w:val="Compact"/>
       </w:pPr>
@@ -23694,7 +24262,7 @@
       <w:pPr>
         <w:numPr>
           <w:ilvl w:val="0"/>
-          <w:numId w:val="1026"/>
+          <w:numId w:val="1028"/>
         </w:numPr>
         <w:pStyle w:val="Compact"/>
       </w:pPr>
@@ -23986,8 +24554,8 @@
         </w:tc>
       </w:tr>
     </w:tbl>
-    <w:bookmarkEnd w:id="131"/>
-    <w:bookmarkStart w:id="132" w:name="mirrun-1"/>
+    <w:bookmarkEnd w:id="139"/>
+    <w:bookmarkStart w:id="140" w:name="mirrun-1"/>
     <w:p>
       <w:pPr>
         <w:pStyle w:val="Heading2"/>
@@ -24032,7 +24600,7 @@
       <w:pPr>
         <w:numPr>
           <w:ilvl w:val="0"/>
-          <w:numId w:val="1027"/>
+          <w:numId w:val="1029"/>
         </w:numPr>
         <w:pStyle w:val="Compact"/>
       </w:pPr>
@@ -24324,8 +24892,8 @@
         </w:tc>
       </w:tr>
     </w:tbl>
-    <w:bookmarkEnd w:id="132"/>
-    <w:bookmarkStart w:id="133" w:name="ommek"/>
+    <w:bookmarkEnd w:id="140"/>
+    <w:bookmarkStart w:id="141" w:name="ommek"/>
     <w:p>
       <w:pPr>
         <w:pStyle w:val="Heading2"/>
@@ -24370,7 +24938,7 @@
       <w:pPr>
         <w:numPr>
           <w:ilvl w:val="0"/>
-          <w:numId w:val="1028"/>
+          <w:numId w:val="1030"/>
         </w:numPr>
         <w:pStyle w:val="Compact"/>
       </w:pPr>
@@ -24680,8 +25248,8 @@
         </w:tc>
       </w:tr>
     </w:tbl>
-    <w:bookmarkEnd w:id="133"/>
-    <w:bookmarkStart w:id="134" w:name="shivar"/>
+    <w:bookmarkEnd w:id="141"/>
+    <w:bookmarkStart w:id="142" w:name="shivar"/>
     <w:p>
       <w:pPr>
         <w:pStyle w:val="Heading2"/>
@@ -24726,7 +25294,7 @@
       <w:pPr>
         <w:numPr>
           <w:ilvl w:val="0"/>
-          <w:numId w:val="1029"/>
+          <w:numId w:val="1031"/>
         </w:numPr>
         <w:pStyle w:val="Compact"/>
       </w:pPr>
@@ -25018,8 +25586,8 @@
         </w:tc>
       </w:tr>
     </w:tbl>
-    <w:bookmarkEnd w:id="134"/>
-    <w:bookmarkStart w:id="135" w:name="tessan-1"/>
+    <w:bookmarkEnd w:id="142"/>
+    <w:bookmarkStart w:id="143" w:name="tessan-1"/>
     <w:p>
       <w:pPr>
         <w:pStyle w:val="Heading2"/>
@@ -25064,7 +25632,7 @@
       <w:pPr>
         <w:numPr>
           <w:ilvl w:val="0"/>
-          <w:numId w:val="1030"/>
+          <w:numId w:val="1032"/>
         </w:numPr>
         <w:pStyle w:val="Compact"/>
       </w:pPr>
@@ -25076,7 +25644,7 @@
       <w:pPr>
         <w:numPr>
           <w:ilvl w:val="0"/>
-          <w:numId w:val="1030"/>
+          <w:numId w:val="1032"/>
         </w:numPr>
         <w:pStyle w:val="Compact"/>
       </w:pPr>
@@ -25368,8 +25936,8 @@
         </w:tc>
       </w:tr>
     </w:tbl>
-    <w:bookmarkEnd w:id="135"/>
-    <w:bookmarkStart w:id="136" w:name="thrum"/>
+    <w:bookmarkEnd w:id="143"/>
+    <w:bookmarkStart w:id="144" w:name="thrum"/>
     <w:p>
       <w:pPr>
         <w:pStyle w:val="Heading2"/>
@@ -25414,7 +25982,7 @@
       <w:pPr>
         <w:numPr>
           <w:ilvl w:val="0"/>
-          <w:numId w:val="1031"/>
+          <w:numId w:val="1033"/>
         </w:numPr>
         <w:pStyle w:val="Compact"/>
       </w:pPr>
@@ -25706,8 +26274,8 @@
         </w:tc>
       </w:tr>
     </w:tbl>
-    <w:bookmarkEnd w:id="136"/>
-    <w:bookmarkStart w:id="137" w:name="uth"/>
+    <w:bookmarkEnd w:id="144"/>
+    <w:bookmarkStart w:id="145" w:name="uth"/>
     <w:p>
       <w:pPr>
         <w:pStyle w:val="Heading2"/>
@@ -25752,7 +26320,7 @@
       <w:pPr>
         <w:numPr>
           <w:ilvl w:val="0"/>
-          <w:numId w:val="1032"/>
+          <w:numId w:val="1034"/>
         </w:numPr>
         <w:pStyle w:val="Compact"/>
       </w:pPr>
@@ -26044,8 +26612,8 @@
         </w:tc>
       </w:tr>
     </w:tbl>
-    <w:bookmarkEnd w:id="137"/>
-    <w:bookmarkStart w:id="138" w:name="uxarra"/>
+    <w:bookmarkEnd w:id="145"/>
+    <w:bookmarkStart w:id="146" w:name="uxarra"/>
     <w:p>
       <w:pPr>
         <w:pStyle w:val="Heading2"/>
@@ -26090,7 +26658,7 @@
       <w:pPr>
         <w:numPr>
           <w:ilvl w:val="0"/>
-          <w:numId w:val="1033"/>
+          <w:numId w:val="1035"/>
         </w:numPr>
         <w:pStyle w:val="Compact"/>
       </w:pPr>
@@ -26382,8 +26950,8 @@
         </w:tc>
       </w:tr>
     </w:tbl>
-    <w:bookmarkEnd w:id="138"/>
-    <w:bookmarkStart w:id="139" w:name="vael"/>
+    <w:bookmarkEnd w:id="146"/>
+    <w:bookmarkStart w:id="147" w:name="vael"/>
     <w:p>
       <w:pPr>
         <w:pStyle w:val="Heading2"/>
@@ -26428,7 +26996,7 @@
       <w:pPr>
         <w:numPr>
           <w:ilvl w:val="0"/>
-          <w:numId w:val="1034"/>
+          <w:numId w:val="1036"/>
         </w:numPr>
         <w:pStyle w:val="Compact"/>
       </w:pPr>
@@ -26440,7 +27008,7 @@
       <w:pPr>
         <w:numPr>
           <w:ilvl w:val="0"/>
-          <w:numId w:val="1034"/>
+          <w:numId w:val="1036"/>
         </w:numPr>
         <w:pStyle w:val="Compact"/>
       </w:pPr>
@@ -26732,8 +27300,8 @@
         </w:tc>
       </w:tr>
     </w:tbl>
-    <w:bookmarkEnd w:id="139"/>
-    <w:bookmarkStart w:id="140" w:name="veyari"/>
+    <w:bookmarkEnd w:id="147"/>
+    <w:bookmarkStart w:id="148" w:name="veyari"/>
     <w:p>
       <w:pPr>
         <w:pStyle w:val="Heading2"/>
@@ -26759,7 +27327,7 @@
         <w:pStyle w:val="BodyText"/>
       </w:pPr>
       <w:r>
-        <w:t xml:space="preserve">Small, six-limbed scholars with soft scales and brains built for associative memory. Their neutral archives hold lost corridor data and ancient claims, which is why empires, corporations and zealots keep trying to seize them.</w:t>
+        <w:t xml:space="preserve">Small bipedal scholars with long, delicate fingers, soft scales and brains built for associative memory. Their neutral archives hold lost corridor data and ancient claims, which is why empires, corporations and zealots keep trying to seize them.</w:t>
       </w:r>
     </w:p>
     <w:p>
@@ -26778,7 +27346,7 @@
       <w:pPr>
         <w:numPr>
           <w:ilvl w:val="0"/>
-          <w:numId w:val="1035"/>
+          <w:numId w:val="1037"/>
         </w:numPr>
         <w:pStyle w:val="Compact"/>
       </w:pPr>
@@ -27070,8 +27638,8 @@
         </w:tc>
       </w:tr>
     </w:tbl>
-    <w:bookmarkEnd w:id="140"/>
-    <w:bookmarkStart w:id="141" w:name="ylith-1"/>
+    <w:bookmarkEnd w:id="148"/>
+    <w:bookmarkStart w:id="149" w:name="ylith-1"/>
     <w:p>
       <w:pPr>
         <w:pStyle w:val="Heading2"/>
@@ -27116,7 +27684,7 @@
       <w:pPr>
         <w:numPr>
           <w:ilvl w:val="0"/>
-          <w:numId w:val="1036"/>
+          <w:numId w:val="1038"/>
         </w:numPr>
         <w:pStyle w:val="Compact"/>
       </w:pPr>
@@ -27128,7 +27696,7 @@
       <w:pPr>
         <w:numPr>
           <w:ilvl w:val="0"/>
-          <w:numId w:val="1036"/>
+          <w:numId w:val="1038"/>
         </w:numPr>
         <w:pStyle w:val="Compact"/>
       </w:pPr>
@@ -27420,8 +27988,8 @@
         </w:tc>
       </w:tr>
     </w:tbl>
-    <w:bookmarkEnd w:id="141"/>
-    <w:bookmarkStart w:id="142" w:name="zethri"/>
+    <w:bookmarkEnd w:id="149"/>
+    <w:bookmarkStart w:id="150" w:name="zethri"/>
     <w:p>
       <w:pPr>
         <w:pStyle w:val="Heading2"/>
@@ -27447,7 +28015,7 @@
         <w:pStyle w:val="BodyText"/>
       </w:pPr>
       <w:r>
-        <w:t xml:space="preserve">Small, agile, six-limbed beings with broad reflective eyes adapted to dim light. A corridor collapse isolated their colonies for centuries; reconnected, they found strangers who share their name, and now work at reunification.</w:t>
+        <w:t xml:space="preserve">Small, agile beings with four limbs, a prehensile tail and broad reflective eyes adapted to dim light. A corridor collapse isolated their colonies for centuries; reconnected, they found strangers who share their name, and now work at reunification.</w:t>
       </w:r>
     </w:p>
     <w:p>
@@ -27466,7 +28034,7 @@
       <w:pPr>
         <w:numPr>
           <w:ilvl w:val="0"/>
-          <w:numId w:val="1037"/>
+          <w:numId w:val="1039"/>
         </w:numPr>
         <w:pStyle w:val="Compact"/>
       </w:pPr>
@@ -27646,6 +28214,68 @@
                 <w:b/>
                 <w:sz w:val="19"/>
               </w:rPr>
+              <w:t xml:space="preserve">Prehensile Tail</w:t>
+            </w:r>
+          </w:p>
+        </w:tc>
+        <w:tc>
+          <w:tcPr/>
+          <w:p>
+            <w:pPr>
+              <w:pStyle w:val="Compact"/>
+              <w:jc w:val="left"/>
+            </w:pPr>
+            <w:r>
+              <w:rPr>
+                <w:sz w:val="19"/>
+              </w:rPr>
+              <w:t xml:space="preserve">+2 to Athletics to climb, hang or hold on in zero-g.</w:t>
+            </w:r>
+          </w:p>
+        </w:tc>
+        <w:tc>
+          <w:tcPr/>
+          <w:p>
+            <w:pPr>
+              <w:pStyle w:val="Compact"/>
+              <w:jc w:val="left"/>
+            </w:pPr>
+            <w:r>
+              <w:rPr>
+                <w:bCs/>
+                <w:b/>
+                <w:sz w:val="19"/>
+              </w:rPr>
+              <w:t xml:space="preserve">Reconnected Strangers.</w:t>
+            </w:r>
+            <w:r>
+              <w:rPr>
+                <w:sz w:val="19"/>
+              </w:rPr>
+              <w:t xml:space="preserve"> </w:t>
+            </w:r>
+            <w:r>
+              <w:rPr>
+                <w:sz w:val="19"/>
+              </w:rPr>
+              <w:t xml:space="preserve">Other Zethri colonies see you as a foreigner. Accept the mistrust.</w:t>
+            </w:r>
+          </w:p>
+        </w:tc>
+      </w:tr>
+      <w:tr>
+        <w:tc>
+          <w:tcPr/>
+          <w:p>
+            <w:pPr>
+              <w:pStyle w:val="Compact"/>
+              <w:jc w:val="left"/>
+            </w:pPr>
+            <w:r>
+              <w:rPr>
+                <w:b/>
+                <w:sz w:val="19"/>
+              </w:rPr>
               <w:t xml:space="preserve">Built to Last</w:t>
             </w:r>
           </w:p>
@@ -27695,71 +28325,9 @@
           </w:p>
         </w:tc>
       </w:tr>
-      <w:tr>
-        <w:tc>
-          <w:tcPr/>
-          <w:p>
-            <w:pPr>
-              <w:pStyle w:val="Compact"/>
-              <w:jc w:val="left"/>
-            </w:pPr>
-            <w:r>
-              <w:rPr>
-                <w:b/>
-                <w:sz w:val="19"/>
-              </w:rPr>
-              <w:t xml:space="preserve">Reunifier</w:t>
-            </w:r>
-          </w:p>
-        </w:tc>
-        <w:tc>
-          <w:tcPr/>
-          <w:p>
-            <w:pPr>
-              <w:pStyle w:val="Compact"/>
-              <w:jc w:val="left"/>
-            </w:pPr>
-            <w:r>
-              <w:rPr>
-                <w:sz w:val="19"/>
-              </w:rPr>
-              <w:t xml:space="preserve">+2 to Diplomacy to bridge strangers who share a history.</w:t>
-            </w:r>
-          </w:p>
-        </w:tc>
-        <w:tc>
-          <w:tcPr/>
-          <w:p>
-            <w:pPr>
-              <w:pStyle w:val="Compact"/>
-              <w:jc w:val="left"/>
-            </w:pPr>
-            <w:r>
-              <w:rPr>
-                <w:bCs/>
-                <w:b/>
-                <w:sz w:val="19"/>
-              </w:rPr>
-              <w:t xml:space="preserve">Distrust of Chokepoints.</w:t>
-            </w:r>
-            <w:r>
-              <w:rPr>
-                <w:sz w:val="19"/>
-              </w:rPr>
-              <w:t xml:space="preserve"> </w:t>
-            </w:r>
-            <w:r>
-              <w:rPr>
-                <w:sz w:val="19"/>
-              </w:rPr>
-              <w:t xml:space="preserve">You won’t rely on one route. Accept the detour.</w:t>
-            </w:r>
-          </w:p>
-        </w:tc>
-      </w:tr>
     </w:tbl>
-    <w:bookmarkEnd w:id="142"/>
-    <w:bookmarkStart w:id="143" w:name="zhaq"/>
+    <w:bookmarkEnd w:id="150"/>
+    <w:bookmarkStart w:id="151" w:name="zhaq"/>
     <w:p>
       <w:pPr>
         <w:pStyle w:val="Heading2"/>
@@ -27804,7 +28372,7 @@
       <w:pPr>
         <w:numPr>
           <w:ilvl w:val="0"/>
-          <w:numId w:val="1038"/>
+          <w:numId w:val="1040"/>
         </w:numPr>
         <w:pStyle w:val="Compact"/>
       </w:pPr>
@@ -27816,7 +28384,7 @@
       <w:pPr>
         <w:numPr>
           <w:ilvl w:val="0"/>
-          <w:numId w:val="1038"/>
+          <w:numId w:val="1040"/>
         </w:numPr>
         <w:pStyle w:val="Compact"/>
       </w:pPr>
@@ -28108,8 +28676,8 @@
         </w:tc>
       </w:tr>
     </w:tbl>
-    <w:bookmarkEnd w:id="143"/>
-    <w:bookmarkStart w:id="144" w:name="dresh"/>
+    <w:bookmarkEnd w:id="151"/>
+    <w:bookmarkStart w:id="152" w:name="dresh"/>
     <w:p>
       <w:pPr>
         <w:pStyle w:val="Heading2"/>
@@ -28154,7 +28722,7 @@
       <w:pPr>
         <w:numPr>
           <w:ilvl w:val="0"/>
-          <w:numId w:val="1039"/>
+          <w:numId w:val="1041"/>
         </w:numPr>
         <w:pStyle w:val="Compact"/>
       </w:pPr>
@@ -28166,7 +28734,7 @@
       <w:pPr>
         <w:numPr>
           <w:ilvl w:val="0"/>
-          <w:numId w:val="1039"/>
+          <w:numId w:val="1041"/>
         </w:numPr>
         <w:pStyle w:val="Compact"/>
       </w:pPr>
@@ -28178,7 +28746,7 @@
       <w:pPr>
         <w:numPr>
           <w:ilvl w:val="0"/>
-          <w:numId w:val="1039"/>
+          <w:numId w:val="1041"/>
         </w:numPr>
         <w:pStyle w:val="Compact"/>
       </w:pPr>
@@ -28470,8 +29038,8 @@
         </w:tc>
       </w:tr>
     </w:tbl>
-    <w:bookmarkEnd w:id="144"/>
-    <w:bookmarkStart w:id="145" w:name="eshuum"/>
+    <w:bookmarkEnd w:id="152"/>
+    <w:bookmarkStart w:id="153" w:name="eshuum"/>
     <w:p>
       <w:pPr>
         <w:pStyle w:val="Heading2"/>
@@ -28516,7 +29084,7 @@
       <w:pPr>
         <w:numPr>
           <w:ilvl w:val="0"/>
-          <w:numId w:val="1040"/>
+          <w:numId w:val="1042"/>
         </w:numPr>
         <w:pStyle w:val="Compact"/>
       </w:pPr>
@@ -28528,7 +29096,7 @@
       <w:pPr>
         <w:numPr>
           <w:ilvl w:val="0"/>
-          <w:numId w:val="1040"/>
+          <w:numId w:val="1042"/>
         </w:numPr>
         <w:pStyle w:val="Compact"/>
       </w:pPr>
@@ -28820,8 +29388,8 @@
         </w:tc>
       </w:tr>
     </w:tbl>
-    <w:bookmarkEnd w:id="145"/>
-    <w:bookmarkStart w:id="146" w:name="khaum"/>
+    <w:bookmarkEnd w:id="153"/>
+    <w:bookmarkStart w:id="154" w:name="khaum"/>
     <w:p>
       <w:pPr>
         <w:pStyle w:val="Heading2"/>
@@ -28866,7 +29434,7 @@
       <w:pPr>
         <w:numPr>
           <w:ilvl w:val="0"/>
-          <w:numId w:val="1041"/>
+          <w:numId w:val="1043"/>
         </w:numPr>
         <w:pStyle w:val="Compact"/>
       </w:pPr>
@@ -28878,7 +29446,7 @@
       <w:pPr>
         <w:numPr>
           <w:ilvl w:val="0"/>
-          <w:numId w:val="1041"/>
+          <w:numId w:val="1043"/>
         </w:numPr>
         <w:pStyle w:val="Compact"/>
       </w:pPr>
@@ -28890,7 +29458,7 @@
       <w:pPr>
         <w:numPr>
           <w:ilvl w:val="0"/>
-          <w:numId w:val="1041"/>
+          <w:numId w:val="1043"/>
         </w:numPr>
         <w:pStyle w:val="Compact"/>
       </w:pPr>
@@ -29182,8 +29750,8 @@
         </w:tc>
       </w:tr>
     </w:tbl>
-    <w:bookmarkEnd w:id="146"/>
-    <w:bookmarkStart w:id="147" w:name="ozhvek"/>
+    <w:bookmarkEnd w:id="154"/>
+    <w:bookmarkStart w:id="155" w:name="ozhvek"/>
     <w:p>
       <w:pPr>
         <w:pStyle w:val="Heading2"/>
@@ -29228,7 +29796,7 @@
       <w:pPr>
         <w:numPr>
           <w:ilvl w:val="0"/>
-          <w:numId w:val="1042"/>
+          <w:numId w:val="1044"/>
         </w:numPr>
         <w:pStyle w:val="Compact"/>
       </w:pPr>
@@ -29240,7 +29808,7 @@
       <w:pPr>
         <w:numPr>
           <w:ilvl w:val="0"/>
-          <w:numId w:val="1042"/>
+          <w:numId w:val="1044"/>
         </w:numPr>
         <w:pStyle w:val="Compact"/>
       </w:pPr>
@@ -29532,8 +30100,8 @@
         </w:tc>
       </w:tr>
     </w:tbl>
-    <w:bookmarkEnd w:id="147"/>
-    <w:bookmarkStart w:id="148" w:name="qor"/>
+    <w:bookmarkEnd w:id="155"/>
+    <w:bookmarkStart w:id="156" w:name="qor"/>
     <w:p>
       <w:pPr>
         <w:pStyle w:val="Heading2"/>
@@ -29578,7 +30146,7 @@
       <w:pPr>
         <w:numPr>
           <w:ilvl w:val="0"/>
-          <w:numId w:val="1043"/>
+          <w:numId w:val="1045"/>
         </w:numPr>
         <w:pStyle w:val="Compact"/>
       </w:pPr>
@@ -29590,7 +30158,7 @@
       <w:pPr>
         <w:numPr>
           <w:ilvl w:val="0"/>
-          <w:numId w:val="1043"/>
+          <w:numId w:val="1045"/>
         </w:numPr>
         <w:pStyle w:val="Compact"/>
       </w:pPr>
@@ -29882,8 +30450,8 @@
         </w:tc>
       </w:tr>
     </w:tbl>
-    <w:bookmarkEnd w:id="148"/>
-    <w:bookmarkStart w:id="149" w:name="sen"/>
+    <w:bookmarkEnd w:id="156"/>
+    <w:bookmarkStart w:id="157" w:name="sen"/>
     <w:p>
       <w:pPr>
         <w:pStyle w:val="Heading2"/>
@@ -29928,7 +30496,7 @@
       <w:pPr>
         <w:numPr>
           <w:ilvl w:val="0"/>
-          <w:numId w:val="1044"/>
+          <w:numId w:val="1046"/>
         </w:numPr>
         <w:pStyle w:val="Compact"/>
       </w:pPr>
@@ -29940,7 +30508,7 @@
       <w:pPr>
         <w:numPr>
           <w:ilvl w:val="0"/>
-          <w:numId w:val="1044"/>
+          <w:numId w:val="1046"/>
         </w:numPr>
         <w:pStyle w:val="Compact"/>
       </w:pPr>
@@ -30232,9 +30800,9 @@
         </w:tc>
       </w:tr>
     </w:tbl>
-    <w:bookmarkEnd w:id="149"/>
-    <w:bookmarkEnd w:id="150"/>
-    <w:bookmarkStart w:id="161" w:name="making-your-own"/>
+    <w:bookmarkEnd w:id="157"/>
+    <w:bookmarkEnd w:id="158"/>
+    <w:bookmarkStart w:id="169" w:name="making-your-own"/>
     <w:p>
       <w:pPr>
         <w:pStyle w:val="Heading1"/>
@@ -30267,7 +30835,7 @@
         <w:t xml:space="preserve">option at the end of each list, and its checklist holds a custom choice to the same rules as everything else.</w:t>
       </w:r>
     </w:p>
-    <w:bookmarkStart w:id="151" w:name="a-custom-calling"/>
+    <w:bookmarkStart w:id="159" w:name="a-custom-calling"/>
     <w:p>
       <w:pPr>
         <w:pStyle w:val="Heading2"/>
@@ -30288,7 +30856,7 @@
       <w:pPr>
         <w:numPr>
           <w:ilvl w:val="0"/>
-          <w:numId w:val="1045"/>
+          <w:numId w:val="1047"/>
         </w:numPr>
         <w:pStyle w:val="Compact"/>
       </w:pPr>
@@ -30334,7 +30902,7 @@
       <w:pPr>
         <w:numPr>
           <w:ilvl w:val="0"/>
-          <w:numId w:val="1045"/>
+          <w:numId w:val="1047"/>
         </w:numPr>
         <w:pStyle w:val="Compact"/>
       </w:pPr>
@@ -30356,7 +30924,7 @@
       <w:pPr>
         <w:numPr>
           <w:ilvl w:val="0"/>
-          <w:numId w:val="1045"/>
+          <w:numId w:val="1047"/>
         </w:numPr>
         <w:pStyle w:val="Compact"/>
       </w:pPr>
@@ -30378,7 +30946,7 @@
       <w:pPr>
         <w:numPr>
           <w:ilvl w:val="0"/>
-          <w:numId w:val="1045"/>
+          <w:numId w:val="1047"/>
         </w:numPr>
         <w:pStyle w:val="Compact"/>
       </w:pPr>
@@ -30443,8 +31011,8 @@
         <w:t xml:space="preserve">.</w:t>
       </w:r>
     </w:p>
-    <w:bookmarkEnd w:id="151"/>
-    <w:bookmarkStart w:id="160" w:name="a-custom-species"/>
+    <w:bookmarkEnd w:id="159"/>
+    <w:bookmarkStart w:id="168" w:name="a-custom-species"/>
     <w:p>
       <w:pPr>
         <w:pStyle w:val="Heading2"/>
@@ -30461,7 +31029,7 @@
         <w:t xml:space="preserve">Build it with the GM, one step at a time.</w:t>
       </w:r>
     </w:p>
-    <w:bookmarkStart w:id="152" w:name="the-concept"/>
+    <w:bookmarkStart w:id="160" w:name="the-concept"/>
     <w:p>
       <w:pPr>
         <w:pStyle w:val="Heading3"/>
@@ -30478,8 +31046,8 @@
         <w:t xml:space="preserve">Two or three sentences: where they come from, what sets them apart, and how others see them. It should be something the species in this book don’t already cover.</w:t>
       </w:r>
     </w:p>
-    <w:bookmarkEnd w:id="152"/>
-    <w:bookmarkStart w:id="153" w:name="the-tier"/>
+    <w:bookmarkEnd w:id="160"/>
+    <w:bookmarkStart w:id="161" w:name="the-tier"/>
     <w:p>
       <w:pPr>
         <w:pStyle w:val="Heading3"/>
@@ -30776,8 +31344,8 @@
         <w:t xml:space="preserve">When in doubt, choose the higher tier.</w:t>
       </w:r>
     </w:p>
-    <w:bookmarkEnd w:id="153"/>
-    <w:bookmarkStart w:id="154" w:name="attribute-adjustments"/>
+    <w:bookmarkEnd w:id="161"/>
+    <w:bookmarkStart w:id="162" w:name="attribute-adjustments"/>
     <w:p>
       <w:pPr>
         <w:pStyle w:val="Heading3"/>
@@ -30823,8 +31391,8 @@
         <w:t xml:space="preserve">: a +2 needs a −2 or two −1s. The adjustments move the attribute’s base (+1 starts it at 11) and raise its starting maximum (13 plus the bonus). Most species change two to four attributes.</w:t>
       </w:r>
     </w:p>
-    <w:bookmarkEnd w:id="154"/>
-    <w:bookmarkStart w:id="155" w:name="core-rules-tier-1-and-up"/>
+    <w:bookmarkEnd w:id="162"/>
+    <w:bookmarkStart w:id="163" w:name="core-rules-tier-1-and-up"/>
     <w:p>
       <w:pPr>
         <w:pStyle w:val="Heading3"/>
@@ -30841,8 +31409,8 @@
         <w:t xml:space="preserve">One to three short rules that always apply: what they can do (see in the dark, resist cold, a free Trained skill) and what it costs (a weakness, a people’s distrust, a hazard they can’t abide). A strength with no drawback is worth more than it looks, so price it a tier higher.</w:t>
       </w:r>
     </w:p>
-    <w:bookmarkEnd w:id="155"/>
-    <w:bookmarkStart w:id="156" w:name="species-advantages"/>
+    <w:bookmarkEnd w:id="163"/>
+    <w:bookmarkStart w:id="164" w:name="species-advantages"/>
     <w:p>
       <w:pPr>
         <w:pStyle w:val="Heading3"/>
@@ -30897,8 +31465,8 @@
         <w:t xml:space="preserve">: a problem the trait causes, with a clear trigger and a real consequence, which earns a Resolve point when it bites, like any complication. A character takes one advantage, general or species, so make them distinct choices.</w:t>
       </w:r>
     </w:p>
-    <w:bookmarkEnd w:id="156"/>
-    <w:bookmarkStart w:id="157" w:name="an-alternate-form-optional-tier-2-or-3"/>
+    <w:bookmarkEnd w:id="164"/>
+    <w:bookmarkStart w:id="165" w:name="an-alternate-form-optional-tier-2-or-3"/>
     <w:p>
       <w:pPr>
         <w:pStyle w:val="Heading3"/>
@@ -30931,8 +31499,8 @@
         <w:t xml:space="preserve">apply.</w:t>
       </w:r>
     </w:p>
-    <w:bookmarkEnd w:id="157"/>
-    <w:bookmarkStart w:id="158" w:name="in-the-creator"/>
+    <w:bookmarkEnd w:id="165"/>
+    <w:bookmarkStart w:id="166" w:name="in-the-creator"/>
     <w:p>
       <w:pPr>
         <w:pStyle w:val="Heading3"/>
@@ -30945,7 +31513,7 @@
       <w:pPr>
         <w:numPr>
           <w:ilvl w:val="0"/>
-          <w:numId w:val="1046"/>
+          <w:numId w:val="1048"/>
         </w:numPr>
         <w:pStyle w:val="Compact"/>
       </w:pPr>
@@ -30973,7 +31541,7 @@
       <w:pPr>
         <w:numPr>
           <w:ilvl w:val="0"/>
-          <w:numId w:val="1046"/>
+          <w:numId w:val="1048"/>
         </w:numPr>
         <w:pStyle w:val="Compact"/>
       </w:pPr>
@@ -30985,7 +31553,7 @@
       <w:pPr>
         <w:numPr>
           <w:ilvl w:val="0"/>
-          <w:numId w:val="1046"/>
+          <w:numId w:val="1048"/>
         </w:numPr>
         <w:pStyle w:val="Compact"/>
       </w:pPr>
@@ -31013,7 +31581,7 @@
       <w:pPr>
         <w:numPr>
           <w:ilvl w:val="0"/>
-          <w:numId w:val="1046"/>
+          <w:numId w:val="1048"/>
         </w:numPr>
         <w:pStyle w:val="Compact"/>
       </w:pPr>
@@ -31037,8 +31605,8 @@
         <w:t xml:space="preserve">and enter the advantage and its companion complication.</w:t>
       </w:r>
     </w:p>
-    <w:bookmarkEnd w:id="158"/>
-    <w:bookmarkStart w:id="159" w:name="example"/>
+    <w:bookmarkEnd w:id="166"/>
+    <w:bookmarkStart w:id="167" w:name="example"/>
     <w:p>
       <w:pPr>
         <w:pStyle w:val="Heading3"/>
@@ -31143,10 +31711,10 @@
         <w:t xml:space="preserve">: your family’s dynasty calls on you; accept the errand.</w:t>
       </w:r>
     </w:p>
-    <w:bookmarkEnd w:id="159"/>
-    <w:bookmarkEnd w:id="160"/>
-    <w:bookmarkEnd w:id="161"/>
-    <w:bookmarkStart w:id="162" w:name="complications"/>
+    <w:bookmarkEnd w:id="167"/>
+    <w:bookmarkEnd w:id="168"/>
+    <w:bookmarkEnd w:id="169"/>
+    <w:bookmarkStart w:id="170" w:name="complications"/>
     <w:p>
       <w:pPr>
         <w:pStyle w:val="Heading1"/>
@@ -31851,8 +32419,8 @@
         </w:tc>
       </w:tr>
     </w:tbl>
-    <w:bookmarkEnd w:id="162"/>
-    <w:bookmarkStart w:id="163" w:name="quick-reference"/>
+    <w:bookmarkEnd w:id="170"/>
+    <w:bookmarkStart w:id="171" w:name="quick-reference"/>
     <w:p>
       <w:pPr>
         <w:pStyle w:val="Heading1"/>
@@ -32023,8 +32591,8 @@
         <w:t xml:space="preserve">start each session with two. Reroll, reduce an injury by one box, or establish a small preparation. Earn one from an accepted complication.</w:t>
       </w:r>
     </w:p>
-    <w:bookmarkEnd w:id="163"/>
-    <w:bookmarkStart w:id="166" w:name="discord-commands"/>
+    <w:bookmarkEnd w:id="171"/>
+    <w:bookmarkStart w:id="174" w:name="discord-commands"/>
     <w:p>
       <w:pPr>
         <w:pStyle w:val="Heading1"/>
@@ -32056,7 +32624,7 @@
         <w:t xml:space="preserve">in a channel to see the commands; Discord shows each option as you fill it in. The bot doesn’t know your sheet, so you give it the target number.</w:t>
       </w:r>
     </w:p>
-    <w:bookmarkStart w:id="164" w:name="for-players"/>
+    <w:bookmarkStart w:id="172" w:name="for-players"/>
     <w:p>
       <w:pPr>
         <w:pStyle w:val="Heading2"/>
@@ -32476,8 +33044,8 @@
         <w:t xml:space="preserve">Only the player who rolled can press the reroll button. Rolls that miss by 1 or 2 remind the GM that success at a cost is on offer.</w:t>
       </w:r>
     </w:p>
-    <w:bookmarkEnd w:id="164"/>
-    <w:bookmarkStart w:id="165" w:name="for-the-gm"/>
+    <w:bookmarkEnd w:id="172"/>
+    <w:bookmarkStart w:id="173" w:name="for-the-gm"/>
     <w:p>
       <w:pPr>
         <w:pStyle w:val="Heading2"/>
@@ -33117,8 +33685,8 @@
         <w:t xml:space="preserve">Legend Dynamics RPG system. The core rules and this setting are original works.</w:t>
       </w:r>
     </w:p>
-    <w:bookmarkEnd w:id="165"/>
-    <w:bookmarkEnd w:id="166"/>
+    <w:bookmarkEnd w:id="173"/>
+    <w:bookmarkEnd w:id="174"/>
     <w:sectPr/>
   </w:body>
 </w:document>
@@ -33504,6 +34072,12 @@
     </w:lvlOverride>
   </w:num>
   <w:num w:numId="1012">
+    <w:abstractNumId w:val="991"/>
+  </w:num>
+  <w:num w:numId="1013">
+    <w:abstractNumId w:val="991"/>
+  </w:num>
+  <w:num w:numId="1014">
     <w:abstractNumId w:val="99411"/>
     <w:lvlOverride w:ilvl="0">
       <w:startOverride w:val="1"/>
@@ -33532,12 +34106,6 @@
     <w:lvlOverride w:ilvl="8">
       <w:startOverride w:val="1"/>
     </w:lvlOverride>
-  </w:num>
-  <w:num w:numId="1013">
-    <w:abstractNumId w:val="991"/>
-  </w:num>
-  <w:num w:numId="1014">
-    <w:abstractNumId w:val="991"/>
   </w:num>
   <w:num w:numId="1015">
     <w:abstractNumId w:val="991"/>
@@ -33630,6 +34198,12 @@
     <w:abstractNumId w:val="991"/>
   </w:num>
   <w:num w:numId="1045">
+    <w:abstractNumId w:val="991"/>
+  </w:num>
+  <w:num w:numId="1046">
+    <w:abstractNumId w:val="991"/>
+  </w:num>
+  <w:num w:numId="1047">
     <w:abstractNumId w:val="99411"/>
     <w:lvlOverride w:ilvl="0">
       <w:startOverride w:val="1"/>
@@ -33659,7 +34233,7 @@
       <w:startOverride w:val="1"/>
     </w:lvlOverride>
   </w:num>
-  <w:num w:numId="1046">
+  <w:num w:numId="1048">
     <w:abstractNumId w:val="99411"/>
     <w:lvlOverride w:ilvl="0">
       <w:startOverride w:val="1"/>

</xml_diff>

<commit_message>
Fracture Lines: the metric drive for travel off the corridors
A warp-style drive capped at three times light speed: hours within a
system, years between the stars, and unusable inside corridors, near
mouths or deep in gravity wells. Adds travel times and a quick-reference
line.

Co-Authored-By: Claude Opus 5.5 <noreply@anthropic.com>
Claude-Session: https://claude.ai/code/session_015SADCFzhKijkC2foUmXrpC
</commit_message>
<xml_diff>
--- a/legend-dynamics/spaceopera/Fracture_Lines_Players_Guide.docx
+++ b/legend-dynamics/spaceopera/Fracture_Lines_Players_Guide.docx
@@ -12984,7 +12984,7 @@
     </w:p>
     <w:bookmarkEnd w:id="75"/>
     <w:bookmarkEnd w:id="76"/>
-    <w:bookmarkStart w:id="86" w:name="the-corridors"/>
+    <w:bookmarkStart w:id="87" w:name="the-corridors"/>
     <w:p>
       <w:pPr>
         <w:pStyle w:val="Heading1"/>
@@ -13057,7 +13057,23 @@
         <w:t xml:space="preserve">mouth</w:t>
       </w:r>
       <w:r>
-        <w:t xml:space="preserve">, and protects the ship against its stresses while the fold carries the ship across light-years in hours or days. Outside the corridors, ships are bound to sublight speeds: crossing a system takes days, and crossing between stars without a corridor takes generations, which is how the Vael fleets began.</w:t>
+        <w:t xml:space="preserve">, and protects the ship against its stresses while the fold carries the ship across light-years in hours or days. Off the corridors, ships rely on the much slower</w:t>
+      </w:r>
+      <w:r>
+        <w:t xml:space="preserve"> </w:t>
+      </w:r>
+      <w:r>
+        <w:rPr>
+          <w:bCs/>
+          <w:b/>
+        </w:rPr>
+        <w:t xml:space="preserve">metric drive</w:t>
+      </w:r>
+      <w:r>
+        <w:t xml:space="preserve"> </w:t>
+      </w:r>
+      <w:r>
+        <w:t xml:space="preserve">(below): fast within a star system, but years between the stars.</w:t>
       </w:r>
     </w:p>
     <w:p>
@@ -13069,7 +13085,125 @@
       </w:r>
     </w:p>
     <w:bookmarkEnd w:id="77"/>
-    <w:bookmarkStart w:id="78" w:name="depth"/>
+    <w:bookmarkStart w:id="78" w:name="off-the-corridors-the-metric-drive"/>
+    <w:p>
+      <w:pPr>
+        <w:pStyle w:val="Heading2"/>
+      </w:pPr>
+      <w:r>
+        <w:t xml:space="preserve">Off the corridors: the metric drive</w:t>
+      </w:r>
+    </w:p>
+    <w:p>
+      <w:pPr>
+        <w:pStyle w:val="FirstParagraph"/>
+      </w:pPr>
+      <w:r>
+        <w:t xml:space="preserve">Between corridors, and between the stars where no corridor runs, ships use the</w:t>
+      </w:r>
+      <w:r>
+        <w:t xml:space="preserve"> </w:t>
+      </w:r>
+      <w:r>
+        <w:rPr>
+          <w:bCs/>
+          <w:b/>
+        </w:rPr>
+        <w:t xml:space="preserve">metric drive</w:t>
+      </w:r>
+      <w:r>
+        <w:t xml:space="preserve">: a warp-style drive that bends the spacetime around the ship instead of pushing it through space. Its hard limit is</w:t>
+      </w:r>
+      <w:r>
+        <w:t xml:space="preserve"> </w:t>
+      </w:r>
+      <w:r>
+        <w:rPr>
+          <w:bCs/>
+          <w:b/>
+        </w:rPr>
+        <w:t xml:space="preserve">three times the speed of light</w:t>
+      </w:r>
+      <w:r>
+        <w:t xml:space="preserve">. Most civilian drives manage one to two; only military ships and fast couriers reach three.</w:t>
+      </w:r>
+    </w:p>
+    <w:p>
+      <w:pPr>
+        <w:numPr>
+          <w:ilvl w:val="0"/>
+          <w:numId w:val="1012"/>
+        </w:numPr>
+        <w:pStyle w:val="Compact"/>
+      </w:pPr>
+      <w:r>
+        <w:rPr>
+          <w:bCs/>
+          <w:b/>
+        </w:rPr>
+        <w:t xml:space="preserve">Within a star system, it is fast.</w:t>
+      </w:r>
+      <w:r>
+        <w:t xml:space="preserve"> </w:t>
+      </w:r>
+      <w:r>
+        <w:t xml:space="preserve">Crossing a system, or reaching a corridor mouth far out from the star, takes hours rather than days.</w:t>
+      </w:r>
+    </w:p>
+    <w:p>
+      <w:pPr>
+        <w:numPr>
+          <w:ilvl w:val="0"/>
+          <w:numId w:val="1012"/>
+        </w:numPr>
+        <w:pStyle w:val="Compact"/>
+      </w:pPr>
+      <w:r>
+        <w:rPr>
+          <w:bCs/>
+          <w:b/>
+        </w:rPr>
+        <w:t xml:space="preserve">Between the stars, it is slow.</w:t>
+      </w:r>
+      <w:r>
+        <w:t xml:space="preserve"> </w:t>
+      </w:r>
+      <w:r>
+        <w:t xml:space="preserve">Even at full speed, a crossing takes about a year for every three light-years: the nearest neighboring star is well over a year away. The metric drive is how ships reach worlds off the network or behind a collapsed corridor, how expeditions go out and cut-off colonies are reached, and how stranded imperial fleets limp home over decades.</w:t>
+      </w:r>
+    </w:p>
+    <w:p>
+      <w:pPr>
+        <w:numPr>
+          <w:ilvl w:val="0"/>
+          <w:numId w:val="1012"/>
+        </w:numPr>
+        <w:pStyle w:val="Compact"/>
+      </w:pPr>
+      <w:r>
+        <w:rPr>
+          <w:bCs/>
+          <w:b/>
+        </w:rPr>
+        <w:t xml:space="preserve">It won’t run everywhere.</w:t>
+      </w:r>
+      <w:r>
+        <w:t xml:space="preserve"> </w:t>
+      </w:r>
+      <w:r>
+        <w:t xml:space="preserve">A metric field collapses inside a corridor, near a corridor mouth, and deep in a planet’s gravity well. Ships drop to sublight to approach a mouth or a world, which is why checkpoints can be enforced and why chases near planets are won by pilots, not drives.</w:t>
+      </w:r>
+    </w:p>
+    <w:p>
+      <w:pPr>
+        <w:pStyle w:val="FirstParagraph"/>
+      </w:pPr>
+      <w:r>
+        <w:t xml:space="preserve">The Vael know the drive’s limits better than anyone: their homeworld’s catastrophe struck hundreds of light-years from the nearest corridor, and even at three times light speed their escape took generations.</w:t>
+      </w:r>
+    </w:p>
+    <w:bookmarkEnd w:id="78"/>
+    <w:bookmarkStart w:id="79" w:name="depth"/>
     <w:p>
       <w:pPr>
         <w:pStyle w:val="Heading2"/>
@@ -13112,8 +13246,8 @@
         <w:t xml:space="preserve">, where two points hundreds or thousands of light-years apart in ordinary space may be very close indeed.</w:t>
       </w:r>
     </w:p>
-    <w:bookmarkEnd w:id="78"/>
-    <w:bookmarkStart w:id="79" w:name="drift-collapse-and-junctions"/>
+    <w:bookmarkEnd w:id="79"/>
+    <w:bookmarkStart w:id="80" w:name="drift-collapse-and-junctions"/>
     <w:p>
       <w:pPr>
         <w:pStyle w:val="Heading2"/>
@@ -13151,8 +13285,8 @@
         <w:t xml:space="preserve">, power gathers: every ship and every message between those regions must pass through.</w:t>
       </w:r>
     </w:p>
-    <w:bookmarkEnd w:id="79"/>
-    <w:bookmarkStart w:id="84" w:name="deep-metric-communication"/>
+    <w:bookmarkEnd w:id="80"/>
+    <w:bookmarkStart w:id="85" w:name="deep-metric-communication"/>
     <w:p>
       <w:pPr>
         <w:pStyle w:val="Heading2"/>
@@ -13169,7 +13303,7 @@
         <w:t xml:space="preserve">The civilizations of known space do not rely on conventional radio for interstellar communication. Instead, advanced societies exploit a phenomenon associated with the same hidden geometry that makes corridor travel possible.</w:t>
       </w:r>
     </w:p>
-    <w:bookmarkStart w:id="80" w:name="quantum-gravimetric-communication"/>
+    <w:bookmarkStart w:id="81" w:name="quantum-gravimetric-communication"/>
     <w:p>
       <w:pPr>
         <w:pStyle w:val="Heading3"/>
@@ -13215,8 +13349,8 @@
         <w:t xml:space="preserve">Consequently, quantum-gravimetric communication does not depend upon instantaneous communication through entanglement. The signal physically travels between transmitter and receiver, but through a region of spacetime in which the effective distance between the two points is enormously reduced. To observers limited to normal space, the result can appear to be faster-than-light communication.</w:t>
       </w:r>
     </w:p>
-    <w:bookmarkEnd w:id="80"/>
-    <w:bookmarkStart w:id="81" w:name="why-humanity-didnt-discover-it"/>
+    <w:bookmarkEnd w:id="81"/>
+    <w:bookmarkStart w:id="82" w:name="why-humanity-didnt-discover-it"/>
     <w:p>
       <w:pPr>
         <w:pStyle w:val="Heading3"/>
@@ -13259,8 +13393,8 @@
         <w:t xml:space="preserve">Humanity didn’t know the communications medium existed.</w:t>
       </w:r>
     </w:p>
-    <w:bookmarkEnd w:id="81"/>
-    <w:bookmarkStart w:id="82" w:name="the-antenna"/>
+    <w:bookmarkEnd w:id="82"/>
+    <w:bookmarkStart w:id="83" w:name="the-antenna"/>
     <w:p>
       <w:pPr>
         <w:pStyle w:val="Heading3"/>
@@ -13309,8 +13443,8 @@
         <w:t xml:space="preserve">Humanity had spent centuries listening for voices among the stars. The galaxy had never been silent. Humanity had simply been listening to the wrong part of the universe.</w:t>
       </w:r>
     </w:p>
-    <w:bookmarkEnd w:id="82"/>
-    <w:bookmarkStart w:id="83" w:name="the-network-is-the-map"/>
+    <w:bookmarkEnd w:id="83"/>
+    <w:bookmarkStart w:id="84" w:name="the-network-is-the-map"/>
     <w:p>
       <w:pPr>
         <w:pStyle w:val="Heading3"/>
@@ -13331,7 +13465,7 @@
       <w:pPr>
         <w:numPr>
           <w:ilvl w:val="0"/>
-          <w:numId w:val="1012"/>
+          <w:numId w:val="1013"/>
         </w:numPr>
         <w:pStyle w:val="Compact"/>
       </w:pPr>
@@ -13353,7 +13487,7 @@
       <w:pPr>
         <w:numPr>
           <w:ilvl w:val="0"/>
-          <w:numId w:val="1012"/>
+          <w:numId w:val="1013"/>
         </w:numPr>
         <w:pStyle w:val="Compact"/>
       </w:pPr>
@@ -13375,7 +13509,7 @@
       <w:pPr>
         <w:numPr>
           <w:ilvl w:val="0"/>
-          <w:numId w:val="1012"/>
+          <w:numId w:val="1013"/>
         </w:numPr>
         <w:pStyle w:val="Compact"/>
       </w:pPr>
@@ -13401,9 +13535,9 @@
         <w:t xml:space="preserve">Control of corridor intersections is one of the fundamental sources of political and economic power in known space. For civilizations such as the Tessan, power does not require conquest: control over contracts, debt, corridor access and communications can bind entire worlds without a Tessan soldier ever setting foot on them.</w:t>
       </w:r>
     </w:p>
-    <w:bookmarkEnd w:id="83"/>
     <w:bookmarkEnd w:id="84"/>
-    <w:bookmarkStart w:id="85" w:name="corridors-in-play"/>
+    <w:bookmarkEnd w:id="85"/>
+    <w:bookmarkStart w:id="86" w:name="corridors-in-play"/>
     <w:p>
       <w:pPr>
         <w:pStyle w:val="Heading2"/>
@@ -13416,7 +13550,7 @@
       <w:pPr>
         <w:numPr>
           <w:ilvl w:val="0"/>
-          <w:numId w:val="1013"/>
+          <w:numId w:val="1014"/>
         </w:numPr>
         <w:pStyle w:val="Compact"/>
       </w:pPr>
@@ -13451,7 +13585,7 @@
       <w:pPr>
         <w:numPr>
           <w:ilvl w:val="0"/>
-          <w:numId w:val="1013"/>
+          <w:numId w:val="1014"/>
         </w:numPr>
         <w:pStyle w:val="Compact"/>
       </w:pPr>
@@ -13473,7 +13607,7 @@
       <w:pPr>
         <w:numPr>
           <w:ilvl w:val="0"/>
-          <w:numId w:val="1013"/>
+          <w:numId w:val="1014"/>
         </w:numPr>
         <w:pStyle w:val="Compact"/>
       </w:pPr>
@@ -13488,14 +13622,36 @@
         <w:t xml:space="preserve"> </w:t>
       </w:r>
       <w:r>
-        <w:t xml:space="preserve">Between neighboring systems: hours. Across a region: one to three days. A long haul through several junctions: one to two weeks.</w:t>
+        <w:t xml:space="preserve">By corridor: between neighboring systems, hours; across a region, one to three days; a long haul through several junctions, one to two weeks. By metric drive: within a system, hours; between stars, light-years ÷ 3 in years at best (÷ 2 or ÷ 1 for slower civilian drives).</w:t>
       </w:r>
     </w:p>
     <w:p>
       <w:pPr>
         <w:numPr>
           <w:ilvl w:val="0"/>
-          <w:numId w:val="1013"/>
+          <w:numId w:val="1014"/>
+        </w:numPr>
+        <w:pStyle w:val="Compact"/>
+      </w:pPr>
+      <w:r>
+        <w:rPr>
+          <w:bCs/>
+          <w:b/>
+        </w:rPr>
+        <w:t xml:space="preserve">Metric drive.</w:t>
+      </w:r>
+      <w:r>
+        <w:t xml:space="preserve"> </w:t>
+      </w:r>
+      <w:r>
+        <w:t xml:space="preserve">Engaging or dropping out takes a few minutes; it can’t run inside a corridor, near a mouth or deep in a gravity well. Near planets and mouths, chases are Piloting at sublight.</w:t>
+      </w:r>
+    </w:p>
+    <w:p>
+      <w:pPr>
+        <w:numPr>
+          <w:ilvl w:val="0"/>
+          <w:numId w:val="1014"/>
         </w:numPr>
         <w:pStyle w:val="Compact"/>
       </w:pPr>
@@ -13517,7 +13673,7 @@
       <w:pPr>
         <w:numPr>
           <w:ilvl w:val="0"/>
-          <w:numId w:val="1013"/>
+          <w:numId w:val="1014"/>
         </w:numPr>
         <w:pStyle w:val="Compact"/>
       </w:pPr>
@@ -13568,7 +13724,7 @@
       <w:pPr>
         <w:numPr>
           <w:ilvl w:val="0"/>
-          <w:numId w:val="1013"/>
+          <w:numId w:val="1014"/>
         </w:numPr>
         <w:pStyle w:val="Compact"/>
       </w:pPr>
@@ -13599,9 +13755,9 @@
         <w:t xml:space="preserve">) and Mandate screenings.</w:t>
       </w:r>
     </w:p>
-    <w:bookmarkEnd w:id="85"/>
     <w:bookmarkEnd w:id="86"/>
-    <w:bookmarkStart w:id="116" w:name="peoples-of-the-corridors"/>
+    <w:bookmarkEnd w:id="87"/>
+    <w:bookmarkStart w:id="117" w:name="peoples-of-the-corridors"/>
     <w:p>
       <w:pPr>
         <w:pStyle w:val="Heading1"/>
@@ -13647,7 +13803,7 @@
         <w:t xml:space="preserve">chapter.</w:t>
       </w:r>
     </w:p>
-    <w:bookmarkStart w:id="87" w:name="the-political-landscape"/>
+    <w:bookmarkStart w:id="88" w:name="the-political-landscape"/>
     <w:p>
       <w:pPr>
         <w:pStyle w:val="Heading2"/>
@@ -13704,8 +13860,8 @@
         <w:t xml:space="preserve">No power controls the entire corridor network, and no species has a monopoly on intelligence, technological innovation, or ambition.</w:t>
       </w:r>
     </w:p>
-    <w:bookmarkEnd w:id="87"/>
-    <w:bookmarkStart w:id="93" w:name="the-established-and-emerging-powers"/>
+    <w:bookmarkEnd w:id="88"/>
+    <w:bookmarkStart w:id="94" w:name="the-established-and-emerging-powers"/>
     <w:p>
       <w:pPr>
         <w:pStyle w:val="Heading2"/>
@@ -13714,7 +13870,7 @@
         <w:t xml:space="preserve">The established and emerging powers</w:t>
       </w:r>
     </w:p>
-    <w:bookmarkStart w:id="88" w:name="humans"/>
+    <w:bookmarkStart w:id="89" w:name="humans"/>
     <w:p>
       <w:pPr>
         <w:pStyle w:val="Heading3"/>
@@ -13755,8 +13911,8 @@
         <w:t xml:space="preserve">Humanity’s economic innovations have begun influencing Tessan institutions, while its explorers and entrepreneurs push into regions older civilizations consider unprofitable or dangerous.</w:t>
       </w:r>
     </w:p>
-    <w:bookmarkEnd w:id="88"/>
-    <w:bookmarkStart w:id="89" w:name="tessan"/>
+    <w:bookmarkEnd w:id="89"/>
+    <w:bookmarkStart w:id="90" w:name="tessan"/>
     <w:p>
       <w:pPr>
         <w:pStyle w:val="Heading3"/>
@@ -13797,8 +13953,8 @@
         <w:t xml:space="preserve">Contact with humanity has introduced new economic thinking into Tessan society, creating a growing division between traditional creditors and reformers who question the profitability of perpetual debt.</w:t>
       </w:r>
     </w:p>
-    <w:bookmarkEnd w:id="89"/>
-    <w:bookmarkStart w:id="90" w:name="kel"/>
+    <w:bookmarkEnd w:id="90"/>
+    <w:bookmarkStart w:id="91" w:name="kel"/>
     <w:p>
       <w:pPr>
         <w:pStyle w:val="Heading3"/>
@@ -13839,8 +13995,8 @@
         <w:t xml:space="preserve">Today, Kel society is divided between contractual loyalists, reformers seeking negotiated emancipation, and radicals who believe their world’s debts can only be ended through force.</w:t>
       </w:r>
     </w:p>
-    <w:bookmarkEnd w:id="90"/>
-    <w:bookmarkStart w:id="91" w:name="mirrun"/>
+    <w:bookmarkEnd w:id="91"/>
+    <w:bookmarkStart w:id="92" w:name="mirrun"/>
     <w:p>
       <w:pPr>
         <w:pStyle w:val="Heading3"/>
@@ -13881,8 +14037,8 @@
         <w:t xml:space="preserve">Mirrun researchers are among the leading specialists in gravimetric resonance detection. Their biological sensitivity inspired several important improvements in corridor instrumentation. Their principal strategic concern is the protection of ocean worlds from extractive industries.</w:t>
       </w:r>
     </w:p>
-    <w:bookmarkEnd w:id="91"/>
-    <w:bookmarkStart w:id="92" w:name="ylith"/>
+    <w:bookmarkEnd w:id="92"/>
+    <w:bookmarkStart w:id="93" w:name="ylith"/>
     <w:p>
       <w:pPr>
         <w:pStyle w:val="Heading3"/>
@@ -13923,9 +14079,9 @@
         <w:t xml:space="preserve">Their independent city-states are renowned for navigation, long-range observation, and exploratory cartography. Ylith navigators have discovered corridors that conventional instruments initially failed to identify.</w:t>
       </w:r>
     </w:p>
-    <w:bookmarkEnd w:id="92"/>
     <w:bookmarkEnd w:id="93"/>
-    <w:bookmarkStart w:id="99" w:name="Xff4a93679c910774e2f02ac587efedb0ceda74a"/>
+    <w:bookmarkEnd w:id="94"/>
+    <w:bookmarkStart w:id="100" w:name="Xff4a93679c910774e2f02ac587efedb0ceda74a"/>
     <w:p>
       <w:pPr>
         <w:pStyle w:val="Heading2"/>
@@ -13958,7 +14114,7 @@
         <w:t xml:space="preserve">Both its internal factions and external enemies have exploited the shifting gravimetric corridors. An imperial province isolated for centuries can become an independent civilization. When its corridor reopens, the Hegemony may return to reclaim it.</w:t>
       </w:r>
     </w:p>
-    <w:bookmarkStart w:id="94" w:name="ozhvek-the-imperial-founders"/>
+    <w:bookmarkStart w:id="95" w:name="ozhvek-the-imperial-founders"/>
     <w:p>
       <w:pPr>
         <w:pStyle w:val="Heading3"/>
@@ -14007,8 +14163,8 @@
         <w:t xml:space="preserve">The greatest threat to Ozhvek dominance is not necessarily another species. It is the inability of their ruling houses to agree on what the Hegemony should become.</w:t>
       </w:r>
     </w:p>
-    <w:bookmarkEnd w:id="94"/>
-    <w:bookmarkStart w:id="95" w:name="dresh-the-imperial-soldiers"/>
+    <w:bookmarkEnd w:id="95"/>
+    <w:bookmarkStart w:id="96" w:name="dresh-the-imperial-soldiers"/>
     <w:p>
       <w:pPr>
         <w:pStyle w:val="Heading3"/>
@@ -14057,8 +14213,8 @@
         <w:t xml:space="preserve">Dresh military society prizes competence and mutual obligation. Their greatest political dispute concerns whether soldiers owe allegiance to the imperial throne, their commanders, or the populations they protect.</w:t>
       </w:r>
     </w:p>
-    <w:bookmarkEnd w:id="95"/>
-    <w:bookmarkStart w:id="96" w:name="shivar-the-keepers-of-orthodoxy"/>
+    <w:bookmarkEnd w:id="96"/>
+    <w:bookmarkStart w:id="97" w:name="shivar-the-keepers-of-orthodoxy"/>
     <w:p>
       <w:pPr>
         <w:pStyle w:val="Heading3"/>
@@ -14115,8 +14271,8 @@
         <w:t xml:space="preserve">The resulting religious schism has fueled uprisings, political assassinations, and wars within the Hegemony.</w:t>
       </w:r>
     </w:p>
-    <w:bookmarkEnd w:id="96"/>
-    <w:bookmarkStart w:id="97" w:name="brulvek-the-industrial-survivors"/>
+    <w:bookmarkEnd w:id="97"/>
+    <w:bookmarkStart w:id="98" w:name="brulvek-the-industrial-survivors"/>
     <w:p>
       <w:pPr>
         <w:pStyle w:val="Heading3"/>
@@ -14173,8 +14329,8 @@
         <w:t xml:space="preserve">Brulvek engineers are highly sought after throughout known space, particularly for their ability to restore machinery that has operated for centuries without replacement parts.</w:t>
       </w:r>
     </w:p>
-    <w:bookmarkEnd w:id="97"/>
-    <w:bookmarkStart w:id="98" w:name="zhaq-the-lost-province"/>
+    <w:bookmarkEnd w:id="98"/>
+    <w:bookmarkStart w:id="99" w:name="zhaq-the-lost-province"/>
     <w:p>
       <w:pPr>
         <w:pStyle w:val="Heading3"/>
@@ -14247,9 +14403,9 @@
         <w:t xml:space="preserve">Their continuing resistance has become a symbol for separatist movements throughout imperial space.</w:t>
       </w:r>
     </w:p>
-    <w:bookmarkEnd w:id="98"/>
     <w:bookmarkEnd w:id="99"/>
-    <w:bookmarkStart w:id="115" w:name="X7cf45656e26c6332fca34295f43177ee2dc74b7"/>
+    <w:bookmarkEnd w:id="100"/>
+    <w:bookmarkStart w:id="116" w:name="X7cf45656e26c6332fca34295f43177ee2dc74b7"/>
     <w:p>
       <w:pPr>
         <w:pStyle w:val="Heading2"/>
@@ -14258,7 +14414,7 @@
         <w:t xml:space="preserve">Independent civilizations and regional powers</w:t>
       </w:r>
     </w:p>
-    <w:bookmarkStart w:id="100" w:name="veyari-the-memory-keepers"/>
+    <w:bookmarkStart w:id="101" w:name="veyari-the-memory-keepers"/>
     <w:p>
       <w:pPr>
         <w:pStyle w:val="Heading3"/>
@@ -14315,8 +14471,8 @@
         <w:t xml:space="preserve">Their greatest strength is knowledge. Their greatest vulnerability is the assumption that knowledge should be preserved even when powerful civilizations would prefer it forgotten.</w:t>
       </w:r>
     </w:p>
-    <w:bookmarkEnd w:id="100"/>
-    <w:bookmarkStart w:id="101" w:name="eshuum-the-distributed-minds"/>
+    <w:bookmarkEnd w:id="101"/>
+    <w:bookmarkStart w:id="102" w:name="eshuum-the-distributed-minds"/>
     <w:p>
       <w:pPr>
         <w:pStyle w:val="Heading3"/>
@@ -14373,8 +14529,8 @@
         <w:t xml:space="preserve">Their political institutions strongly oppose forced separation, biological experimentation without consent, and the ownership of intelligent organisms. These positions have brought them into direct conflict with several Hegemony research authorities.</w:t>
       </w:r>
     </w:p>
-    <w:bookmarkEnd w:id="101"/>
-    <w:bookmarkStart w:id="102" w:name="khaum-the-deep-dwellers"/>
+    <w:bookmarkEnd w:id="102"/>
+    <w:bookmarkStart w:id="103" w:name="khaum-the-deep-dwellers"/>
     <w:p>
       <w:pPr>
         <w:pStyle w:val="Heading3"/>
@@ -14439,8 +14595,8 @@
         <w:t xml:space="preserve">Their underground refuges have sheltered refugees from multiple Hegemony campaigns.</w:t>
       </w:r>
     </w:p>
-    <w:bookmarkEnd w:id="102"/>
-    <w:bookmarkStart w:id="103" w:name="vael-the-living-fleets"/>
+    <w:bookmarkEnd w:id="103"/>
+    <w:bookmarkStart w:id="104" w:name="vael-the-living-fleets"/>
     <w:p>
       <w:pPr>
         <w:pStyle w:val="Heading3"/>
@@ -14497,8 +14653,8 @@
         <w:t xml:space="preserve">Vael flotillas have repeatedly been caught between Hegemony forces and separatist territories. Their determination to remain politically independent has made them both valuable intermediaries and frequent targets of suspicion.</w:t>
       </w:r>
     </w:p>
-    <w:bookmarkEnd w:id="103"/>
-    <w:bookmarkStart w:id="104" w:name="thrum-the-resonant-people"/>
+    <w:bookmarkEnd w:id="104"/>
+    <w:bookmarkStart w:id="105" w:name="thrum-the-resonant-people"/>
     <w:p>
       <w:pPr>
         <w:pStyle w:val="Heading3"/>
@@ -14563,8 +14719,8 @@
         <w:t xml:space="preserve">Their technology is widely respected, although their reluctance to permit military applications has strained relations with several governments.</w:t>
       </w:r>
     </w:p>
-    <w:bookmarkEnd w:id="104"/>
-    <w:bookmarkStart w:id="105" w:name="corvani-the-ecological-architects"/>
+    <w:bookmarkEnd w:id="105"/>
+    <w:bookmarkStart w:id="106" w:name="corvani-the-ecological-architects"/>
     <w:p>
       <w:pPr>
         <w:pStyle w:val="Heading3"/>
@@ -14621,8 +14777,8 @@
         <w:t xml:space="preserve">Corvani restoration teams operate on worlds devastated by Hegemony industrial extraction, although their insistence on ecological safeguards frequently brings them into conflict with mining corporations and colonial governments.</w:t>
       </w:r>
     </w:p>
-    <w:bookmarkEnd w:id="105"/>
-    <w:bookmarkStart w:id="106" w:name="uxarra-the-shifting-ones"/>
+    <w:bookmarkEnd w:id="106"/>
+    <w:bookmarkStart w:id="107" w:name="uxarra-the-shifting-ones"/>
     <w:p>
       <w:pPr>
         <w:pStyle w:val="Heading3"/>
@@ -14679,8 +14835,8 @@
         <w:t xml:space="preserve">Uxarra explorers and rescue specialists are highly valued for operations in unstable environments, particularly worlds affected by corridor disruptions or natural disasters.</w:t>
       </w:r>
     </w:p>
-    <w:bookmarkEnd w:id="106"/>
-    <w:bookmarkStart w:id="107" w:name="sen-the-patient-observers"/>
+    <w:bookmarkEnd w:id="107"/>
+    <w:bookmarkStart w:id="108" w:name="sen-the-patient-observers"/>
     <w:p>
       <w:pPr>
         <w:pStyle w:val="Heading3"/>
@@ -14745,8 +14901,8 @@
         <w:t xml:space="preserve">Their governments rarely intervene in external affairs, but their warnings concerning corridor instability carry considerable weight among navigators and scientists.</w:t>
       </w:r>
     </w:p>
-    <w:bookmarkEnd w:id="107"/>
-    <w:bookmarkStart w:id="108" w:name="joruun-the-borderland-confederates"/>
+    <w:bookmarkEnd w:id="108"/>
+    <w:bookmarkStart w:id="109" w:name="joruun-the-borderland-confederates"/>
     <w:p>
       <w:pPr>
         <w:pStyle w:val="Heading3"/>
@@ -14811,8 +14967,8 @@
         <w:t xml:space="preserve">Their greatest political challenge is maintaining unity during periods when the imperial threat appears to recede.</w:t>
       </w:r>
     </w:p>
-    <w:bookmarkEnd w:id="108"/>
-    <w:bookmarkStart w:id="109" w:name="qor-the-silicon-minds"/>
+    <w:bookmarkEnd w:id="109"/>
+    <w:bookmarkStart w:id="110" w:name="qor-the-silicon-minds"/>
     <w:p>
       <w:pPr>
         <w:pStyle w:val="Heading3"/>
@@ -14885,8 +15041,8 @@
         <w:t xml:space="preserve">Their relationship with the Tessan is complex: Tessan capital has helped expand Qor industry, but Qor political leaders refuse to permit debt arrangements that threaten planetary sovereignty.</w:t>
       </w:r>
     </w:p>
-    <w:bookmarkEnd w:id="109"/>
-    <w:bookmarkStart w:id="110" w:name="ommek-the-makers-of-machines"/>
+    <w:bookmarkEnd w:id="110"/>
+    <w:bookmarkStart w:id="111" w:name="ommek-the-makers-of-machines"/>
     <w:p>
       <w:pPr>
         <w:pStyle w:val="Heading3"/>
@@ -14959,8 +15115,8 @@
         <w:t xml:space="preserve">Ommek defensive systems have made direct conquest prohibitively expensive.</w:t>
       </w:r>
     </w:p>
-    <w:bookmarkEnd w:id="110"/>
-    <w:bookmarkStart w:id="111" w:name="vesh-the-newcomers"/>
+    <w:bookmarkEnd w:id="111"/>
+    <w:bookmarkStart w:id="112" w:name="vesh-the-newcomers"/>
     <w:p>
       <w:pPr>
         <w:pStyle w:val="Heading3"/>
@@ -15033,8 +15189,8 @@
         <w:t xml:space="preserve">Human diplomats have developed a particularly strong interest in Vesh affairs, recognizing many of the difficulties humanity experienced during its own early expansion.</w:t>
       </w:r>
     </w:p>
-    <w:bookmarkEnd w:id="111"/>
-    <w:bookmarkStart w:id="112" w:name="uth-the-refugees-of-empire"/>
+    <w:bookmarkEnd w:id="112"/>
+    <w:bookmarkStart w:id="113" w:name="uth-the-refugees-of-empire"/>
     <w:p>
       <w:pPr>
         <w:pStyle w:val="Heading3"/>
@@ -15107,8 +15263,8 @@
         <w:t xml:space="preserve">Uth activists are prominent in anti-Hegemony movements, although many Uth reject the idea that their people should be defined exclusively by historical suffering.</w:t>
       </w:r>
     </w:p>
-    <w:bookmarkEnd w:id="112"/>
-    <w:bookmarkStart w:id="113" w:name="draelin-the-corridor-cartographers"/>
+    <w:bookmarkEnd w:id="113"/>
+    <w:bookmarkStart w:id="114" w:name="draelin-the-corridor-cartographers"/>
     <w:p>
       <w:pPr>
         <w:pStyle w:val="Heading3"/>
@@ -15189,8 +15345,8 @@
         <w:t xml:space="preserve">Their internal politics are shaped by a central question: whether knowledge of safe passage should be treated as a public good or a commercial asset.</w:t>
       </w:r>
     </w:p>
-    <w:bookmarkEnd w:id="113"/>
-    <w:bookmarkStart w:id="114" w:name="zethri-the-children-of-the-collapse"/>
+    <w:bookmarkEnd w:id="114"/>
+    <w:bookmarkStart w:id="115" w:name="zethri-the-children-of-the-collapse"/>
     <w:p>
       <w:pPr>
         <w:pStyle w:val="Heading3"/>
@@ -15271,10 +15427,10 @@
         <w:t xml:space="preserve">Zethri engineers and planners specialize in building settlements capable of surviving prolonged isolation.</w:t>
       </w:r>
     </w:p>
-    <w:bookmarkEnd w:id="114"/>
     <w:bookmarkEnd w:id="115"/>
     <w:bookmarkEnd w:id="116"/>
-    <w:bookmarkStart w:id="120" w:name="X3145843e1df3f61def4f8ab8c5430269a2a5813"/>
+    <w:bookmarkEnd w:id="117"/>
+    <w:bookmarkStart w:id="121" w:name="X3145843e1df3f61def4f8ab8c5430269a2a5813"/>
     <w:p>
       <w:pPr>
         <w:pStyle w:val="Heading1"/>
@@ -15291,7 +15447,7 @@
         <w:t xml:space="preserve">The Hegemony deserves particular attention because its decline influences nearly every civilization in Fracture Lines.</w:t>
       </w:r>
     </w:p>
-    <w:bookmarkStart w:id="117" w:name="the-five-eras"/>
+    <w:bookmarkStart w:id="118" w:name="the-five-eras"/>
     <w:p>
       <w:pPr>
         <w:pStyle w:val="Heading2"/>
@@ -15304,7 +15460,7 @@
       <w:pPr>
         <w:numPr>
           <w:ilvl w:val="0"/>
-          <w:numId w:val="1014"/>
+          <w:numId w:val="1015"/>
         </w:numPr>
       </w:pPr>
       <w:r>
@@ -15325,7 +15481,7 @@
       <w:pPr>
         <w:numPr>
           <w:ilvl w:val="0"/>
-          <w:numId w:val="1014"/>
+          <w:numId w:val="1015"/>
         </w:numPr>
       </w:pPr>
       <w:r>
@@ -15346,7 +15502,7 @@
       <w:pPr>
         <w:numPr>
           <w:ilvl w:val="0"/>
-          <w:numId w:val="1014"/>
+          <w:numId w:val="1015"/>
         </w:numPr>
       </w:pPr>
       <w:r>
@@ -15367,7 +15523,7 @@
       <w:pPr>
         <w:numPr>
           <w:ilvl w:val="0"/>
-          <w:numId w:val="1014"/>
+          <w:numId w:val="1015"/>
         </w:numPr>
       </w:pPr>
       <w:r>
@@ -15388,7 +15544,7 @@
       <w:pPr>
         <w:numPr>
           <w:ilvl w:val="0"/>
-          <w:numId w:val="1014"/>
+          <w:numId w:val="1015"/>
         </w:numPr>
       </w:pPr>
       <w:r>
@@ -15469,8 +15625,8 @@
         <w:t xml:space="preserve">And an imperial fleet may emerge to announce that the worlds beyond it still belong to the Emperor.</w:t>
       </w:r>
     </w:p>
-    <w:bookmarkEnd w:id="117"/>
-    <w:bookmarkStart w:id="118" w:name="species-and-political-affiliations"/>
+    <w:bookmarkEnd w:id="118"/>
+    <w:bookmarkStart w:id="119" w:name="species-and-political-affiliations"/>
     <w:p>
       <w:pPr>
         <w:pStyle w:val="Heading2"/>
@@ -15779,8 +15935,8 @@
         </w:tc>
       </w:tr>
     </w:tbl>
-    <w:bookmarkEnd w:id="118"/>
-    <w:bookmarkStart w:id="119" w:name="the-galaxy-as-a-setting-for-adventure"/>
+    <w:bookmarkEnd w:id="119"/>
+    <w:bookmarkStart w:id="120" w:name="the-galaxy-as-a-setting-for-adventure"/>
     <w:p>
       <w:pPr>
         <w:pStyle w:val="Heading2"/>
@@ -15837,9 +15993,9 @@
         <w:t xml:space="preserve">The central conflict of Fracture Lines is not simply the struggle between civilizations. It is the struggle between established power and an interstellar order that refuses to remain static.</w:t>
       </w:r>
     </w:p>
-    <w:bookmarkEnd w:id="119"/>
     <w:bookmarkEnd w:id="120"/>
-    <w:bookmarkStart w:id="121" w:name="psionics-and-the-mandates"/>
+    <w:bookmarkEnd w:id="121"/>
+    <w:bookmarkStart w:id="122" w:name="psionics-and-the-mandates"/>
     <w:p>
       <w:pPr>
         <w:pStyle w:val="Heading1"/>
@@ -15926,7 +16082,7 @@
       <w:pPr>
         <w:numPr>
           <w:ilvl w:val="0"/>
-          <w:numId w:val="1015"/>
+          <w:numId w:val="1016"/>
         </w:numPr>
         <w:pStyle w:val="Compact"/>
       </w:pPr>
@@ -15996,7 +16152,7 @@
       <w:pPr>
         <w:numPr>
           <w:ilvl w:val="0"/>
-          <w:numId w:val="1015"/>
+          <w:numId w:val="1016"/>
         </w:numPr>
         <w:pStyle w:val="Compact"/>
       </w:pPr>
@@ -16031,7 +16187,7 @@
       <w:pPr>
         <w:numPr>
           <w:ilvl w:val="0"/>
-          <w:numId w:val="1015"/>
+          <w:numId w:val="1016"/>
         </w:numPr>
         <w:pStyle w:val="Compact"/>
       </w:pPr>
@@ -16069,7 +16225,7 @@
       <w:pPr>
         <w:numPr>
           <w:ilvl w:val="0"/>
-          <w:numId w:val="1015"/>
+          <w:numId w:val="1016"/>
         </w:numPr>
         <w:pStyle w:val="Compact"/>
       </w:pPr>
@@ -16544,8 +16700,8 @@
         </w:tc>
       </w:tr>
     </w:tbl>
-    <w:bookmarkEnd w:id="121"/>
-    <w:bookmarkStart w:id="122" w:name="technology"/>
+    <w:bookmarkEnd w:id="122"/>
+    <w:bookmarkStart w:id="123" w:name="technology"/>
     <w:p>
       <w:pPr>
         <w:pStyle w:val="Heading1"/>
@@ -16558,7 +16714,7 @@
       <w:pPr>
         <w:numPr>
           <w:ilvl w:val="0"/>
-          <w:numId w:val="1016"/>
+          <w:numId w:val="1017"/>
         </w:numPr>
         <w:pStyle w:val="Compact"/>
       </w:pPr>
@@ -16628,7 +16784,7 @@
       <w:pPr>
         <w:numPr>
           <w:ilvl w:val="0"/>
-          <w:numId w:val="1016"/>
+          <w:numId w:val="1017"/>
         </w:numPr>
         <w:pStyle w:val="Compact"/>
       </w:pPr>
@@ -16698,7 +16854,7 @@
       <w:pPr>
         <w:numPr>
           <w:ilvl w:val="0"/>
-          <w:numId w:val="1016"/>
+          <w:numId w:val="1017"/>
         </w:numPr>
         <w:pStyle w:val="Compact"/>
       </w:pPr>
@@ -16720,7 +16876,7 @@
       <w:pPr>
         <w:numPr>
           <w:ilvl w:val="0"/>
-          <w:numId w:val="1016"/>
+          <w:numId w:val="1017"/>
         </w:numPr>
         <w:pStyle w:val="Compact"/>
       </w:pPr>
@@ -16758,7 +16914,7 @@
       <w:pPr>
         <w:numPr>
           <w:ilvl w:val="0"/>
-          <w:numId w:val="1016"/>
+          <w:numId w:val="1017"/>
         </w:numPr>
         <w:pStyle w:val="Compact"/>
       </w:pPr>
@@ -16805,8 +16961,8 @@
         <w:t xml:space="preserve">advantage starts the crew with a ship and a box of Debt. Ship fights and chases run as clocks, with Piloting, Engineering, Sensors and Firearms rolls.</w:t>
       </w:r>
     </w:p>
-    <w:bookmarkEnd w:id="122"/>
-    <w:bookmarkStart w:id="123" w:name="threats"/>
+    <w:bookmarkEnd w:id="123"/>
+    <w:bookmarkStart w:id="124" w:name="threats"/>
     <w:p>
       <w:pPr>
         <w:pStyle w:val="Heading1"/>
@@ -18291,8 +18447,8 @@
         <w:t xml:space="preserve">For a tougher version, add +1 to its targets and one box; for a weaker one, subtract.</w:t>
       </w:r>
     </w:p>
-    <w:bookmarkEnd w:id="123"/>
-    <w:bookmarkStart w:id="131" w:name="ready-made-characters"/>
+    <w:bookmarkEnd w:id="124"/>
+    <w:bookmarkStart w:id="132" w:name="ready-made-characters"/>
     <w:p>
       <w:pPr>
         <w:pStyle w:val="Heading1"/>
@@ -18309,7 +18465,7 @@
         <w:t xml:space="preserve">Characters ready to play, for one-shots, new players, or a group in a hurry. Each follows the creation rules exactly, and their connections tie them together. In the creator, choose one from the ready-made list to open it and make it your own.</w:t>
       </w:r>
     </w:p>
-    <w:bookmarkStart w:id="124" w:name="thessk-varo-hun"/>
+    <w:bookmarkStart w:id="125" w:name="thessk-varo-hun"/>
     <w:p>
       <w:pPr>
         <w:pStyle w:val="Heading2"/>
@@ -18340,7 +18496,7 @@
       <w:pPr>
         <w:numPr>
           <w:ilvl w:val="0"/>
-          <w:numId w:val="1017"/>
+          <w:numId w:val="1018"/>
         </w:numPr>
         <w:pStyle w:val="Compact"/>
       </w:pPr>
@@ -18378,7 +18534,7 @@
       <w:pPr>
         <w:numPr>
           <w:ilvl w:val="0"/>
-          <w:numId w:val="1017"/>
+          <w:numId w:val="1018"/>
         </w:numPr>
         <w:pStyle w:val="Compact"/>
       </w:pPr>
@@ -18400,7 +18556,7 @@
       <w:pPr>
         <w:numPr>
           <w:ilvl w:val="0"/>
-          <w:numId w:val="1017"/>
+          <w:numId w:val="1018"/>
         </w:numPr>
         <w:pStyle w:val="Compact"/>
       </w:pPr>
@@ -18422,7 +18578,7 @@
       <w:pPr>
         <w:numPr>
           <w:ilvl w:val="0"/>
-          <w:numId w:val="1017"/>
+          <w:numId w:val="1018"/>
         </w:numPr>
         <w:pStyle w:val="Compact"/>
       </w:pPr>
@@ -18460,7 +18616,7 @@
       <w:pPr>
         <w:numPr>
           <w:ilvl w:val="0"/>
-          <w:numId w:val="1017"/>
+          <w:numId w:val="1018"/>
         </w:numPr>
         <w:pStyle w:val="Compact"/>
       </w:pPr>
@@ -18494,8 +18650,8 @@
         <w:t xml:space="preserve">She sold Mara Okonkwo the first debt Mara forgave. Neither regrets it.</w:t>
       </w:r>
     </w:p>
-    <w:bookmarkEnd w:id="124"/>
-    <w:bookmarkStart w:id="125" w:name="kesh-of-the-seventh-hive"/>
+    <w:bookmarkEnd w:id="125"/>
+    <w:bookmarkStart w:id="126" w:name="kesh-of-the-seventh-hive"/>
     <w:p>
       <w:pPr>
         <w:pStyle w:val="Heading2"/>
@@ -18526,7 +18682,7 @@
       <w:pPr>
         <w:numPr>
           <w:ilvl w:val="0"/>
-          <w:numId w:val="1018"/>
+          <w:numId w:val="1019"/>
         </w:numPr>
         <w:pStyle w:val="Compact"/>
       </w:pPr>
@@ -18564,7 +18720,7 @@
       <w:pPr>
         <w:numPr>
           <w:ilvl w:val="0"/>
-          <w:numId w:val="1018"/>
+          <w:numId w:val="1019"/>
         </w:numPr>
         <w:pStyle w:val="Compact"/>
       </w:pPr>
@@ -18586,7 +18742,7 @@
       <w:pPr>
         <w:numPr>
           <w:ilvl w:val="0"/>
-          <w:numId w:val="1018"/>
+          <w:numId w:val="1019"/>
         </w:numPr>
         <w:pStyle w:val="Compact"/>
       </w:pPr>
@@ -18608,7 +18764,7 @@
       <w:pPr>
         <w:numPr>
           <w:ilvl w:val="0"/>
-          <w:numId w:val="1018"/>
+          <w:numId w:val="1019"/>
         </w:numPr>
         <w:pStyle w:val="Compact"/>
       </w:pPr>
@@ -18646,7 +18802,7 @@
       <w:pPr>
         <w:numPr>
           <w:ilvl w:val="0"/>
-          <w:numId w:val="1018"/>
+          <w:numId w:val="1019"/>
         </w:numPr>
         <w:pStyle w:val="Compact"/>
       </w:pPr>
@@ -18680,8 +18836,8 @@
         <w:t xml:space="preserve">Ilvi Saradh’s AI found the corridor Kesh’s hive needed; Kesh owes them both.</w:t>
       </w:r>
     </w:p>
-    <w:bookmarkEnd w:id="125"/>
-    <w:bookmarkStart w:id="126" w:name="rook"/>
+    <w:bookmarkEnd w:id="126"/>
+    <w:bookmarkStart w:id="127" w:name="rook"/>
     <w:p>
       <w:pPr>
         <w:pStyle w:val="Heading2"/>
@@ -18712,7 +18868,7 @@
       <w:pPr>
         <w:numPr>
           <w:ilvl w:val="0"/>
-          <w:numId w:val="1019"/>
+          <w:numId w:val="1020"/>
         </w:numPr>
         <w:pStyle w:val="Compact"/>
       </w:pPr>
@@ -18750,7 +18906,7 @@
       <w:pPr>
         <w:numPr>
           <w:ilvl w:val="0"/>
-          <w:numId w:val="1019"/>
+          <w:numId w:val="1020"/>
         </w:numPr>
         <w:pStyle w:val="Compact"/>
       </w:pPr>
@@ -18772,7 +18928,7 @@
       <w:pPr>
         <w:numPr>
           <w:ilvl w:val="0"/>
-          <w:numId w:val="1019"/>
+          <w:numId w:val="1020"/>
         </w:numPr>
         <w:pStyle w:val="Compact"/>
       </w:pPr>
@@ -18794,7 +18950,7 @@
       <w:pPr>
         <w:numPr>
           <w:ilvl w:val="0"/>
-          <w:numId w:val="1019"/>
+          <w:numId w:val="1020"/>
         </w:numPr>
         <w:pStyle w:val="Compact"/>
       </w:pPr>
@@ -18832,7 +18988,7 @@
       <w:pPr>
         <w:numPr>
           <w:ilvl w:val="0"/>
-          <w:numId w:val="1019"/>
+          <w:numId w:val="1020"/>
         </w:numPr>
         <w:pStyle w:val="Compact"/>
       </w:pPr>
@@ -18866,8 +19022,8 @@
         <w:t xml:space="preserve">Brakka was on the other side of that border war. They found out over a drink, and stayed friends.</w:t>
       </w:r>
     </w:p>
-    <w:bookmarkEnd w:id="126"/>
-    <w:bookmarkStart w:id="127" w:name="ilvi-saradh"/>
+    <w:bookmarkEnd w:id="127"/>
+    <w:bookmarkStart w:id="128" w:name="ilvi-saradh"/>
     <w:p>
       <w:pPr>
         <w:pStyle w:val="Heading2"/>
@@ -18898,7 +19054,7 @@
       <w:pPr>
         <w:numPr>
           <w:ilvl w:val="0"/>
-          <w:numId w:val="1020"/>
+          <w:numId w:val="1021"/>
         </w:numPr>
         <w:pStyle w:val="Compact"/>
       </w:pPr>
@@ -18936,7 +19092,7 @@
       <w:pPr>
         <w:numPr>
           <w:ilvl w:val="0"/>
-          <w:numId w:val="1020"/>
+          <w:numId w:val="1021"/>
         </w:numPr>
         <w:pStyle w:val="Compact"/>
       </w:pPr>
@@ -18958,7 +19114,7 @@
       <w:pPr>
         <w:numPr>
           <w:ilvl w:val="0"/>
-          <w:numId w:val="1020"/>
+          <w:numId w:val="1021"/>
         </w:numPr>
         <w:pStyle w:val="Compact"/>
       </w:pPr>
@@ -18980,7 +19136,7 @@
       <w:pPr>
         <w:numPr>
           <w:ilvl w:val="0"/>
-          <w:numId w:val="1020"/>
+          <w:numId w:val="1021"/>
         </w:numPr>
         <w:pStyle w:val="Compact"/>
       </w:pPr>
@@ -19018,7 +19174,7 @@
       <w:pPr>
         <w:numPr>
           <w:ilvl w:val="0"/>
-          <w:numId w:val="1020"/>
+          <w:numId w:val="1021"/>
         </w:numPr>
         <w:pStyle w:val="Compact"/>
       </w:pPr>
@@ -19052,8 +19208,8 @@
         <w:t xml:space="preserve">Quill found the corridor Kesh’s hive needed. Ilvi never told the guild.</w:t>
       </w:r>
     </w:p>
-    <w:bookmarkEnd w:id="127"/>
-    <w:bookmarkStart w:id="128" w:name="dr.-anwe-tal"/>
+    <w:bookmarkEnd w:id="128"/>
+    <w:bookmarkStart w:id="129" w:name="dr.-anwe-tal"/>
     <w:p>
       <w:pPr>
         <w:pStyle w:val="Heading2"/>
@@ -19084,7 +19240,7 @@
       <w:pPr>
         <w:numPr>
           <w:ilvl w:val="0"/>
-          <w:numId w:val="1021"/>
+          <w:numId w:val="1022"/>
         </w:numPr>
         <w:pStyle w:val="Compact"/>
       </w:pPr>
@@ -19122,7 +19278,7 @@
       <w:pPr>
         <w:numPr>
           <w:ilvl w:val="0"/>
-          <w:numId w:val="1021"/>
+          <w:numId w:val="1022"/>
         </w:numPr>
         <w:pStyle w:val="Compact"/>
       </w:pPr>
@@ -19144,7 +19300,7 @@
       <w:pPr>
         <w:numPr>
           <w:ilvl w:val="0"/>
-          <w:numId w:val="1021"/>
+          <w:numId w:val="1022"/>
         </w:numPr>
         <w:pStyle w:val="Compact"/>
       </w:pPr>
@@ -19166,7 +19322,7 @@
       <w:pPr>
         <w:numPr>
           <w:ilvl w:val="0"/>
-          <w:numId w:val="1021"/>
+          <w:numId w:val="1022"/>
         </w:numPr>
         <w:pStyle w:val="Compact"/>
       </w:pPr>
@@ -19204,7 +19360,7 @@
       <w:pPr>
         <w:numPr>
           <w:ilvl w:val="0"/>
-          <w:numId w:val="1021"/>
+          <w:numId w:val="1022"/>
         </w:numPr>
         <w:pStyle w:val="Compact"/>
       </w:pPr>
@@ -19238,8 +19394,8 @@
         <w:t xml:space="preserve">Sable cleaned up the corporation’s files that proved Anwe’s case, and asked nothing for it.</w:t>
       </w:r>
     </w:p>
-    <w:bookmarkEnd w:id="128"/>
-    <w:bookmarkStart w:id="129" w:name="brakka"/>
+    <w:bookmarkEnd w:id="129"/>
+    <w:bookmarkStart w:id="130" w:name="brakka"/>
     <w:p>
       <w:pPr>
         <w:pStyle w:val="Heading2"/>
@@ -19270,7 +19426,7 @@
       <w:pPr>
         <w:numPr>
           <w:ilvl w:val="0"/>
-          <w:numId w:val="1022"/>
+          <w:numId w:val="1023"/>
         </w:numPr>
         <w:pStyle w:val="Compact"/>
       </w:pPr>
@@ -19308,7 +19464,7 @@
       <w:pPr>
         <w:numPr>
           <w:ilvl w:val="0"/>
-          <w:numId w:val="1022"/>
+          <w:numId w:val="1023"/>
         </w:numPr>
         <w:pStyle w:val="Compact"/>
       </w:pPr>
@@ -19330,7 +19486,7 @@
       <w:pPr>
         <w:numPr>
           <w:ilvl w:val="0"/>
-          <w:numId w:val="1022"/>
+          <w:numId w:val="1023"/>
         </w:numPr>
         <w:pStyle w:val="Compact"/>
       </w:pPr>
@@ -19352,7 +19508,7 @@
       <w:pPr>
         <w:numPr>
           <w:ilvl w:val="0"/>
-          <w:numId w:val="1022"/>
+          <w:numId w:val="1023"/>
         </w:numPr>
         <w:pStyle w:val="Compact"/>
       </w:pPr>
@@ -19390,7 +19546,7 @@
       <w:pPr>
         <w:numPr>
           <w:ilvl w:val="0"/>
-          <w:numId w:val="1022"/>
+          <w:numId w:val="1023"/>
         </w:numPr>
         <w:pStyle w:val="Compact"/>
       </w:pPr>
@@ -19424,8 +19580,8 @@
         <w:t xml:space="preserve">Rook fought him across the Zhaq border once. Now Rook watches his back.</w:t>
       </w:r>
     </w:p>
-    <w:bookmarkEnd w:id="129"/>
-    <w:bookmarkStart w:id="130" w:name="sable"/>
+    <w:bookmarkEnd w:id="130"/>
+    <w:bookmarkStart w:id="131" w:name="sable"/>
     <w:p>
       <w:pPr>
         <w:pStyle w:val="Heading2"/>
@@ -19456,7 +19612,7 @@
       <w:pPr>
         <w:numPr>
           <w:ilvl w:val="0"/>
-          <w:numId w:val="1023"/>
+          <w:numId w:val="1024"/>
         </w:numPr>
         <w:pStyle w:val="Compact"/>
       </w:pPr>
@@ -19494,7 +19650,7 @@
       <w:pPr>
         <w:numPr>
           <w:ilvl w:val="0"/>
-          <w:numId w:val="1023"/>
+          <w:numId w:val="1024"/>
         </w:numPr>
         <w:pStyle w:val="Compact"/>
       </w:pPr>
@@ -19516,7 +19672,7 @@
       <w:pPr>
         <w:numPr>
           <w:ilvl w:val="0"/>
-          <w:numId w:val="1023"/>
+          <w:numId w:val="1024"/>
         </w:numPr>
         <w:pStyle w:val="Compact"/>
       </w:pPr>
@@ -19538,7 +19694,7 @@
       <w:pPr>
         <w:numPr>
           <w:ilvl w:val="0"/>
-          <w:numId w:val="1023"/>
+          <w:numId w:val="1024"/>
         </w:numPr>
         <w:pStyle w:val="Compact"/>
       </w:pPr>
@@ -19576,7 +19732,7 @@
       <w:pPr>
         <w:numPr>
           <w:ilvl w:val="0"/>
-          <w:numId w:val="1023"/>
+          <w:numId w:val="1024"/>
         </w:numPr>
         <w:pStyle w:val="Compact"/>
       </w:pPr>
@@ -19610,9 +19766,9 @@
         <w:t xml:space="preserve">Sable cleaned up the files that proved Dr. Anwe Tal’s case, for nothing. Anwe wonders why.</w:t>
       </w:r>
     </w:p>
-    <w:bookmarkEnd w:id="130"/>
     <w:bookmarkEnd w:id="131"/>
-    <w:bookmarkStart w:id="132" w:name="advantages"/>
+    <w:bookmarkEnd w:id="132"/>
+    <w:bookmarkStart w:id="133" w:name="advantages"/>
     <w:p>
       <w:pPr>
         <w:pStyle w:val="Heading1"/>
@@ -20511,8 +20667,8 @@
         <w:t xml:space="preserve">belongs to the whole crew once it’s taken.</w:t>
       </w:r>
     </w:p>
-    <w:bookmarkEnd w:id="132"/>
-    <w:bookmarkStart w:id="158" w:name="species"/>
+    <w:bookmarkEnd w:id="133"/>
+    <w:bookmarkStart w:id="159" w:name="species"/>
     <w:p>
       <w:pPr>
         <w:pStyle w:val="Heading1"/>
@@ -22195,7 +22351,7 @@
         </w:tc>
       </w:tr>
     </w:tbl>
-    <w:bookmarkStart w:id="133" w:name="human"/>
+    <w:bookmarkStart w:id="134" w:name="human"/>
     <w:p>
       <w:pPr>
         <w:pStyle w:val="Heading2"/>
@@ -22508,8 +22664,8 @@
         </w:tc>
       </w:tr>
     </w:tbl>
-    <w:bookmarkEnd w:id="133"/>
-    <w:bookmarkStart w:id="134" w:name="vesh"/>
+    <w:bookmarkEnd w:id="134"/>
+    <w:bookmarkStart w:id="135" w:name="vesh"/>
     <w:p>
       <w:pPr>
         <w:pStyle w:val="Heading2"/>
@@ -22822,8 +22978,8 @@
         </w:tc>
       </w:tr>
     </w:tbl>
-    <w:bookmarkEnd w:id="134"/>
-    <w:bookmarkStart w:id="135" w:name="brulvek"/>
+    <w:bookmarkEnd w:id="135"/>
+    <w:bookmarkStart w:id="136" w:name="brulvek"/>
     <w:p>
       <w:pPr>
         <w:pStyle w:val="Heading2"/>
@@ -22868,7 +23024,7 @@
       <w:pPr>
         <w:numPr>
           <w:ilvl w:val="0"/>
-          <w:numId w:val="1024"/>
+          <w:numId w:val="1025"/>
         </w:numPr>
         <w:pStyle w:val="Compact"/>
       </w:pPr>
@@ -23160,8 +23316,8 @@
         </w:tc>
       </w:tr>
     </w:tbl>
-    <w:bookmarkEnd w:id="135"/>
-    <w:bookmarkStart w:id="136" w:name="corvani"/>
+    <w:bookmarkEnd w:id="136"/>
+    <w:bookmarkStart w:id="137" w:name="corvani"/>
     <w:p>
       <w:pPr>
         <w:pStyle w:val="Heading2"/>
@@ -23206,7 +23362,7 @@
       <w:pPr>
         <w:numPr>
           <w:ilvl w:val="0"/>
-          <w:numId w:val="1025"/>
+          <w:numId w:val="1026"/>
         </w:numPr>
         <w:pStyle w:val="Compact"/>
       </w:pPr>
@@ -23498,8 +23654,8 @@
         </w:tc>
       </w:tr>
     </w:tbl>
-    <w:bookmarkEnd w:id="136"/>
-    <w:bookmarkStart w:id="137" w:name="draelin"/>
+    <w:bookmarkEnd w:id="137"/>
+    <w:bookmarkStart w:id="138" w:name="draelin"/>
     <w:p>
       <w:pPr>
         <w:pStyle w:val="Heading2"/>
@@ -23544,7 +23700,7 @@
       <w:pPr>
         <w:numPr>
           <w:ilvl w:val="0"/>
-          <w:numId w:val="1026"/>
+          <w:numId w:val="1027"/>
         </w:numPr>
         <w:pStyle w:val="Compact"/>
       </w:pPr>
@@ -23556,7 +23712,7 @@
       <w:pPr>
         <w:numPr>
           <w:ilvl w:val="0"/>
-          <w:numId w:val="1026"/>
+          <w:numId w:val="1027"/>
         </w:numPr>
         <w:pStyle w:val="Compact"/>
       </w:pPr>
@@ -23866,8 +24022,8 @@
         </w:tc>
       </w:tr>
     </w:tbl>
-    <w:bookmarkEnd w:id="137"/>
-    <w:bookmarkStart w:id="138" w:name="joruun"/>
+    <w:bookmarkEnd w:id="138"/>
+    <w:bookmarkStart w:id="139" w:name="joruun"/>
     <w:p>
       <w:pPr>
         <w:pStyle w:val="Heading2"/>
@@ -23912,7 +24068,7 @@
       <w:pPr>
         <w:numPr>
           <w:ilvl w:val="0"/>
-          <w:numId w:val="1027"/>
+          <w:numId w:val="1028"/>
         </w:numPr>
         <w:pStyle w:val="Compact"/>
       </w:pPr>
@@ -24204,8 +24360,8 @@
         </w:tc>
       </w:tr>
     </w:tbl>
-    <w:bookmarkEnd w:id="138"/>
-    <w:bookmarkStart w:id="139" w:name="kel-1"/>
+    <w:bookmarkEnd w:id="139"/>
+    <w:bookmarkStart w:id="140" w:name="kel-1"/>
     <w:p>
       <w:pPr>
         <w:pStyle w:val="Heading2"/>
@@ -24250,7 +24406,7 @@
       <w:pPr>
         <w:numPr>
           <w:ilvl w:val="0"/>
-          <w:numId w:val="1028"/>
+          <w:numId w:val="1029"/>
         </w:numPr>
         <w:pStyle w:val="Compact"/>
       </w:pPr>
@@ -24262,7 +24418,7 @@
       <w:pPr>
         <w:numPr>
           <w:ilvl w:val="0"/>
-          <w:numId w:val="1028"/>
+          <w:numId w:val="1029"/>
         </w:numPr>
         <w:pStyle w:val="Compact"/>
       </w:pPr>
@@ -24554,8 +24710,8 @@
         </w:tc>
       </w:tr>
     </w:tbl>
-    <w:bookmarkEnd w:id="139"/>
-    <w:bookmarkStart w:id="140" w:name="mirrun-1"/>
+    <w:bookmarkEnd w:id="140"/>
+    <w:bookmarkStart w:id="141" w:name="mirrun-1"/>
     <w:p>
       <w:pPr>
         <w:pStyle w:val="Heading2"/>
@@ -24600,7 +24756,7 @@
       <w:pPr>
         <w:numPr>
           <w:ilvl w:val="0"/>
-          <w:numId w:val="1029"/>
+          <w:numId w:val="1030"/>
         </w:numPr>
         <w:pStyle w:val="Compact"/>
       </w:pPr>
@@ -24892,8 +25048,8 @@
         </w:tc>
       </w:tr>
     </w:tbl>
-    <w:bookmarkEnd w:id="140"/>
-    <w:bookmarkStart w:id="141" w:name="ommek"/>
+    <w:bookmarkEnd w:id="141"/>
+    <w:bookmarkStart w:id="142" w:name="ommek"/>
     <w:p>
       <w:pPr>
         <w:pStyle w:val="Heading2"/>
@@ -24938,7 +25094,7 @@
       <w:pPr>
         <w:numPr>
           <w:ilvl w:val="0"/>
-          <w:numId w:val="1030"/>
+          <w:numId w:val="1031"/>
         </w:numPr>
         <w:pStyle w:val="Compact"/>
       </w:pPr>
@@ -25248,8 +25404,8 @@
         </w:tc>
       </w:tr>
     </w:tbl>
-    <w:bookmarkEnd w:id="141"/>
-    <w:bookmarkStart w:id="142" w:name="shivar"/>
+    <w:bookmarkEnd w:id="142"/>
+    <w:bookmarkStart w:id="143" w:name="shivar"/>
     <w:p>
       <w:pPr>
         <w:pStyle w:val="Heading2"/>
@@ -25294,7 +25450,7 @@
       <w:pPr>
         <w:numPr>
           <w:ilvl w:val="0"/>
-          <w:numId w:val="1031"/>
+          <w:numId w:val="1032"/>
         </w:numPr>
         <w:pStyle w:val="Compact"/>
       </w:pPr>
@@ -25586,8 +25742,8 @@
         </w:tc>
       </w:tr>
     </w:tbl>
-    <w:bookmarkEnd w:id="142"/>
-    <w:bookmarkStart w:id="143" w:name="tessan-1"/>
+    <w:bookmarkEnd w:id="143"/>
+    <w:bookmarkStart w:id="144" w:name="tessan-1"/>
     <w:p>
       <w:pPr>
         <w:pStyle w:val="Heading2"/>
@@ -25632,7 +25788,7 @@
       <w:pPr>
         <w:numPr>
           <w:ilvl w:val="0"/>
-          <w:numId w:val="1032"/>
+          <w:numId w:val="1033"/>
         </w:numPr>
         <w:pStyle w:val="Compact"/>
       </w:pPr>
@@ -25644,7 +25800,7 @@
       <w:pPr>
         <w:numPr>
           <w:ilvl w:val="0"/>
-          <w:numId w:val="1032"/>
+          <w:numId w:val="1033"/>
         </w:numPr>
         <w:pStyle w:val="Compact"/>
       </w:pPr>
@@ -25936,8 +26092,8 @@
         </w:tc>
       </w:tr>
     </w:tbl>
-    <w:bookmarkEnd w:id="143"/>
-    <w:bookmarkStart w:id="144" w:name="thrum"/>
+    <w:bookmarkEnd w:id="144"/>
+    <w:bookmarkStart w:id="145" w:name="thrum"/>
     <w:p>
       <w:pPr>
         <w:pStyle w:val="Heading2"/>
@@ -25982,7 +26138,7 @@
       <w:pPr>
         <w:numPr>
           <w:ilvl w:val="0"/>
-          <w:numId w:val="1033"/>
+          <w:numId w:val="1034"/>
         </w:numPr>
         <w:pStyle w:val="Compact"/>
       </w:pPr>
@@ -26274,8 +26430,8 @@
         </w:tc>
       </w:tr>
     </w:tbl>
-    <w:bookmarkEnd w:id="144"/>
-    <w:bookmarkStart w:id="145" w:name="uth"/>
+    <w:bookmarkEnd w:id="145"/>
+    <w:bookmarkStart w:id="146" w:name="uth"/>
     <w:p>
       <w:pPr>
         <w:pStyle w:val="Heading2"/>
@@ -26320,7 +26476,7 @@
       <w:pPr>
         <w:numPr>
           <w:ilvl w:val="0"/>
-          <w:numId w:val="1034"/>
+          <w:numId w:val="1035"/>
         </w:numPr>
         <w:pStyle w:val="Compact"/>
       </w:pPr>
@@ -26612,8 +26768,8 @@
         </w:tc>
       </w:tr>
     </w:tbl>
-    <w:bookmarkEnd w:id="145"/>
-    <w:bookmarkStart w:id="146" w:name="uxarra"/>
+    <w:bookmarkEnd w:id="146"/>
+    <w:bookmarkStart w:id="147" w:name="uxarra"/>
     <w:p>
       <w:pPr>
         <w:pStyle w:val="Heading2"/>
@@ -26658,7 +26814,7 @@
       <w:pPr>
         <w:numPr>
           <w:ilvl w:val="0"/>
-          <w:numId w:val="1035"/>
+          <w:numId w:val="1036"/>
         </w:numPr>
         <w:pStyle w:val="Compact"/>
       </w:pPr>
@@ -26950,8 +27106,8 @@
         </w:tc>
       </w:tr>
     </w:tbl>
-    <w:bookmarkEnd w:id="146"/>
-    <w:bookmarkStart w:id="147" w:name="vael"/>
+    <w:bookmarkEnd w:id="147"/>
+    <w:bookmarkStart w:id="148" w:name="vael"/>
     <w:p>
       <w:pPr>
         <w:pStyle w:val="Heading2"/>
@@ -26996,7 +27152,7 @@
       <w:pPr>
         <w:numPr>
           <w:ilvl w:val="0"/>
-          <w:numId w:val="1036"/>
+          <w:numId w:val="1037"/>
         </w:numPr>
         <w:pStyle w:val="Compact"/>
       </w:pPr>
@@ -27008,7 +27164,7 @@
       <w:pPr>
         <w:numPr>
           <w:ilvl w:val="0"/>
-          <w:numId w:val="1036"/>
+          <w:numId w:val="1037"/>
         </w:numPr>
         <w:pStyle w:val="Compact"/>
       </w:pPr>
@@ -27300,8 +27456,8 @@
         </w:tc>
       </w:tr>
     </w:tbl>
-    <w:bookmarkEnd w:id="147"/>
-    <w:bookmarkStart w:id="148" w:name="veyari"/>
+    <w:bookmarkEnd w:id="148"/>
+    <w:bookmarkStart w:id="149" w:name="veyari"/>
     <w:p>
       <w:pPr>
         <w:pStyle w:val="Heading2"/>
@@ -27346,7 +27502,7 @@
       <w:pPr>
         <w:numPr>
           <w:ilvl w:val="0"/>
-          <w:numId w:val="1037"/>
+          <w:numId w:val="1038"/>
         </w:numPr>
         <w:pStyle w:val="Compact"/>
       </w:pPr>
@@ -27638,8 +27794,8 @@
         </w:tc>
       </w:tr>
     </w:tbl>
-    <w:bookmarkEnd w:id="148"/>
-    <w:bookmarkStart w:id="149" w:name="ylith-1"/>
+    <w:bookmarkEnd w:id="149"/>
+    <w:bookmarkStart w:id="150" w:name="ylith-1"/>
     <w:p>
       <w:pPr>
         <w:pStyle w:val="Heading2"/>
@@ -27684,7 +27840,7 @@
       <w:pPr>
         <w:numPr>
           <w:ilvl w:val="0"/>
-          <w:numId w:val="1038"/>
+          <w:numId w:val="1039"/>
         </w:numPr>
         <w:pStyle w:val="Compact"/>
       </w:pPr>
@@ -27696,7 +27852,7 @@
       <w:pPr>
         <w:numPr>
           <w:ilvl w:val="0"/>
-          <w:numId w:val="1038"/>
+          <w:numId w:val="1039"/>
         </w:numPr>
         <w:pStyle w:val="Compact"/>
       </w:pPr>
@@ -27988,8 +28144,8 @@
         </w:tc>
       </w:tr>
     </w:tbl>
-    <w:bookmarkEnd w:id="149"/>
-    <w:bookmarkStart w:id="150" w:name="zethri"/>
+    <w:bookmarkEnd w:id="150"/>
+    <w:bookmarkStart w:id="151" w:name="zethri"/>
     <w:p>
       <w:pPr>
         <w:pStyle w:val="Heading2"/>
@@ -28034,7 +28190,7 @@
       <w:pPr>
         <w:numPr>
           <w:ilvl w:val="0"/>
-          <w:numId w:val="1039"/>
+          <w:numId w:val="1040"/>
         </w:numPr>
         <w:pStyle w:val="Compact"/>
       </w:pPr>
@@ -28326,8 +28482,8 @@
         </w:tc>
       </w:tr>
     </w:tbl>
-    <w:bookmarkEnd w:id="150"/>
-    <w:bookmarkStart w:id="151" w:name="zhaq"/>
+    <w:bookmarkEnd w:id="151"/>
+    <w:bookmarkStart w:id="152" w:name="zhaq"/>
     <w:p>
       <w:pPr>
         <w:pStyle w:val="Heading2"/>
@@ -28372,7 +28528,7 @@
       <w:pPr>
         <w:numPr>
           <w:ilvl w:val="0"/>
-          <w:numId w:val="1040"/>
+          <w:numId w:val="1041"/>
         </w:numPr>
         <w:pStyle w:val="Compact"/>
       </w:pPr>
@@ -28384,7 +28540,7 @@
       <w:pPr>
         <w:numPr>
           <w:ilvl w:val="0"/>
-          <w:numId w:val="1040"/>
+          <w:numId w:val="1041"/>
         </w:numPr>
         <w:pStyle w:val="Compact"/>
       </w:pPr>
@@ -28676,8 +28832,8 @@
         </w:tc>
       </w:tr>
     </w:tbl>
-    <w:bookmarkEnd w:id="151"/>
-    <w:bookmarkStart w:id="152" w:name="dresh"/>
+    <w:bookmarkEnd w:id="152"/>
+    <w:bookmarkStart w:id="153" w:name="dresh"/>
     <w:p>
       <w:pPr>
         <w:pStyle w:val="Heading2"/>
@@ -28722,7 +28878,7 @@
       <w:pPr>
         <w:numPr>
           <w:ilvl w:val="0"/>
-          <w:numId w:val="1041"/>
+          <w:numId w:val="1042"/>
         </w:numPr>
         <w:pStyle w:val="Compact"/>
       </w:pPr>
@@ -28734,7 +28890,7 @@
       <w:pPr>
         <w:numPr>
           <w:ilvl w:val="0"/>
-          <w:numId w:val="1041"/>
+          <w:numId w:val="1042"/>
         </w:numPr>
         <w:pStyle w:val="Compact"/>
       </w:pPr>
@@ -28746,7 +28902,7 @@
       <w:pPr>
         <w:numPr>
           <w:ilvl w:val="0"/>
-          <w:numId w:val="1041"/>
+          <w:numId w:val="1042"/>
         </w:numPr>
         <w:pStyle w:val="Compact"/>
       </w:pPr>
@@ -29038,8 +29194,8 @@
         </w:tc>
       </w:tr>
     </w:tbl>
-    <w:bookmarkEnd w:id="152"/>
-    <w:bookmarkStart w:id="153" w:name="eshuum"/>
+    <w:bookmarkEnd w:id="153"/>
+    <w:bookmarkStart w:id="154" w:name="eshuum"/>
     <w:p>
       <w:pPr>
         <w:pStyle w:val="Heading2"/>
@@ -29084,7 +29240,7 @@
       <w:pPr>
         <w:numPr>
           <w:ilvl w:val="0"/>
-          <w:numId w:val="1042"/>
+          <w:numId w:val="1043"/>
         </w:numPr>
         <w:pStyle w:val="Compact"/>
       </w:pPr>
@@ -29096,7 +29252,7 @@
       <w:pPr>
         <w:numPr>
           <w:ilvl w:val="0"/>
-          <w:numId w:val="1042"/>
+          <w:numId w:val="1043"/>
         </w:numPr>
         <w:pStyle w:val="Compact"/>
       </w:pPr>
@@ -29388,8 +29544,8 @@
         </w:tc>
       </w:tr>
     </w:tbl>
-    <w:bookmarkEnd w:id="153"/>
-    <w:bookmarkStart w:id="154" w:name="khaum"/>
+    <w:bookmarkEnd w:id="154"/>
+    <w:bookmarkStart w:id="155" w:name="khaum"/>
     <w:p>
       <w:pPr>
         <w:pStyle w:val="Heading2"/>
@@ -29434,7 +29590,7 @@
       <w:pPr>
         <w:numPr>
           <w:ilvl w:val="0"/>
-          <w:numId w:val="1043"/>
+          <w:numId w:val="1044"/>
         </w:numPr>
         <w:pStyle w:val="Compact"/>
       </w:pPr>
@@ -29446,7 +29602,7 @@
       <w:pPr>
         <w:numPr>
           <w:ilvl w:val="0"/>
-          <w:numId w:val="1043"/>
+          <w:numId w:val="1044"/>
         </w:numPr>
         <w:pStyle w:val="Compact"/>
       </w:pPr>
@@ -29458,7 +29614,7 @@
       <w:pPr>
         <w:numPr>
           <w:ilvl w:val="0"/>
-          <w:numId w:val="1043"/>
+          <w:numId w:val="1044"/>
         </w:numPr>
         <w:pStyle w:val="Compact"/>
       </w:pPr>
@@ -29750,8 +29906,8 @@
         </w:tc>
       </w:tr>
     </w:tbl>
-    <w:bookmarkEnd w:id="154"/>
-    <w:bookmarkStart w:id="155" w:name="ozhvek"/>
+    <w:bookmarkEnd w:id="155"/>
+    <w:bookmarkStart w:id="156" w:name="ozhvek"/>
     <w:p>
       <w:pPr>
         <w:pStyle w:val="Heading2"/>
@@ -29796,7 +29952,7 @@
       <w:pPr>
         <w:numPr>
           <w:ilvl w:val="0"/>
-          <w:numId w:val="1044"/>
+          <w:numId w:val="1045"/>
         </w:numPr>
         <w:pStyle w:val="Compact"/>
       </w:pPr>
@@ -29808,7 +29964,7 @@
       <w:pPr>
         <w:numPr>
           <w:ilvl w:val="0"/>
-          <w:numId w:val="1044"/>
+          <w:numId w:val="1045"/>
         </w:numPr>
         <w:pStyle w:val="Compact"/>
       </w:pPr>
@@ -30100,8 +30256,8 @@
         </w:tc>
       </w:tr>
     </w:tbl>
-    <w:bookmarkEnd w:id="155"/>
-    <w:bookmarkStart w:id="156" w:name="qor"/>
+    <w:bookmarkEnd w:id="156"/>
+    <w:bookmarkStart w:id="157" w:name="qor"/>
     <w:p>
       <w:pPr>
         <w:pStyle w:val="Heading2"/>
@@ -30146,7 +30302,7 @@
       <w:pPr>
         <w:numPr>
           <w:ilvl w:val="0"/>
-          <w:numId w:val="1045"/>
+          <w:numId w:val="1046"/>
         </w:numPr>
         <w:pStyle w:val="Compact"/>
       </w:pPr>
@@ -30158,7 +30314,7 @@
       <w:pPr>
         <w:numPr>
           <w:ilvl w:val="0"/>
-          <w:numId w:val="1045"/>
+          <w:numId w:val="1046"/>
         </w:numPr>
         <w:pStyle w:val="Compact"/>
       </w:pPr>
@@ -30450,8 +30606,8 @@
         </w:tc>
       </w:tr>
     </w:tbl>
-    <w:bookmarkEnd w:id="156"/>
-    <w:bookmarkStart w:id="157" w:name="sen"/>
+    <w:bookmarkEnd w:id="157"/>
+    <w:bookmarkStart w:id="158" w:name="sen"/>
     <w:p>
       <w:pPr>
         <w:pStyle w:val="Heading2"/>
@@ -30496,7 +30652,7 @@
       <w:pPr>
         <w:numPr>
           <w:ilvl w:val="0"/>
-          <w:numId w:val="1046"/>
+          <w:numId w:val="1047"/>
         </w:numPr>
         <w:pStyle w:val="Compact"/>
       </w:pPr>
@@ -30508,7 +30664,7 @@
       <w:pPr>
         <w:numPr>
           <w:ilvl w:val="0"/>
-          <w:numId w:val="1046"/>
+          <w:numId w:val="1047"/>
         </w:numPr>
         <w:pStyle w:val="Compact"/>
       </w:pPr>
@@ -30800,9 +30956,9 @@
         </w:tc>
       </w:tr>
     </w:tbl>
-    <w:bookmarkEnd w:id="157"/>
     <w:bookmarkEnd w:id="158"/>
-    <w:bookmarkStart w:id="169" w:name="making-your-own"/>
+    <w:bookmarkEnd w:id="159"/>
+    <w:bookmarkStart w:id="170" w:name="making-your-own"/>
     <w:p>
       <w:pPr>
         <w:pStyle w:val="Heading1"/>
@@ -30835,7 +30991,7 @@
         <w:t xml:space="preserve">option at the end of each list, and its checklist holds a custom choice to the same rules as everything else.</w:t>
       </w:r>
     </w:p>
-    <w:bookmarkStart w:id="159" w:name="a-custom-calling"/>
+    <w:bookmarkStart w:id="160" w:name="a-custom-calling"/>
     <w:p>
       <w:pPr>
         <w:pStyle w:val="Heading2"/>
@@ -30856,7 +31012,7 @@
       <w:pPr>
         <w:numPr>
           <w:ilvl w:val="0"/>
-          <w:numId w:val="1047"/>
+          <w:numId w:val="1048"/>
         </w:numPr>
         <w:pStyle w:val="Compact"/>
       </w:pPr>
@@ -30902,7 +31058,7 @@
       <w:pPr>
         <w:numPr>
           <w:ilvl w:val="0"/>
-          <w:numId w:val="1047"/>
+          <w:numId w:val="1048"/>
         </w:numPr>
         <w:pStyle w:val="Compact"/>
       </w:pPr>
@@ -30924,7 +31080,7 @@
       <w:pPr>
         <w:numPr>
           <w:ilvl w:val="0"/>
-          <w:numId w:val="1047"/>
+          <w:numId w:val="1048"/>
         </w:numPr>
         <w:pStyle w:val="Compact"/>
       </w:pPr>
@@ -30946,7 +31102,7 @@
       <w:pPr>
         <w:numPr>
           <w:ilvl w:val="0"/>
-          <w:numId w:val="1047"/>
+          <w:numId w:val="1048"/>
         </w:numPr>
         <w:pStyle w:val="Compact"/>
       </w:pPr>
@@ -31011,8 +31167,8 @@
         <w:t xml:space="preserve">.</w:t>
       </w:r>
     </w:p>
-    <w:bookmarkEnd w:id="159"/>
-    <w:bookmarkStart w:id="168" w:name="a-custom-species"/>
+    <w:bookmarkEnd w:id="160"/>
+    <w:bookmarkStart w:id="169" w:name="a-custom-species"/>
     <w:p>
       <w:pPr>
         <w:pStyle w:val="Heading2"/>
@@ -31029,7 +31185,7 @@
         <w:t xml:space="preserve">Build it with the GM, one step at a time.</w:t>
       </w:r>
     </w:p>
-    <w:bookmarkStart w:id="160" w:name="the-concept"/>
+    <w:bookmarkStart w:id="161" w:name="the-concept"/>
     <w:p>
       <w:pPr>
         <w:pStyle w:val="Heading3"/>
@@ -31046,8 +31202,8 @@
         <w:t xml:space="preserve">Two or three sentences: where they come from, what sets them apart, and how others see them. It should be something the species in this book don’t already cover.</w:t>
       </w:r>
     </w:p>
-    <w:bookmarkEnd w:id="160"/>
-    <w:bookmarkStart w:id="161" w:name="the-tier"/>
+    <w:bookmarkEnd w:id="161"/>
+    <w:bookmarkStart w:id="162" w:name="the-tier"/>
     <w:p>
       <w:pPr>
         <w:pStyle w:val="Heading3"/>
@@ -31344,8 +31500,8 @@
         <w:t xml:space="preserve">When in doubt, choose the higher tier.</w:t>
       </w:r>
     </w:p>
-    <w:bookmarkEnd w:id="161"/>
-    <w:bookmarkStart w:id="162" w:name="attribute-adjustments"/>
+    <w:bookmarkEnd w:id="162"/>
+    <w:bookmarkStart w:id="163" w:name="attribute-adjustments"/>
     <w:p>
       <w:pPr>
         <w:pStyle w:val="Heading3"/>
@@ -31391,8 +31547,8 @@
         <w:t xml:space="preserve">: a +2 needs a −2 or two −1s. The adjustments move the attribute’s base (+1 starts it at 11) and raise its starting maximum (13 plus the bonus). Most species change two to four attributes.</w:t>
       </w:r>
     </w:p>
-    <w:bookmarkEnd w:id="162"/>
-    <w:bookmarkStart w:id="163" w:name="core-rules-tier-1-and-up"/>
+    <w:bookmarkEnd w:id="163"/>
+    <w:bookmarkStart w:id="164" w:name="core-rules-tier-1-and-up"/>
     <w:p>
       <w:pPr>
         <w:pStyle w:val="Heading3"/>
@@ -31409,8 +31565,8 @@
         <w:t xml:space="preserve">One to three short rules that always apply: what they can do (see in the dark, resist cold, a free Trained skill) and what it costs (a weakness, a people’s distrust, a hazard they can’t abide). A strength with no drawback is worth more than it looks, so price it a tier higher.</w:t>
       </w:r>
     </w:p>
-    <w:bookmarkEnd w:id="163"/>
-    <w:bookmarkStart w:id="164" w:name="species-advantages"/>
+    <w:bookmarkEnd w:id="164"/>
+    <w:bookmarkStart w:id="165" w:name="species-advantages"/>
     <w:p>
       <w:pPr>
         <w:pStyle w:val="Heading3"/>
@@ -31465,8 +31621,8 @@
         <w:t xml:space="preserve">: a problem the trait causes, with a clear trigger and a real consequence, which earns a Resolve point when it bites, like any complication. A character takes one advantage, general or species, so make them distinct choices.</w:t>
       </w:r>
     </w:p>
-    <w:bookmarkEnd w:id="164"/>
-    <w:bookmarkStart w:id="165" w:name="an-alternate-form-optional-tier-2-or-3"/>
+    <w:bookmarkEnd w:id="165"/>
+    <w:bookmarkStart w:id="166" w:name="an-alternate-form-optional-tier-2-or-3"/>
     <w:p>
       <w:pPr>
         <w:pStyle w:val="Heading3"/>
@@ -31499,8 +31655,8 @@
         <w:t xml:space="preserve">apply.</w:t>
       </w:r>
     </w:p>
-    <w:bookmarkEnd w:id="165"/>
-    <w:bookmarkStart w:id="166" w:name="in-the-creator"/>
+    <w:bookmarkEnd w:id="166"/>
+    <w:bookmarkStart w:id="167" w:name="in-the-creator"/>
     <w:p>
       <w:pPr>
         <w:pStyle w:val="Heading3"/>
@@ -31513,7 +31669,7 @@
       <w:pPr>
         <w:numPr>
           <w:ilvl w:val="0"/>
-          <w:numId w:val="1048"/>
+          <w:numId w:val="1049"/>
         </w:numPr>
         <w:pStyle w:val="Compact"/>
       </w:pPr>
@@ -31541,7 +31697,7 @@
       <w:pPr>
         <w:numPr>
           <w:ilvl w:val="0"/>
-          <w:numId w:val="1048"/>
+          <w:numId w:val="1049"/>
         </w:numPr>
         <w:pStyle w:val="Compact"/>
       </w:pPr>
@@ -31553,7 +31709,7 @@
       <w:pPr>
         <w:numPr>
           <w:ilvl w:val="0"/>
-          <w:numId w:val="1048"/>
+          <w:numId w:val="1049"/>
         </w:numPr>
         <w:pStyle w:val="Compact"/>
       </w:pPr>
@@ -31581,7 +31737,7 @@
       <w:pPr>
         <w:numPr>
           <w:ilvl w:val="0"/>
-          <w:numId w:val="1048"/>
+          <w:numId w:val="1049"/>
         </w:numPr>
         <w:pStyle w:val="Compact"/>
       </w:pPr>
@@ -31605,8 +31761,8 @@
         <w:t xml:space="preserve">and enter the advantage and its companion complication.</w:t>
       </w:r>
     </w:p>
-    <w:bookmarkEnd w:id="166"/>
-    <w:bookmarkStart w:id="167" w:name="example"/>
+    <w:bookmarkEnd w:id="167"/>
+    <w:bookmarkStart w:id="168" w:name="example"/>
     <w:p>
       <w:pPr>
         <w:pStyle w:val="Heading3"/>
@@ -31711,10 +31867,10 @@
         <w:t xml:space="preserve">: your family’s dynasty calls on you; accept the errand.</w:t>
       </w:r>
     </w:p>
-    <w:bookmarkEnd w:id="167"/>
     <w:bookmarkEnd w:id="168"/>
     <w:bookmarkEnd w:id="169"/>
-    <w:bookmarkStart w:id="170" w:name="complications"/>
+    <w:bookmarkEnd w:id="170"/>
+    <w:bookmarkStart w:id="171" w:name="complications"/>
     <w:p>
       <w:pPr>
         <w:pStyle w:val="Heading1"/>
@@ -32419,8 +32575,8 @@
         </w:tc>
       </w:tr>
     </w:tbl>
-    <w:bookmarkEnd w:id="170"/>
-    <w:bookmarkStart w:id="171" w:name="quick-reference"/>
+    <w:bookmarkEnd w:id="171"/>
+    <w:bookmarkStart w:id="172" w:name="quick-reference"/>
     <w:p>
       <w:pPr>
         <w:pStyle w:val="Heading1"/>
@@ -32591,8 +32747,8 @@
         <w:t xml:space="preserve">start each session with two. Reroll, reduce an injury by one box, or establish a small preparation. Earn one from an accepted complication.</w:t>
       </w:r>
     </w:p>
-    <w:bookmarkEnd w:id="171"/>
-    <w:bookmarkStart w:id="174" w:name="discord-commands"/>
+    <w:bookmarkEnd w:id="172"/>
+    <w:bookmarkStart w:id="175" w:name="discord-commands"/>
     <w:p>
       <w:pPr>
         <w:pStyle w:val="Heading1"/>
@@ -32624,7 +32780,7 @@
         <w:t xml:space="preserve">in a channel to see the commands; Discord shows each option as you fill it in. The bot doesn’t know your sheet, so you give it the target number.</w:t>
       </w:r>
     </w:p>
-    <w:bookmarkStart w:id="172" w:name="for-players"/>
+    <w:bookmarkStart w:id="173" w:name="for-players"/>
     <w:p>
       <w:pPr>
         <w:pStyle w:val="Heading2"/>
@@ -33044,8 +33200,8 @@
         <w:t xml:space="preserve">Only the player who rolled can press the reroll button. Rolls that miss by 1 or 2 remind the GM that success at a cost is on offer.</w:t>
       </w:r>
     </w:p>
-    <w:bookmarkEnd w:id="172"/>
-    <w:bookmarkStart w:id="173" w:name="for-the-gm"/>
+    <w:bookmarkEnd w:id="173"/>
+    <w:bookmarkStart w:id="174" w:name="for-the-gm"/>
     <w:p>
       <w:pPr>
         <w:pStyle w:val="Heading2"/>
@@ -33685,8 +33841,8 @@
         <w:t xml:space="preserve">Legend Dynamics RPG system. The core rules and this setting are original works.</w:t>
       </w:r>
     </w:p>
-    <w:bookmarkEnd w:id="173"/>
     <w:bookmarkEnd w:id="174"/>
+    <w:bookmarkEnd w:id="175"/>
     <w:sectPr/>
   </w:body>
 </w:document>
@@ -34078,6 +34234,9 @@
     <w:abstractNumId w:val="991"/>
   </w:num>
   <w:num w:numId="1014">
+    <w:abstractNumId w:val="991"/>
+  </w:num>
+  <w:num w:numId="1015">
     <w:abstractNumId w:val="99411"/>
     <w:lvlOverride w:ilvl="0">
       <w:startOverride w:val="1"/>
@@ -34106,9 +34265,6 @@
     <w:lvlOverride w:ilvl="8">
       <w:startOverride w:val="1"/>
     </w:lvlOverride>
-  </w:num>
-  <w:num w:numId="1015">
-    <w:abstractNumId w:val="991"/>
   </w:num>
   <w:num w:numId="1016">
     <w:abstractNumId w:val="991"/>
@@ -34204,6 +34360,9 @@
     <w:abstractNumId w:val="991"/>
   </w:num>
   <w:num w:numId="1047">
+    <w:abstractNumId w:val="991"/>
+  </w:num>
+  <w:num w:numId="1048">
     <w:abstractNumId w:val="99411"/>
     <w:lvlOverride w:ilvl="0">
       <w:startOverride w:val="1"/>
@@ -34233,7 +34392,7 @@
       <w:startOverride w:val="1"/>
     </w:lvlOverride>
   </w:num>
-  <w:num w:numId="1048">
+  <w:num w:numId="1049">
     <w:abstractNumId w:val="99411"/>
     <w:lvlOverride w:ilvl="0">
       <w:startOverride w:val="1"/>

</xml_diff>

<commit_message>
Fracture Lines: call the region below the corridors the deep fold, not the deep metric
Co-Authored-By: Claude Opus 5.5 <noreply@anthropic.com>
Claude-Session: https://claude.ai/code/session_015SADCFzhKijkC2foUmXrpC
</commit_message>
<xml_diff>
--- a/legend-dynamics/spaceopera/Fracture_Lines_Players_Guide.docx
+++ b/legend-dynamics/spaceopera/Fracture_Lines_Players_Guide.docx
@@ -13240,7 +13240,7 @@
           <w:bCs/>
           <w:b/>
         </w:rPr>
-        <w:t xml:space="preserve">deep metric</w:t>
+        <w:t xml:space="preserve">deep fold</w:t>
       </w:r>
       <w:r>
         <w:t xml:space="preserve">, where two points hundreds or thousands of light-years apart in ordinary space may be very close indeed.</w:t>
@@ -13286,13 +13286,13 @@
       </w:r>
     </w:p>
     <w:bookmarkEnd w:id="80"/>
-    <w:bookmarkStart w:id="85" w:name="deep-metric-communication"/>
+    <w:bookmarkStart w:id="85" w:name="communication-through-the-deep-fold"/>
     <w:p>
       <w:pPr>
         <w:pStyle w:val="Heading2"/>
       </w:pPr>
       <w:r>
-        <w:t xml:space="preserve">Deep-metric communication</w:t>
+        <w:t xml:space="preserve">Communication through the deep fold</w:t>
       </w:r>
     </w:p>
     <w:p>
@@ -13317,7 +13317,7 @@
         <w:pStyle w:val="FirstParagraph"/>
       </w:pPr>
       <w:r>
-        <w:t xml:space="preserve">Quantum entanglement alone cannot transmit information. This remains true even for civilizations thousands of years more technologically advanced than humanity. The breakthrough comes from combining quantum systems with the deep metric.</w:t>
+        <w:t xml:space="preserve">Quantum entanglement alone cannot transmit information. This remains true even for civilizations thousands of years more technologically advanced than humanity. The breakthrough comes from combining quantum systems with the deep fold.</w:t>
       </w:r>
     </w:p>
     <w:p>
@@ -13325,7 +13325,7 @@
         <w:pStyle w:val="BodyText"/>
       </w:pPr>
       <w:r>
-        <w:t xml:space="preserve">Specialized transmitters generate precisely controlled quantum states coupled to minute gravimetric disturbances. Under the correct conditions, these disturbances enter a propagating mode within the deep metric. The entangled quantum systems provide synchronization, discrimination and extreme sensitivity. The</w:t>
+        <w:t xml:space="preserve">Specialized transmitters generate precisely controlled quantum states coupled to minute gravimetric disturbances. Under the correct conditions, these disturbances enter a propagating mode within the deep fold. The entangled quantum systems provide synchronization, discrimination and extreme sensitivity. The</w:t>
       </w:r>
       <w:r>
         <w:t xml:space="preserve"> </w:t>
@@ -13364,7 +13364,7 @@
         <w:pStyle w:val="FirstParagraph"/>
       </w:pPr>
       <w:r>
-        <w:t xml:space="preserve">Humanity discovered corridor travel through comparatively large-scale manipulation of spacetime. Human drives could detect corridors, create the fields necessary to enter them and protect spacecraft against their stresses. None of this required access to the deep metric.</w:t>
+        <w:t xml:space="preserve">Humanity discovered corridor travel through comparatively large-scale manipulation of spacetime. Human drives could detect corridors, create the fields necessary to enter them and protect spacecraft against their stresses. None of this required access to the deep fold.</w:t>
       </w:r>
     </w:p>
     <w:p>
@@ -13458,7 +13458,7 @@
         <w:pStyle w:val="FirstParagraph"/>
       </w:pPr>
       <w:r>
-        <w:t xml:space="preserve">Deep-metric signals do not propagate equally well everywhere. They follow the underlying geometry of the corridors and converge on major junctions, so the transportation map of known space is also, broadly, its communications map. A junction has three kinds of strategic value:</w:t>
+        <w:t xml:space="preserve">Quantum-gravimetric signals do not propagate equally well everywhere. They follow the underlying geometry of the corridors and converge on major junctions, so the transportation map of known space is also, broadly, its communications map. A junction has three kinds of strategic value:</w:t>
       </w:r>
     </w:p>
     <w:p>
@@ -13502,7 +13502,7 @@
         <w:t xml:space="preserve"> </w:t>
       </w:r>
       <w:r>
-        <w:t xml:space="preserve">Deep-metric traffic naturally converges on it.</w:t>
+        <w:t xml:space="preserve">Message traffic naturally converges on it.</w:t>
       </w:r>
     </w:p>
     <w:p>
@@ -13688,7 +13688,7 @@
         <w:t xml:space="preserve"> </w:t>
       </w:r>
       <w:r>
-        <w:t xml:space="preserve">A deep-metric transceiver reaches anywhere on the network: within a junction’s region in minutes, across several junctions in hours. Worlds behind collapsed corridors can’t be reached at all. Every message passes through junctions, and their owners listen: sending something sensitive through a hostile junction takes a</w:t>
+        <w:t xml:space="preserve">A quantum-gravimetric transceiver reaches anywhere on the network: within a junction’s region in minutes, across several junctions in hours. Worlds behind collapsed corridors can’t be reached at all. Every message passes through junctions, and their owners listen: sending something sensitive through a hostile junction takes a</w:t>
       </w:r>
       <w:r>
         <w:t xml:space="preserve"> </w:t>

</xml_diff>

<commit_message>
Grievous wounds for every setting
The Shattered Crown, Fracture Lines and Aurora get their own grievous wound
tables and taken-out descriptions (spells, energy weapons, powers), so the
gritty combat switch and its guide section appear in every creator.

Co-Authored-By: Claude Opus 5.5 <noreply@anthropic.com>
Claude-Session: https://claude.ai/code/session_015SADCFzhKijkC2foUmXrpC
</commit_message>
<xml_diff>
--- a/legend-dynamics/spaceopera/Fracture_Lines_Players_Guide.docx
+++ b/legend-dynamics/spaceopera/Fracture_Lines_Players_Guide.docx
@@ -9097,7 +9097,7 @@
     </w:p>
     <w:bookmarkEnd w:id="48"/>
     <w:bookmarkEnd w:id="49"/>
-    <w:bookmarkStart w:id="58" w:name="personal-combat"/>
+    <w:bookmarkStart w:id="59" w:name="personal-combat"/>
     <w:p>
       <w:pPr>
         <w:pStyle w:val="Heading1"/>
@@ -10151,7 +10151,7 @@
       </w:r>
     </w:p>
     <w:bookmarkEnd w:id="53"/>
-    <w:bookmarkStart w:id="55" w:name="injury"/>
+    <w:bookmarkStart w:id="56" w:name="injury"/>
     <w:p>
       <w:pPr>
         <w:pStyle w:val="Heading2"/>
@@ -10553,14 +10553,13 @@
       </w:r>
     </w:p>
     <w:bookmarkEnd w:id="54"/>
-    <w:bookmarkEnd w:id="55"/>
-    <w:bookmarkStart w:id="56" w:name="weapons-and-damage"/>
-    <w:p>
-      <w:pPr>
-        <w:pStyle w:val="Heading2"/>
-      </w:pPr>
-      <w:r>
-        <w:t xml:space="preserve">Weapons and damage</w:t>
+    <w:bookmarkStart w:id="55" w:name="optional-rule-gritty-combat"/>
+    <w:p>
+      <w:pPr>
+        <w:pStyle w:val="Heading3"/>
+      </w:pPr>
+      <w:r>
+        <w:t xml:space="preserve">Optional rule: gritty combat</w:t>
       </w:r>
     </w:p>
     <w:p>
@@ -10568,7 +10567,7 @@
         <w:pStyle w:val="FirstParagraph"/>
       </w:pPr>
       <w:r>
-        <w:t xml:space="preserve">How many boxes a hit marks depends on the</w:t>
+        <w:t xml:space="preserve">For a harder, bloodier game, the GM can turn on</w:t>
       </w:r>
       <w:r>
         <w:t xml:space="preserve"> </w:t>
@@ -10578,10 +10577,168 @@
           <w:bCs/>
           <w:b/>
         </w:rPr>
-        <w:t xml:space="preserve">weapon</w:t>
-      </w:r>
-      <w:r>
-        <w:t xml:space="preserve">, not on how well the attack succeeded.</w:t>
+        <w:t xml:space="preserve">gritty combat</w:t>
+      </w:r>
+      <w:r>
+        <w:t xml:space="preserve"> </w:t>
+      </w:r>
+      <w:r>
+        <w:t xml:space="preserve">for the campaign (the creator has a switch on the Condition card and in the GM view). The rest of the rules stay the same.</w:t>
+      </w:r>
+    </w:p>
+    <w:p>
+      <w:pPr>
+        <w:pStyle w:val="BodyText"/>
+      </w:pPr>
+      <w:r>
+        <w:rPr>
+          <w:bCs/>
+          <w:b/>
+        </w:rPr>
+        <w:t xml:space="preserve">Grievous hits.</w:t>
+      </w:r>
+      <w:r>
+        <w:t xml:space="preserve"> </w:t>
+      </w:r>
+      <w:r>
+        <w:t xml:space="preserve">A hit that marks</w:t>
+      </w:r>
+      <w:r>
+        <w:t xml:space="preserve"> </w:t>
+      </w:r>
+      <w:r>
+        <w:rPr>
+          <w:bCs/>
+          <w:b/>
+        </w:rPr>
+        <w:t xml:space="preserve">2 or more boxes</w:t>
+      </w:r>
+      <w:r>
+        <w:t xml:space="preserve"> </w:t>
+      </w:r>
+      <w:r>
+        <w:t xml:space="preserve">is</w:t>
+      </w:r>
+      <w:r>
+        <w:t xml:space="preserve"> </w:t>
+      </w:r>
+      <w:r>
+        <w:rPr>
+          <w:bCs/>
+          <w:b/>
+        </w:rPr>
+        <w:t xml:space="preserve">grievous</w:t>
+      </w:r>
+      <w:r>
+        <w:t xml:space="preserve"> </w:t>
+      </w:r>
+      <w:r>
+        <w:t xml:space="preserve">when the attack succeeded by</w:t>
+      </w:r>
+      <w:r>
+        <w:t xml:space="preserve"> </w:t>
+      </w:r>
+      <w:r>
+        <w:rPr>
+          <w:bCs/>
+          <w:b/>
+        </w:rPr>
+        <w:t xml:space="preserve">7 or more</w:t>
+      </w:r>
+      <w:r>
+        <w:t xml:space="preserve">, rolled a</w:t>
+      </w:r>
+      <w:r>
+        <w:t xml:space="preserve"> </w:t>
+      </w:r>
+      <w:r>
+        <w:rPr>
+          <w:bCs/>
+          <w:b/>
+        </w:rPr>
+        <w:t xml:space="preserve">natural 3 or 4</w:t>
+      </w:r>
+      <w:r>
+        <w:t xml:space="preserve">, or left the target</w:t>
+      </w:r>
+      <w:r>
+        <w:t xml:space="preserve"> </w:t>
+      </w:r>
+      <w:r>
+        <w:rPr>
+          <w:bCs/>
+          <w:b/>
+        </w:rPr>
+        <w:t xml:space="preserve">Dying</w:t>
+      </w:r>
+      <w:r>
+        <w:t xml:space="preserve">.</w:t>
+      </w:r>
+    </w:p>
+    <w:p>
+      <w:pPr>
+        <w:numPr>
+          <w:ilvl w:val="0"/>
+          <w:numId w:val="1011"/>
+        </w:numPr>
+        <w:pStyle w:val="Compact"/>
+      </w:pPr>
+      <w:r>
+        <w:rPr>
+          <w:bCs/>
+          <w:b/>
+        </w:rPr>
+        <w:t xml:space="preserve">A character</w:t>
+      </w:r>
+      <w:r>
+        <w:t xml:space="preserve"> </w:t>
+      </w:r>
+      <w:r>
+        <w:t xml:space="preserve">rolls 3d6 on the table below and suffers the result on top of the boxes.</w:t>
+      </w:r>
+    </w:p>
+    <w:p>
+      <w:pPr>
+        <w:numPr>
+          <w:ilvl w:val="0"/>
+          <w:numId w:val="1011"/>
+        </w:numPr>
+        <w:pStyle w:val="Compact"/>
+      </w:pPr>
+      <w:r>
+        <w:rPr>
+          <w:bCs/>
+          <w:b/>
+        </w:rPr>
+        <w:t xml:space="preserve">An opponent</w:t>
+      </w:r>
+      <w:r>
+        <w:t xml:space="preserve"> </w:t>
+      </w:r>
+      <w:r>
+        <w:t xml:space="preserve">is simply taken out: no roll, no boxes to count. Describe how, or let the GM view roll a description.</w:t>
+      </w:r>
+    </w:p>
+    <w:p>
+      <w:pPr>
+        <w:numPr>
+          <w:ilvl w:val="0"/>
+          <w:numId w:val="1011"/>
+        </w:numPr>
+        <w:pStyle w:val="Compact"/>
+      </w:pPr>
+      <w:r>
+        <w:rPr>
+          <w:bCs/>
+          <w:b/>
+        </w:rPr>
+        <w:t xml:space="preserve">With a telling hit,</w:t>
+      </w:r>
+      <w:r>
+        <w:t xml:space="preserve"> </w:t>
+      </w:r>
+      <w:r>
+        <w:t xml:space="preserve">the attacker also chooses which limb.</w:t>
       </w:r>
     </w:p>
     <w:tbl>
@@ -10623,6 +10780,610 @@
                 <w:b/>
                 <w:sz w:val="19"/>
               </w:rPr>
+              <w:t xml:space="preserve">3d6</w:t>
+            </w:r>
+          </w:p>
+        </w:tc>
+        <w:tc>
+          <w:tcPr>
+            <w:shd w:val="clear" w:fill="E9EEF6"/>
+          </w:tcPr>
+          <w:p>
+            <w:pPr>
+              <w:pStyle w:val="Compact"/>
+              <w:jc w:val="left"/>
+            </w:pPr>
+            <w:r>
+              <w:rPr>
+                <w:b/>
+                <w:sz w:val="19"/>
+              </w:rPr>
+              <w:t xml:space="preserve">Grievous wound</w:t>
+            </w:r>
+          </w:p>
+        </w:tc>
+        <w:tc>
+          <w:tcPr>
+            <w:shd w:val="clear" w:fill="E9EEF6"/>
+          </w:tcPr>
+          <w:p>
+            <w:pPr>
+              <w:pStyle w:val="Compact"/>
+              <w:jc w:val="left"/>
+            </w:pPr>
+            <w:r>
+              <w:rPr>
+                <w:b/>
+                <w:sz w:val="19"/>
+              </w:rPr>
+              <w:t xml:space="preserve">Effect</w:t>
+            </w:r>
+          </w:p>
+        </w:tc>
+        <w:tc>
+          <w:tcPr>
+            <w:shd w:val="clear" w:fill="E9EEF6"/>
+          </w:tcPr>
+          <w:p>
+            <w:pPr>
+              <w:pStyle w:val="Compact"/>
+              <w:jc w:val="left"/>
+            </w:pPr>
+            <w:r>
+              <w:rPr>
+                <w:b/>
+                <w:sz w:val="19"/>
+              </w:rPr>
+              <w:t xml:space="preserve">Heals</w:t>
+            </w:r>
+          </w:p>
+        </w:tc>
+      </w:tr>
+      <w:tr>
+        <w:tc>
+          <w:tcPr/>
+          <w:p>
+            <w:pPr>
+              <w:pStyle w:val="Compact"/>
+              <w:jc w:val="left"/>
+            </w:pPr>
+            <w:r>
+              <w:rPr>
+                <w:b/>
+                <w:sz w:val="19"/>
+              </w:rPr>
+              <w:t xml:space="preserve">3–4</w:t>
+            </w:r>
+          </w:p>
+        </w:tc>
+        <w:tc>
+          <w:tcPr/>
+          <w:p>
+            <w:pPr>
+              <w:pStyle w:val="Compact"/>
+              <w:jc w:val="left"/>
+            </w:pPr>
+            <w:r>
+              <w:rPr>
+                <w:sz w:val="19"/>
+              </w:rPr>
+              <w:t xml:space="preserve">Lost limb</w:t>
+            </w:r>
+          </w:p>
+        </w:tc>
+        <w:tc>
+          <w:tcPr/>
+          <w:p>
+            <w:pPr>
+              <w:pStyle w:val="Compact"/>
+              <w:jc w:val="left"/>
+            </w:pPr>
+            <w:r>
+              <w:rPr>
+                <w:sz w:val="19"/>
+              </w:rPr>
+              <w:t xml:space="preserve">A hand, an arm or a leg is gone for good; the GM says which. −4 to tasks that need it, or impossible. Dying unless someone stops the bleeding. A prosthetic or cybernetic replacement can restore it, at a price.</w:t>
+            </w:r>
+          </w:p>
+        </w:tc>
+        <w:tc>
+          <w:tcPr/>
+          <w:p>
+            <w:pPr>
+              <w:pStyle w:val="Compact"/>
+              <w:jc w:val="left"/>
+            </w:pPr>
+            <w:r>
+              <w:rPr>
+                <w:sz w:val="19"/>
+              </w:rPr>
+              <w:t xml:space="preserve">Never: a complication</w:t>
+            </w:r>
+          </w:p>
+        </w:tc>
+      </w:tr>
+      <w:tr>
+        <w:tc>
+          <w:tcPr/>
+          <w:p>
+            <w:pPr>
+              <w:pStyle w:val="Compact"/>
+              <w:jc w:val="left"/>
+            </w:pPr>
+            <w:r>
+              <w:rPr>
+                <w:b/>
+                <w:sz w:val="19"/>
+              </w:rPr>
+              <w:t xml:space="preserve">5–6</w:t>
+            </w:r>
+          </w:p>
+        </w:tc>
+        <w:tc>
+          <w:tcPr/>
+          <w:p>
+            <w:pPr>
+              <w:pStyle w:val="Compact"/>
+              <w:jc w:val="left"/>
+            </w:pPr>
+            <w:r>
+              <w:rPr>
+                <w:sz w:val="19"/>
+              </w:rPr>
+              <w:t xml:space="preserve">Lost eye</w:t>
+            </w:r>
+          </w:p>
+        </w:tc>
+        <w:tc>
+          <w:tcPr/>
+          <w:p>
+            <w:pPr>
+              <w:pStyle w:val="Compact"/>
+              <w:jc w:val="left"/>
+            </w:pPr>
+            <w:r>
+              <w:rPr>
+                <w:sz w:val="19"/>
+              </w:rPr>
+              <w:t xml:space="preserve">−2 to Firearms and to spotting things, until a cybernetic or cloned eye replaces it.</w:t>
+            </w:r>
+          </w:p>
+        </w:tc>
+        <w:tc>
+          <w:tcPr/>
+          <w:p>
+            <w:pPr>
+              <w:pStyle w:val="Compact"/>
+              <w:jc w:val="left"/>
+            </w:pPr>
+            <w:r>
+              <w:rPr>
+                <w:sz w:val="19"/>
+              </w:rPr>
+              <w:t xml:space="preserve">Never: a complication</w:t>
+            </w:r>
+          </w:p>
+        </w:tc>
+      </w:tr>
+      <w:tr>
+        <w:tc>
+          <w:tcPr/>
+          <w:p>
+            <w:pPr>
+              <w:pStyle w:val="Compact"/>
+              <w:jc w:val="left"/>
+            </w:pPr>
+            <w:r>
+              <w:rPr>
+                <w:b/>
+                <w:sz w:val="19"/>
+              </w:rPr>
+              <w:t xml:space="preserve">7–9</w:t>
+            </w:r>
+          </w:p>
+        </w:tc>
+        <w:tc>
+          <w:tcPr/>
+          <w:p>
+            <w:pPr>
+              <w:pStyle w:val="Compact"/>
+              <w:jc w:val="left"/>
+            </w:pPr>
+            <w:r>
+              <w:rPr>
+                <w:sz w:val="19"/>
+              </w:rPr>
+              <w:t xml:space="preserve">Broken bone</w:t>
+            </w:r>
+          </w:p>
+        </w:tc>
+        <w:tc>
+          <w:tcPr/>
+          <w:p>
+            <w:pPr>
+              <w:pStyle w:val="Compact"/>
+              <w:jc w:val="left"/>
+            </w:pPr>
+            <w:r>
+              <w:rPr>
+                <w:sz w:val="19"/>
+              </w:rPr>
+              <w:t xml:space="preserve">The limb is useless until it’s set with proper care.</w:t>
+            </w:r>
+          </w:p>
+        </w:tc>
+        <w:tc>
+          <w:tcPr/>
+          <w:p>
+            <w:pPr>
+              <w:pStyle w:val="Compact"/>
+              <w:jc w:val="left"/>
+            </w:pPr>
+            <w:r>
+              <w:rPr>
+                <w:sz w:val="19"/>
+              </w:rPr>
+              <w:t xml:space="preserve">Several weeks</w:t>
+            </w:r>
+          </w:p>
+        </w:tc>
+      </w:tr>
+      <w:tr>
+        <w:tc>
+          <w:tcPr/>
+          <w:p>
+            <w:pPr>
+              <w:pStyle w:val="Compact"/>
+              <w:jc w:val="left"/>
+            </w:pPr>
+            <w:r>
+              <w:rPr>
+                <w:b/>
+                <w:sz w:val="19"/>
+              </w:rPr>
+              <w:t xml:space="preserve">10–12</w:t>
+            </w:r>
+          </w:p>
+        </w:tc>
+        <w:tc>
+          <w:tcPr/>
+          <w:p>
+            <w:pPr>
+              <w:pStyle w:val="Compact"/>
+              <w:jc w:val="left"/>
+            </w:pPr>
+            <w:r>
+              <w:rPr>
+                <w:sz w:val="19"/>
+              </w:rPr>
+              <w:t xml:space="preserve">Torn muscle</w:t>
+            </w:r>
+          </w:p>
+        </w:tc>
+        <w:tc>
+          <w:tcPr/>
+          <w:p>
+            <w:pPr>
+              <w:pStyle w:val="Compact"/>
+              <w:jc w:val="left"/>
+            </w:pPr>
+            <w:r>
+              <w:rPr>
+                <w:sz w:val="19"/>
+              </w:rPr>
+              <w:t xml:space="preserve">−1 to physical tasks.</w:t>
+            </w:r>
+          </w:p>
+        </w:tc>
+        <w:tc>
+          <w:tcPr/>
+          <w:p>
+            <w:pPr>
+              <w:pStyle w:val="Compact"/>
+              <w:jc w:val="left"/>
+            </w:pPr>
+            <w:r>
+              <w:rPr>
+                <w:sz w:val="19"/>
+              </w:rPr>
+              <w:t xml:space="preserve">Several weeks</w:t>
+            </w:r>
+          </w:p>
+        </w:tc>
+      </w:tr>
+      <w:tr>
+        <w:tc>
+          <w:tcPr/>
+          <w:p>
+            <w:pPr>
+              <w:pStyle w:val="Compact"/>
+              <w:jc w:val="left"/>
+            </w:pPr>
+            <w:r>
+              <w:rPr>
+                <w:b/>
+                <w:sz w:val="19"/>
+              </w:rPr>
+              <w:t xml:space="preserve">13–15</w:t>
+            </w:r>
+          </w:p>
+        </w:tc>
+        <w:tc>
+          <w:tcPr/>
+          <w:p>
+            <w:pPr>
+              <w:pStyle w:val="Compact"/>
+              <w:jc w:val="left"/>
+            </w:pPr>
+            <w:r>
+              <w:rPr>
+                <w:sz w:val="19"/>
+              </w:rPr>
+              <w:t xml:space="preserve">Concussion</w:t>
+            </w:r>
+          </w:p>
+        </w:tc>
+        <w:tc>
+          <w:tcPr/>
+          <w:p>
+            <w:pPr>
+              <w:pStyle w:val="Compact"/>
+              <w:jc w:val="left"/>
+            </w:pPr>
+            <w:r>
+              <w:rPr>
+                <w:sz w:val="19"/>
+              </w:rPr>
+              <w:t xml:space="preserve">Stunned, and −2 to thinking tasks for the scene.</w:t>
+            </w:r>
+          </w:p>
+        </w:tc>
+        <w:tc>
+          <w:tcPr/>
+          <w:p>
+            <w:pPr>
+              <w:pStyle w:val="Compact"/>
+              <w:jc w:val="left"/>
+            </w:pPr>
+            <w:r>
+              <w:rPr>
+                <w:sz w:val="19"/>
+              </w:rPr>
+              <w:t xml:space="preserve">After the scene</w:t>
+            </w:r>
+          </w:p>
+        </w:tc>
+      </w:tr>
+      <w:tr>
+        <w:tc>
+          <w:tcPr/>
+          <w:p>
+            <w:pPr>
+              <w:pStyle w:val="Compact"/>
+              <w:jc w:val="left"/>
+            </w:pPr>
+            <w:r>
+              <w:rPr>
+                <w:b/>
+                <w:sz w:val="19"/>
+              </w:rPr>
+              <w:t xml:space="preserve">16–18</w:t>
+            </w:r>
+          </w:p>
+        </w:tc>
+        <w:tc>
+          <w:tcPr/>
+          <w:p>
+            <w:pPr>
+              <w:pStyle w:val="Compact"/>
+              <w:jc w:val="left"/>
+            </w:pPr>
+            <w:r>
+              <w:rPr>
+                <w:sz w:val="19"/>
+              </w:rPr>
+              <w:t xml:space="preserve">Internal injury</w:t>
+            </w:r>
+          </w:p>
+        </w:tc>
+        <w:tc>
+          <w:tcPr/>
+          <w:p>
+            <w:pPr>
+              <w:pStyle w:val="Compact"/>
+              <w:jc w:val="left"/>
+            </w:pPr>
+            <w:r>
+              <w:rPr>
+                <w:sz w:val="19"/>
+              </w:rPr>
+              <w:t xml:space="preserve">Dying even with boxes to spare; it needs a med-bay or a clinic’s surgeons.</w:t>
+            </w:r>
+          </w:p>
+        </w:tc>
+        <w:tc>
+          <w:tcPr/>
+          <w:p>
+            <w:pPr>
+              <w:pStyle w:val="Compact"/>
+              <w:jc w:val="left"/>
+            </w:pPr>
+            <w:r>
+              <w:rPr>
+                <w:sz w:val="19"/>
+              </w:rPr>
+              <w:t xml:space="preserve">Several weeks after surgery</w:t>
+            </w:r>
+          </w:p>
+        </w:tc>
+      </w:tr>
+    </w:tbl>
+    <w:p>
+      <w:pPr>
+        <w:numPr>
+          <w:ilvl w:val="0"/>
+          <w:numId w:val="1012"/>
+        </w:numPr>
+        <w:pStyle w:val="Compact"/>
+      </w:pPr>
+      <w:r>
+        <w:rPr>
+          <w:bCs/>
+          <w:b/>
+        </w:rPr>
+        <w:t xml:space="preserve">Resolve.</w:t>
+      </w:r>
+      <w:r>
+        <w:t xml:space="preserve"> </w:t>
+      </w:r>
+      <w:r>
+        <w:t xml:space="preserve">Spend a Resolve point to</w:t>
+      </w:r>
+      <w:r>
+        <w:t xml:space="preserve"> </w:t>
+      </w:r>
+      <w:r>
+        <w:rPr>
+          <w:bCs/>
+          <w:b/>
+        </w:rPr>
+        <w:t xml:space="preserve">downgrade</w:t>
+      </w:r>
+      <w:r>
+        <w:t xml:space="preserve"> </w:t>
+      </w:r>
+      <w:r>
+        <w:t xml:space="preserve">a grievous wound one step: lost limb becomes broken bone; lost eye becomes concussion; broken bone becomes torn muscle; torn muscle becomes nothing lasting; concussion becomes nothing lasting; internal injury becomes torn muscle.</w:t>
+      </w:r>
+    </w:p>
+    <w:p>
+      <w:pPr>
+        <w:numPr>
+          <w:ilvl w:val="0"/>
+          <w:numId w:val="1012"/>
+        </w:numPr>
+        <w:pStyle w:val="Compact"/>
+      </w:pPr>
+      <w:r>
+        <w:rPr>
+          <w:bCs/>
+          <w:b/>
+        </w:rPr>
+        <w:t xml:space="preserve">A limb for a life.</w:t>
+      </w:r>
+      <w:r>
+        <w:t xml:space="preserve"> </w:t>
+      </w:r>
+      <w:r>
+        <w:t xml:space="preserve">Once a fight, a character who would be left Dying or killed can</w:t>
+      </w:r>
+      <w:r>
+        <w:t xml:space="preserve"> </w:t>
+      </w:r>
+      <w:r>
+        <w:rPr>
+          <w:bCs/>
+          <w:b/>
+        </w:rPr>
+        <w:t xml:space="preserve">lose a limb, or the use of one</w:t>
+      </w:r>
+      <w:r>
+        <w:t xml:space="preserve">, instead. They live, Incapacitated but stable, and the limb becomes a complication. It replaces any grievous wound from the same hit.</w:t>
+      </w:r>
+    </w:p>
+    <w:p>
+      <w:pPr>
+        <w:numPr>
+          <w:ilvl w:val="0"/>
+          <w:numId w:val="1012"/>
+        </w:numPr>
+        <w:pStyle w:val="Compact"/>
+      </w:pPr>
+      <w:r>
+        <w:rPr>
+          <w:bCs/>
+          <w:b/>
+        </w:rPr>
+        <w:t xml:space="preserve">Healing.</w:t>
+      </w:r>
+      <w:r>
+        <w:t xml:space="preserve"> </w:t>
+      </w:r>
+      <w:r>
+        <w:t xml:space="preserve">Grievous wounds heal on their own clock, whatever the boxes say. A lost limb, a lost eye or a disfigurement never heals.</w:t>
+      </w:r>
+    </w:p>
+    <w:bookmarkEnd w:id="55"/>
+    <w:bookmarkEnd w:id="56"/>
+    <w:bookmarkStart w:id="57" w:name="weapons-and-damage"/>
+    <w:p>
+      <w:pPr>
+        <w:pStyle w:val="Heading2"/>
+      </w:pPr>
+      <w:r>
+        <w:t xml:space="preserve">Weapons and damage</w:t>
+      </w:r>
+    </w:p>
+    <w:p>
+      <w:pPr>
+        <w:pStyle w:val="FirstParagraph"/>
+      </w:pPr>
+      <w:r>
+        <w:t xml:space="preserve">How many boxes a hit marks depends on the</w:t>
+      </w:r>
+      <w:r>
+        <w:t xml:space="preserve"> </w:t>
+      </w:r>
+      <w:r>
+        <w:rPr>
+          <w:bCs/>
+          <w:b/>
+        </w:rPr>
+        <w:t xml:space="preserve">weapon</w:t>
+      </w:r>
+      <w:r>
+        <w:t xml:space="preserve">, not on how well the attack succeeded.</w:t>
+      </w:r>
+    </w:p>
+    <w:tbl>
+      <w:tblPr>
+        <w:tblStyle w:val="Table"/>
+        <w:tblW w:type="pct" w:w="5000"/>
+        <w:tblLook w:firstRow="1" w:lastRow="0" w:firstColumn="0" w:lastColumn="0" w:noHBand="0" w:noVBand="0" w:val="0020"/>
+        <w:jc w:val="start"/>
+        <w:tblBorders>
+          <w:top w:val="single" w:sz="4" w:color="B8C2D3"/>
+          <w:left w:val="single" w:sz="4" w:color="B8C2D3"/>
+          <w:bottom w:val="single" w:sz="4" w:color="B8C2D3"/>
+          <w:right w:val="single" w:sz="4" w:color="B8C2D3"/>
+          <w:insideH w:val="single" w:sz="4" w:color="B8C2D3"/>
+          <w:insideV w:val="single" w:sz="4" w:color="B8C2D3"/>
+        </w:tblBorders>
+      </w:tblPr>
+      <w:tblGrid>
+        <w:gridCol w:w="1980"/>
+        <w:gridCol w:w="1980"/>
+        <w:gridCol w:w="1980"/>
+        <w:gridCol w:w="1980"/>
+      </w:tblGrid>
+      <w:tr>
+        <w:trPr>
+          <w:tblHeader w:val="true"/>
+        </w:trPr>
+        <w:tc>
+          <w:tcPr>
+            <w:shd w:val="clear" w:fill="E9EEF6"/>
+          </w:tcPr>
+          <w:p>
+            <w:pPr>
+              <w:pStyle w:val="Compact"/>
+              <w:jc w:val="left"/>
+            </w:pPr>
+            <w:r>
+              <w:rPr>
+                <w:b/>
+                <w:sz w:val="19"/>
+              </w:rPr>
               <w:t xml:space="preserve">Weapon</w:t>
             </w:r>
           </w:p>
@@ -11562,8 +12323,8 @@
         <w:t xml:space="preserve">To take someone down without killing them, use fists, a baton, a grapple or a stunner.</w:t>
       </w:r>
     </w:p>
-    <w:bookmarkEnd w:id="56"/>
-    <w:bookmarkStart w:id="57" w:name="weapon-and-ammunition"/>
+    <w:bookmarkEnd w:id="57"/>
+    <w:bookmarkStart w:id="58" w:name="weapon-and-ammunition"/>
     <w:p>
       <w:pPr>
         <w:pStyle w:val="Heading2"/>
@@ -11994,7 +12755,7 @@
       <w:pPr>
         <w:numPr>
           <w:ilvl w:val="0"/>
-          <w:numId w:val="1011"/>
+          <w:numId w:val="1013"/>
         </w:numPr>
         <w:pStyle w:val="Compact"/>
       </w:pPr>
@@ -12016,7 +12777,7 @@
       <w:pPr>
         <w:numPr>
           <w:ilvl w:val="0"/>
-          <w:numId w:val="1011"/>
+          <w:numId w:val="1013"/>
         </w:numPr>
         <w:pStyle w:val="Compact"/>
       </w:pPr>
@@ -12038,7 +12799,7 @@
       <w:pPr>
         <w:numPr>
           <w:ilvl w:val="0"/>
-          <w:numId w:val="1011"/>
+          <w:numId w:val="1013"/>
         </w:numPr>
         <w:pStyle w:val="Compact"/>
       </w:pPr>
@@ -12056,9 +12817,9 @@
         <w:t xml:space="preserve">A natural 18 with this weapon also jams it: clearing it takes an action.</w:t>
       </w:r>
     </w:p>
-    <w:bookmarkEnd w:id="57"/>
     <w:bookmarkEnd w:id="58"/>
-    <w:bookmarkStart w:id="63" w:name="medical-care"/>
+    <w:bookmarkEnd w:id="59"/>
+    <w:bookmarkStart w:id="64" w:name="medical-care"/>
     <w:p>
       <w:pPr>
         <w:pStyle w:val="Heading1"/>
@@ -12091,7 +12852,7 @@
         <w:t xml:space="preserve">can grow a new organ, rebuild a limb or rewrite a disease, for those who can pay; a clinic with a biotech suite counts as proper care. Those who can’t pay get stims, staples and whatever the Relief Missions carry.</w:t>
       </w:r>
     </w:p>
-    <w:bookmarkStart w:id="59" w:name="diagnosis-and-stabilization"/>
+    <w:bookmarkStart w:id="60" w:name="diagnosis-and-stabilization"/>
     <w:p>
       <w:pPr>
         <w:pStyle w:val="Heading2"/>
@@ -12108,8 +12869,8 @@
         <w:t xml:space="preserve">Roll Medicine when the diagnosis is uncertain or an urgent treatment decision matters. Emergency stabilization takes one action and a successful Medicine roll with a medkit. It ends Dying and stops deterioration, but removes no boxes.</w:t>
       </w:r>
     </w:p>
-    <w:bookmarkEnd w:id="59"/>
-    <w:bookmarkStart w:id="60" w:name="field-treatment"/>
+    <w:bookmarkEnd w:id="60"/>
+    <w:bookmarkStart w:id="61" w:name="field-treatment"/>
     <w:p>
       <w:pPr>
         <w:pStyle w:val="Heading2"/>
@@ -12126,8 +12887,8 @@
         <w:t xml:space="preserve">With a medkit and several uninterrupted minutes, successful Medicine removes one injury box; success by 5 or more removes two. Each injury receives one field-treatment attempt; further attempts need changed circumstances.</w:t>
       </w:r>
     </w:p>
-    <w:bookmarkEnd w:id="60"/>
-    <w:bookmarkStart w:id="61" w:name="proper-care"/>
+    <w:bookmarkEnd w:id="61"/>
+    <w:bookmarkStart w:id="62" w:name="proper-care"/>
     <w:p>
       <w:pPr>
         <w:pStyle w:val="Heading2"/>
@@ -12144,8 +12905,8 @@
         <w:t xml:space="preserve">A clinic with a biotech suite grants +2 to Medicine. A successful treatment removes two boxes; success by 5 or more removes three. Allow the time the treatment requires.</w:t>
       </w:r>
     </w:p>
-    <w:bookmarkEnd w:id="61"/>
-    <w:bookmarkStart w:id="62" w:name="natural-recovery"/>
+    <w:bookmarkEnd w:id="62"/>
+    <w:bookmarkStart w:id="63" w:name="natural-recovery"/>
     <w:p>
       <w:pPr>
         <w:pStyle w:val="Heading2"/>
@@ -12330,9 +13091,9 @@
         <w:t xml:space="preserve">At three boxes, rest alone does nothing until someone has stabilized or treated you; after that, a week of rest in their care clears the first box. A successful treatment is faster. The times add up: from three boxes, rest alone takes about a week and a half to heal completely (a week, then three days, then a day).</w:t>
       </w:r>
     </w:p>
-    <w:bookmarkEnd w:id="62"/>
     <w:bookmarkEnd w:id="63"/>
-    <w:bookmarkStart w:id="67" w:name="resolve-points-and-tracks"/>
+    <w:bookmarkEnd w:id="64"/>
+    <w:bookmarkStart w:id="68" w:name="resolve-points-and-tracks"/>
     <w:p>
       <w:pPr>
         <w:pStyle w:val="Heading1"/>
@@ -12341,7 +13102,7 @@
         <w:t xml:space="preserve">Resolve points and tracks</w:t>
       </w:r>
     </w:p>
-    <w:bookmarkStart w:id="64" w:name="using-resolve-points"/>
+    <w:bookmarkStart w:id="65" w:name="using-resolve-points"/>
     <w:p>
       <w:pPr>
         <w:pStyle w:val="Heading2"/>
@@ -12559,8 +13320,8 @@
         <w:t xml:space="preserve">Gain one point when one of your complications creates a meaningful problem you accept, including a companion complication. You can decline the proposed complication without penalty.</w:t>
       </w:r>
     </w:p>
-    <w:bookmarkEnd w:id="64"/>
-    <w:bookmarkStart w:id="65" w:name="debt-heat-reputation-and-hull"/>
+    <w:bookmarkEnd w:id="65"/>
+    <w:bookmarkStart w:id="66" w:name="debt-heat-reputation-and-hull"/>
     <w:p>
       <w:pPr>
         <w:pStyle w:val="Heading2"/>
@@ -12655,7 +13416,7 @@
       <w:pPr>
         <w:numPr>
           <w:ilvl w:val="0"/>
-          <w:numId w:val="1012"/>
+          <w:numId w:val="1014"/>
         </w:numPr>
         <w:pStyle w:val="Compact"/>
       </w:pPr>
@@ -12677,7 +13438,7 @@
       <w:pPr>
         <w:numPr>
           <w:ilvl w:val="0"/>
-          <w:numId w:val="1012"/>
+          <w:numId w:val="1014"/>
         </w:numPr>
         <w:pStyle w:val="Compact"/>
       </w:pPr>
@@ -12967,8 +13728,8 @@
         </w:tc>
       </w:tr>
     </w:tbl>
-    <w:bookmarkEnd w:id="65"/>
-    <w:bookmarkStart w:id="66" w:name="advancement"/>
+    <w:bookmarkEnd w:id="66"/>
+    <w:bookmarkStart w:id="67" w:name="advancement"/>
     <w:p>
       <w:pPr>
         <w:pStyle w:val="Heading2"/>
@@ -13005,7 +13766,7 @@
       <w:pPr>
         <w:numPr>
           <w:ilvl w:val="0"/>
-          <w:numId w:val="1013"/>
+          <w:numId w:val="1015"/>
         </w:numPr>
         <w:pStyle w:val="Compact"/>
       </w:pPr>
@@ -13066,7 +13827,7 @@
       <w:pPr>
         <w:numPr>
           <w:ilvl w:val="0"/>
-          <w:numId w:val="1013"/>
+          <w:numId w:val="1015"/>
         </w:numPr>
         <w:pStyle w:val="Compact"/>
       </w:pPr>
@@ -13412,9 +14173,9 @@
         <w:t xml:space="preserve">Magic and powers grow the same way, at the costs their chapters give.</w:t>
       </w:r>
     </w:p>
-    <w:bookmarkEnd w:id="66"/>
     <w:bookmarkEnd w:id="67"/>
-    <w:bookmarkStart w:id="70" w:name="running-jobs-and-missions"/>
+    <w:bookmarkEnd w:id="68"/>
+    <w:bookmarkStart w:id="71" w:name="running-jobs-and-missions"/>
     <w:p>
       <w:pPr>
         <w:pStyle w:val="Heading1"/>
@@ -13423,7 +14184,7 @@
         <w:t xml:space="preserve">Running jobs and missions</w:t>
       </w:r>
     </w:p>
-    <w:bookmarkStart w:id="68" w:name="job-seeds"/>
+    <w:bookmarkStart w:id="69" w:name="job-seeds"/>
     <w:p>
       <w:pPr>
         <w:pStyle w:val="Heading2"/>
@@ -15655,8 +16416,8 @@
         </w:tc>
       </w:tr>
     </w:tbl>
-    <w:bookmarkEnd w:id="68"/>
-    <w:bookmarkStart w:id="69" w:name="the-crew-log"/>
+    <w:bookmarkEnd w:id="69"/>
+    <w:bookmarkStart w:id="70" w:name="the-crew-log"/>
     <w:p>
       <w:pPr>
         <w:pStyle w:val="Heading2"/>
@@ -15677,7 +16438,7 @@
       <w:pPr>
         <w:numPr>
           <w:ilvl w:val="0"/>
-          <w:numId w:val="1014"/>
+          <w:numId w:val="1016"/>
         </w:numPr>
         <w:pStyle w:val="Compact"/>
       </w:pPr>
@@ -15699,7 +16460,7 @@
       <w:pPr>
         <w:numPr>
           <w:ilvl w:val="0"/>
-          <w:numId w:val="1014"/>
+          <w:numId w:val="1016"/>
         </w:numPr>
         <w:pStyle w:val="Compact"/>
       </w:pPr>
@@ -15721,7 +16482,7 @@
       <w:pPr>
         <w:numPr>
           <w:ilvl w:val="0"/>
-          <w:numId w:val="1014"/>
+          <w:numId w:val="1016"/>
         </w:numPr>
         <w:pStyle w:val="Compact"/>
       </w:pPr>
@@ -15743,7 +16504,7 @@
       <w:pPr>
         <w:numPr>
           <w:ilvl w:val="0"/>
-          <w:numId w:val="1014"/>
+          <w:numId w:val="1016"/>
         </w:numPr>
         <w:pStyle w:val="Compact"/>
       </w:pPr>
@@ -15765,7 +16526,7 @@
       <w:pPr>
         <w:numPr>
           <w:ilvl w:val="0"/>
-          <w:numId w:val="1014"/>
+          <w:numId w:val="1016"/>
         </w:numPr>
         <w:pStyle w:val="Compact"/>
       </w:pPr>
@@ -15783,9 +16544,9 @@
         <w:t xml:space="preserve">After a significant job, each character earns 1 advancement point; at a milestone, 2 more.</w:t>
       </w:r>
     </w:p>
-    <w:bookmarkEnd w:id="69"/>
     <w:bookmarkEnd w:id="70"/>
-    <w:bookmarkStart w:id="78" w:name="a-galaxy-of-obligations"/>
+    <w:bookmarkEnd w:id="71"/>
+    <w:bookmarkStart w:id="79" w:name="a-galaxy-of-obligations"/>
     <w:p>
       <w:pPr>
         <w:pStyle w:val="Heading1"/>
@@ -15794,7 +16555,7 @@
         <w:t xml:space="preserve">A galaxy of obligations</w:t>
       </w:r>
     </w:p>
-    <w:bookmarkStart w:id="71" w:name="humanitys-first-contact"/>
+    <w:bookmarkStart w:id="72" w:name="humanitys-first-contact"/>
     <w:p>
       <w:pPr>
         <w:pStyle w:val="Heading2"/>
@@ -15877,8 +16638,8 @@
         <w:t xml:space="preserve">. The Kel call it a default.</w:t>
       </w:r>
     </w:p>
-    <w:bookmarkEnd w:id="71"/>
-    <w:bookmarkStart w:id="72" w:name="the-tessan-arrival"/>
+    <w:bookmarkEnd w:id="72"/>
+    <w:bookmarkStart w:id="73" w:name="the-tessan-arrival"/>
     <w:p>
       <w:pPr>
         <w:pStyle w:val="Heading2"/>
@@ -15916,8 +16677,8 @@
         <w:t xml:space="preserve">Rather than threaten humanity, the Tessan negotiated a settlement. Human captives were returned, losses were compensated, and the Tessan established themselves as cautious intermediaries between humanity and the wider interstellar community. It was humanity’s first introduction to the political and economic order beyond human space.</w:t>
       </w:r>
     </w:p>
-    <w:bookmarkEnd w:id="72"/>
-    <w:bookmarkStart w:id="73" w:name="the-humantessan-accord"/>
+    <w:bookmarkEnd w:id="73"/>
+    <w:bookmarkStart w:id="74" w:name="the-humantessan-accord"/>
     <w:p>
       <w:pPr>
         <w:pStyle w:val="Heading2"/>
@@ -15958,8 +16719,8 @@
         <w:t xml:space="preserve">The Accord opened the wider interstellar economy to humanity.</w:t>
       </w:r>
     </w:p>
-    <w:bookmarkEnd w:id="73"/>
-    <w:bookmarkStart w:id="74" w:name="humanity-enters-the-interstellar-economy"/>
+    <w:bookmarkEnd w:id="74"/>
+    <w:bookmarkStart w:id="75" w:name="humanity-enters-the-interstellar-economy"/>
     <w:p>
       <w:pPr>
         <w:pStyle w:val="Heading2"/>
@@ -15984,8 +16745,8 @@
         <w:t xml:space="preserve">Humans eagerly embraced these opportunities. Some sought wealth. Some sought knowledge. Some wanted new worlds. Some wanted to improve the lives of people they had never met. Frequently, all of those people traveled aboard the same ship.</w:t>
       </w:r>
     </w:p>
-    <w:bookmarkEnd w:id="74"/>
-    <w:bookmarkStart w:id="75" w:name="what-humanity-brought"/>
+    <w:bookmarkEnd w:id="75"/>
+    <w:bookmarkStart w:id="76" w:name="what-humanity-brought"/>
     <w:p>
       <w:pPr>
         <w:pStyle w:val="Heading2"/>
@@ -16018,8 +16779,8 @@
         <w:t xml:space="preserve">The Tessan opened the galaxy to humanity. Humanity, in turn, began changing the galaxy.</w:t>
       </w:r>
     </w:p>
-    <w:bookmarkEnd w:id="75"/>
-    <w:bookmarkStart w:id="76" w:name="the-human-reputation"/>
+    <w:bookmarkEnd w:id="76"/>
+    <w:bookmarkStart w:id="77" w:name="the-human-reputation"/>
     <w:p>
       <w:pPr>
         <w:pStyle w:val="Heading2"/>
@@ -16088,8 +16849,8 @@
         <w:t xml:space="preserve">, that contradiction is part of what it means to be human in a galaxy that is still deciding what to make of us.</w:t>
       </w:r>
     </w:p>
-    <w:bookmarkEnd w:id="76"/>
-    <w:bookmarkStart w:id="77" w:name="the-concord"/>
+    <w:bookmarkEnd w:id="77"/>
+    <w:bookmarkStart w:id="78" w:name="the-concord"/>
     <w:p>
       <w:pPr>
         <w:pStyle w:val="Heading2"/>
@@ -16122,9 +16883,9 @@
         <w:t xml:space="preserve">is humanity’s Earth-centered civilization: the oldest and largest of the human governments, and the one that signed the Accord. It is not the only one. Three centuries of expansion have produced independent colonies, corporate holdings, merchant leagues and political movements that answer to no one on Earth. Other peoples have their own polities, under their own names.</w:t>
       </w:r>
     </w:p>
-    <w:bookmarkEnd w:id="77"/>
     <w:bookmarkEnd w:id="78"/>
-    <w:bookmarkStart w:id="90" w:name="the-corridors"/>
+    <w:bookmarkEnd w:id="79"/>
+    <w:bookmarkStart w:id="91" w:name="the-corridors"/>
     <w:p>
       <w:pPr>
         <w:pStyle w:val="Heading1"/>
@@ -16154,7 +16915,7 @@
         <w:t xml:space="preserve">.</w:t>
       </w:r>
     </w:p>
-    <w:bookmarkStart w:id="79" w:name="what-the-corridors-are"/>
+    <w:bookmarkStart w:id="80" w:name="what-the-corridors-are"/>
     <w:p>
       <w:pPr>
         <w:pStyle w:val="Heading2"/>
@@ -16224,8 +16985,8 @@
         <w:t xml:space="preserve">Corridor mouths sit at gravitational balance points, often far out from the star. That is where the stations, toll gates, fortresses and Mandate checkpoints are built.</w:t>
       </w:r>
     </w:p>
-    <w:bookmarkEnd w:id="79"/>
-    <w:bookmarkStart w:id="80" w:name="off-the-corridors-the-metric-drive"/>
+    <w:bookmarkEnd w:id="80"/>
+    <w:bookmarkStart w:id="81" w:name="off-the-corridors-the-metric-drive"/>
     <w:p>
       <w:pPr>
         <w:pStyle w:val="Heading2"/>
@@ -16272,7 +17033,7 @@
       <w:pPr>
         <w:numPr>
           <w:ilvl w:val="0"/>
-          <w:numId w:val="1015"/>
+          <w:numId w:val="1017"/>
         </w:numPr>
         <w:pStyle w:val="Compact"/>
       </w:pPr>
@@ -16294,7 +17055,7 @@
       <w:pPr>
         <w:numPr>
           <w:ilvl w:val="0"/>
-          <w:numId w:val="1015"/>
+          <w:numId w:val="1017"/>
         </w:numPr>
         <w:pStyle w:val="Compact"/>
       </w:pPr>
@@ -16316,7 +17077,7 @@
       <w:pPr>
         <w:numPr>
           <w:ilvl w:val="0"/>
-          <w:numId w:val="1015"/>
+          <w:numId w:val="1017"/>
         </w:numPr>
         <w:pStyle w:val="Compact"/>
       </w:pPr>
@@ -16342,8 +17103,8 @@
         <w:t xml:space="preserve">The Vael know the drive’s limits better than anyone: their homeworld’s catastrophe struck hundreds of light-years from the nearest corridor, and even at three times light speed their escape took generations.</w:t>
       </w:r>
     </w:p>
-    <w:bookmarkEnd w:id="80"/>
-    <w:bookmarkStart w:id="81" w:name="depth"/>
+    <w:bookmarkEnd w:id="81"/>
+    <w:bookmarkStart w:id="82" w:name="depth"/>
     <w:p>
       <w:pPr>
         <w:pStyle w:val="Heading2"/>
@@ -16386,8 +17147,8 @@
         <w:t xml:space="preserve">, where two points hundreds or thousands of light-years apart in ordinary space may be very close indeed.</w:t>
       </w:r>
     </w:p>
-    <w:bookmarkEnd w:id="81"/>
-    <w:bookmarkStart w:id="82" w:name="drift-collapse-and-junctions"/>
+    <w:bookmarkEnd w:id="82"/>
+    <w:bookmarkStart w:id="83" w:name="drift-collapse-and-junctions"/>
     <w:p>
       <w:pPr>
         <w:pStyle w:val="Heading2"/>
@@ -16425,8 +17186,8 @@
         <w:t xml:space="preserve">, power gathers: every ship and every message between those regions must pass through.</w:t>
       </w:r>
     </w:p>
-    <w:bookmarkEnd w:id="82"/>
-    <w:bookmarkStart w:id="87" w:name="communication-through-the-deep-fold"/>
+    <w:bookmarkEnd w:id="83"/>
+    <w:bookmarkStart w:id="88" w:name="communication-through-the-deep-fold"/>
     <w:p>
       <w:pPr>
         <w:pStyle w:val="Heading2"/>
@@ -16443,7 +17204,7 @@
         <w:t xml:space="preserve">The civilizations of known space do not rely on conventional radio for interstellar communication. Instead, advanced societies exploit a phenomenon associated with the same hidden geometry that makes corridor travel possible.</w:t>
       </w:r>
     </w:p>
-    <w:bookmarkStart w:id="83" w:name="quantum-gravimetric-communication"/>
+    <w:bookmarkStart w:id="84" w:name="quantum-gravimetric-communication"/>
     <w:p>
       <w:pPr>
         <w:pStyle w:val="Heading3"/>
@@ -16489,8 +17250,8 @@
         <w:t xml:space="preserve">Consequently, quantum-gravimetric communication does not depend upon instantaneous communication through entanglement. The signal physically travels between transmitter and receiver, but through a region of spacetime in which the effective distance between the two points is enormously reduced. To observers limited to normal space, the result can appear to be faster-than-light communication.</w:t>
       </w:r>
     </w:p>
-    <w:bookmarkEnd w:id="83"/>
-    <w:bookmarkStart w:id="84" w:name="why-humanity-didnt-discover-it"/>
+    <w:bookmarkEnd w:id="84"/>
+    <w:bookmarkStart w:id="85" w:name="why-humanity-didnt-discover-it"/>
     <w:p>
       <w:pPr>
         <w:pStyle w:val="Heading3"/>
@@ -16533,8 +17294,8 @@
         <w:t xml:space="preserve">Humanity didn’t know the communications medium existed.</w:t>
       </w:r>
     </w:p>
-    <w:bookmarkEnd w:id="84"/>
-    <w:bookmarkStart w:id="85" w:name="the-antenna"/>
+    <w:bookmarkEnd w:id="85"/>
+    <w:bookmarkStart w:id="86" w:name="the-antenna"/>
     <w:p>
       <w:pPr>
         <w:pStyle w:val="Heading3"/>
@@ -16583,8 +17344,8 @@
         <w:t xml:space="preserve">Humanity had spent centuries listening for voices among the stars. The galaxy had never been silent. Humanity had simply been listening to the wrong part of the universe.</w:t>
       </w:r>
     </w:p>
-    <w:bookmarkEnd w:id="85"/>
-    <w:bookmarkStart w:id="86" w:name="the-network-is-the-map"/>
+    <w:bookmarkEnd w:id="86"/>
+    <w:bookmarkStart w:id="87" w:name="the-network-is-the-map"/>
     <w:p>
       <w:pPr>
         <w:pStyle w:val="Heading3"/>
@@ -16605,7 +17366,7 @@
       <w:pPr>
         <w:numPr>
           <w:ilvl w:val="0"/>
-          <w:numId w:val="1016"/>
+          <w:numId w:val="1018"/>
         </w:numPr>
         <w:pStyle w:val="Compact"/>
       </w:pPr>
@@ -16627,7 +17388,7 @@
       <w:pPr>
         <w:numPr>
           <w:ilvl w:val="0"/>
-          <w:numId w:val="1016"/>
+          <w:numId w:val="1018"/>
         </w:numPr>
         <w:pStyle w:val="Compact"/>
       </w:pPr>
@@ -16649,7 +17410,7 @@
       <w:pPr>
         <w:numPr>
           <w:ilvl w:val="0"/>
-          <w:numId w:val="1016"/>
+          <w:numId w:val="1018"/>
         </w:numPr>
         <w:pStyle w:val="Compact"/>
       </w:pPr>
@@ -16675,9 +17436,9 @@
         <w:t xml:space="preserve">Control of corridor intersections is one of the fundamental sources of political and economic power in known space. For civilizations such as the Tessan, power does not require conquest: control over contracts, debt, corridor access and communications can bind entire worlds without a Tessan soldier ever setting foot on them.</w:t>
       </w:r>
     </w:p>
-    <w:bookmarkEnd w:id="86"/>
     <w:bookmarkEnd w:id="87"/>
-    <w:bookmarkStart w:id="88" w:name="corridors-in-play"/>
+    <w:bookmarkEnd w:id="88"/>
+    <w:bookmarkStart w:id="89" w:name="corridors-in-play"/>
     <w:p>
       <w:pPr>
         <w:pStyle w:val="Heading2"/>
@@ -16690,7 +17451,7 @@
       <w:pPr>
         <w:numPr>
           <w:ilvl w:val="0"/>
-          <w:numId w:val="1017"/>
+          <w:numId w:val="1019"/>
         </w:numPr>
         <w:pStyle w:val="Compact"/>
       </w:pPr>
@@ -16725,7 +17486,7 @@
       <w:pPr>
         <w:numPr>
           <w:ilvl w:val="0"/>
-          <w:numId w:val="1017"/>
+          <w:numId w:val="1019"/>
         </w:numPr>
         <w:pStyle w:val="Compact"/>
       </w:pPr>
@@ -16747,7 +17508,7 @@
       <w:pPr>
         <w:numPr>
           <w:ilvl w:val="0"/>
-          <w:numId w:val="1017"/>
+          <w:numId w:val="1019"/>
         </w:numPr>
         <w:pStyle w:val="Compact"/>
       </w:pPr>
@@ -16769,7 +17530,7 @@
       <w:pPr>
         <w:numPr>
           <w:ilvl w:val="0"/>
-          <w:numId w:val="1017"/>
+          <w:numId w:val="1019"/>
         </w:numPr>
         <w:pStyle w:val="Compact"/>
       </w:pPr>
@@ -16791,7 +17552,7 @@
       <w:pPr>
         <w:numPr>
           <w:ilvl w:val="0"/>
-          <w:numId w:val="1017"/>
+          <w:numId w:val="1019"/>
         </w:numPr>
         <w:pStyle w:val="Compact"/>
       </w:pPr>
@@ -16813,7 +17574,7 @@
       <w:pPr>
         <w:numPr>
           <w:ilvl w:val="0"/>
-          <w:numId w:val="1017"/>
+          <w:numId w:val="1019"/>
         </w:numPr>
         <w:pStyle w:val="Compact"/>
       </w:pPr>
@@ -16864,7 +17625,7 @@
       <w:pPr>
         <w:numPr>
           <w:ilvl w:val="0"/>
-          <w:numId w:val="1017"/>
+          <w:numId w:val="1019"/>
         </w:numPr>
         <w:pStyle w:val="Compact"/>
       </w:pPr>
@@ -16895,8 +17656,8 @@
         <w:t xml:space="preserve">) and Mandate screenings.</w:t>
       </w:r>
     </w:p>
-    <w:bookmarkEnd w:id="88"/>
-    <w:bookmarkStart w:id="89" w:name="controlled-gear"/>
+    <w:bookmarkEnd w:id="89"/>
+    <w:bookmarkStart w:id="90" w:name="controlled-gear"/>
     <w:p>
       <w:pPr>
         <w:pStyle w:val="Heading2"/>
@@ -17459,7 +18220,7 @@
       <w:pPr>
         <w:numPr>
           <w:ilvl w:val="0"/>
-          <w:numId w:val="1018"/>
+          <w:numId w:val="1020"/>
         </w:numPr>
         <w:pStyle w:val="Compact"/>
       </w:pPr>
@@ -17549,7 +18310,7 @@
       <w:pPr>
         <w:numPr>
           <w:ilvl w:val="0"/>
-          <w:numId w:val="1018"/>
+          <w:numId w:val="1020"/>
         </w:numPr>
         <w:pStyle w:val="Compact"/>
       </w:pPr>
@@ -17615,9 +18376,9 @@
         <w:t xml:space="preserve">Edge.</w:t>
       </w:r>
     </w:p>
-    <w:bookmarkEnd w:id="89"/>
     <w:bookmarkEnd w:id="90"/>
-    <w:bookmarkStart w:id="96" w:name="ships-in-a-fight"/>
+    <w:bookmarkEnd w:id="91"/>
+    <w:bookmarkStart w:id="97" w:name="ships-in-a-fight"/>
     <w:p>
       <w:pPr>
         <w:pStyle w:val="Heading1"/>
@@ -17634,7 +18395,7 @@
         <w:t xml:space="preserve">Most crews would rather run than fight, and most fights between ships are short. These rules keep them fast: one roll per station, each exchange.</w:t>
       </w:r>
     </w:p>
-    <w:bookmarkStart w:id="91" w:name="range-in-space"/>
+    <w:bookmarkStart w:id="92" w:name="range-in-space"/>
     <w:p>
       <w:pPr>
         <w:pStyle w:val="Heading2"/>
@@ -18005,8 +18766,8 @@
         <w:t xml:space="preserve">contest. The winner may shift the range one band, in or out. A ship that wins at Extreme range by 5 or more can break contact and run for a corridor mouth or a metric jump.</w:t>
       </w:r>
     </w:p>
-    <w:bookmarkEnd w:id="91"/>
-    <w:bookmarkStart w:id="92" w:name="ship-weapons"/>
+    <w:bookmarkEnd w:id="92"/>
+    <w:bookmarkStart w:id="93" w:name="ship-weapons"/>
     <w:p>
       <w:pPr>
         <w:pStyle w:val="Heading2"/>
@@ -18455,8 +19216,8 @@
         </w:tc>
       </w:tr>
     </w:tbl>
-    <w:bookmarkEnd w:id="92"/>
-    <w:bookmarkStart w:id="93" w:name="the-exchange"/>
+    <w:bookmarkEnd w:id="93"/>
+    <w:bookmarkStart w:id="94" w:name="the-exchange"/>
     <w:p>
       <w:pPr>
         <w:pStyle w:val="Heading2"/>
@@ -19091,8 +19852,8 @@
         <w:t xml:space="preserve">A captain who takes an order doesn’t also work a station that exchange. Commanding well is the job.</w:t>
       </w:r>
     </w:p>
-    <w:bookmarkEnd w:id="93"/>
-    <w:bookmarkStart w:id="94" w:name="hull"/>
+    <w:bookmarkEnd w:id="94"/>
+    <w:bookmarkStart w:id="95" w:name="hull"/>
     <w:p>
       <w:pPr>
         <w:pStyle w:val="Heading2"/>
@@ -19378,8 +20139,8 @@
         <w:t xml:space="preserve">a dock clears the whole track; in the field an engineer patches one box a fight, and a full day’s work clears one more.</w:t>
       </w:r>
     </w:p>
-    <w:bookmarkEnd w:id="94"/>
-    <w:bookmarkStart w:id="95" w:name="enemy-ships"/>
+    <w:bookmarkEnd w:id="95"/>
+    <w:bookmarkStart w:id="96" w:name="enemy-ships"/>
     <w:p>
       <w:pPr>
         <w:pStyle w:val="Heading2"/>
@@ -20058,9 +20819,9 @@
         </w:tc>
       </w:tr>
     </w:tbl>
-    <w:bookmarkEnd w:id="95"/>
     <w:bookmarkEnd w:id="96"/>
-    <w:bookmarkStart w:id="126" w:name="peoples-of-the-corridors"/>
+    <w:bookmarkEnd w:id="97"/>
+    <w:bookmarkStart w:id="127" w:name="peoples-of-the-corridors"/>
     <w:p>
       <w:pPr>
         <w:pStyle w:val="Heading1"/>
@@ -20106,7 +20867,7 @@
         <w:t xml:space="preserve">chapter.</w:t>
       </w:r>
     </w:p>
-    <w:bookmarkStart w:id="97" w:name="the-political-landscape"/>
+    <w:bookmarkStart w:id="98" w:name="the-political-landscape"/>
     <w:p>
       <w:pPr>
         <w:pStyle w:val="Heading2"/>
@@ -20163,8 +20924,8 @@
         <w:t xml:space="preserve">No power controls the entire corridor network, and no species has a monopoly on intelligence, technological innovation, or ambition.</w:t>
       </w:r>
     </w:p>
-    <w:bookmarkEnd w:id="97"/>
-    <w:bookmarkStart w:id="103" w:name="the-established-and-emerging-powers"/>
+    <w:bookmarkEnd w:id="98"/>
+    <w:bookmarkStart w:id="104" w:name="the-established-and-emerging-powers"/>
     <w:p>
       <w:pPr>
         <w:pStyle w:val="Heading2"/>
@@ -20173,7 +20934,7 @@
         <w:t xml:space="preserve">The established and emerging powers</w:t>
       </w:r>
     </w:p>
-    <w:bookmarkStart w:id="98" w:name="humans"/>
+    <w:bookmarkStart w:id="99" w:name="humans"/>
     <w:p>
       <w:pPr>
         <w:pStyle w:val="Heading3"/>
@@ -20214,8 +20975,8 @@
         <w:t xml:space="preserve">Humanity’s economic innovations have begun influencing Tessan institutions, while its explorers and entrepreneurs push into regions older civilizations consider unprofitable or dangerous.</w:t>
       </w:r>
     </w:p>
-    <w:bookmarkEnd w:id="98"/>
-    <w:bookmarkStart w:id="99" w:name="tessan"/>
+    <w:bookmarkEnd w:id="99"/>
+    <w:bookmarkStart w:id="100" w:name="tessan"/>
     <w:p>
       <w:pPr>
         <w:pStyle w:val="Heading3"/>
@@ -20256,8 +21017,8 @@
         <w:t xml:space="preserve">Contact with humanity has introduced new economic thinking into Tessan society, creating a growing division between traditional creditors and reformers who question the profitability of perpetual debt.</w:t>
       </w:r>
     </w:p>
-    <w:bookmarkEnd w:id="99"/>
-    <w:bookmarkStart w:id="100" w:name="kel"/>
+    <w:bookmarkEnd w:id="100"/>
+    <w:bookmarkStart w:id="101" w:name="kel"/>
     <w:p>
       <w:pPr>
         <w:pStyle w:val="Heading3"/>
@@ -20298,8 +21059,8 @@
         <w:t xml:space="preserve">Today, Kel society is divided between contractual loyalists, reformers seeking negotiated emancipation, and radicals who believe their world’s debts can only be ended through force.</w:t>
       </w:r>
     </w:p>
-    <w:bookmarkEnd w:id="100"/>
-    <w:bookmarkStart w:id="101" w:name="mirrun"/>
+    <w:bookmarkEnd w:id="101"/>
+    <w:bookmarkStart w:id="102" w:name="mirrun"/>
     <w:p>
       <w:pPr>
         <w:pStyle w:val="Heading3"/>
@@ -20340,8 +21101,8 @@
         <w:t xml:space="preserve">Mirrun researchers are among the leading specialists in gravimetric resonance detection. Their biological sensitivity inspired several important improvements in corridor instrumentation. Their principal strategic concern is the protection of ocean worlds from extractive industries.</w:t>
       </w:r>
     </w:p>
-    <w:bookmarkEnd w:id="101"/>
-    <w:bookmarkStart w:id="102" w:name="ylith"/>
+    <w:bookmarkEnd w:id="102"/>
+    <w:bookmarkStart w:id="103" w:name="ylith"/>
     <w:p>
       <w:pPr>
         <w:pStyle w:val="Heading3"/>
@@ -20382,9 +21143,9 @@
         <w:t xml:space="preserve">Their independent city-states are renowned for navigation, long-range observation, and exploratory cartography. Ylith navigators have discovered corridors that conventional instruments initially failed to identify.</w:t>
       </w:r>
     </w:p>
-    <w:bookmarkEnd w:id="102"/>
     <w:bookmarkEnd w:id="103"/>
-    <w:bookmarkStart w:id="109" w:name="Xff4a93679c910774e2f02ac587efedb0ceda74a"/>
+    <w:bookmarkEnd w:id="104"/>
+    <w:bookmarkStart w:id="110" w:name="Xff4a93679c910774e2f02ac587efedb0ceda74a"/>
     <w:p>
       <w:pPr>
         <w:pStyle w:val="Heading2"/>
@@ -20417,7 +21178,7 @@
         <w:t xml:space="preserve">Both its internal factions and external enemies have exploited the shifting gravimetric corridors. An imperial province isolated for centuries can become an independent civilization. When its corridor reopens, the Hegemony may return to reclaim it.</w:t>
       </w:r>
     </w:p>
-    <w:bookmarkStart w:id="104" w:name="ozhvek-the-imperial-founders"/>
+    <w:bookmarkStart w:id="105" w:name="ozhvek-the-imperial-founders"/>
     <w:p>
       <w:pPr>
         <w:pStyle w:val="Heading3"/>
@@ -20466,8 +21227,8 @@
         <w:t xml:space="preserve">The greatest threat to Ozhvek dominance is not necessarily another species. It is the inability of their ruling houses to agree on what the Hegemony should become.</w:t>
       </w:r>
     </w:p>
-    <w:bookmarkEnd w:id="104"/>
-    <w:bookmarkStart w:id="105" w:name="dresh-the-imperial-soldiers"/>
+    <w:bookmarkEnd w:id="105"/>
+    <w:bookmarkStart w:id="106" w:name="dresh-the-imperial-soldiers"/>
     <w:p>
       <w:pPr>
         <w:pStyle w:val="Heading3"/>
@@ -20516,8 +21277,8 @@
         <w:t xml:space="preserve">Dresh military society prizes competence and mutual obligation. Their greatest political dispute concerns whether soldiers owe allegiance to the imperial throne, their commanders, or the populations they protect.</w:t>
       </w:r>
     </w:p>
-    <w:bookmarkEnd w:id="105"/>
-    <w:bookmarkStart w:id="106" w:name="shivar-the-keepers-of-orthodoxy"/>
+    <w:bookmarkEnd w:id="106"/>
+    <w:bookmarkStart w:id="107" w:name="shivar-the-keepers-of-orthodoxy"/>
     <w:p>
       <w:pPr>
         <w:pStyle w:val="Heading3"/>
@@ -20574,8 +21335,8 @@
         <w:t xml:space="preserve">The resulting religious schism has fueled uprisings, political assassinations, and wars within the Hegemony.</w:t>
       </w:r>
     </w:p>
-    <w:bookmarkEnd w:id="106"/>
-    <w:bookmarkStart w:id="107" w:name="brulvek-the-industrial-survivors"/>
+    <w:bookmarkEnd w:id="107"/>
+    <w:bookmarkStart w:id="108" w:name="brulvek-the-industrial-survivors"/>
     <w:p>
       <w:pPr>
         <w:pStyle w:val="Heading3"/>
@@ -20632,8 +21393,8 @@
         <w:t xml:space="preserve">Brulvek engineers are highly sought after throughout known space, particularly for their ability to restore machinery that has operated for centuries without replacement parts.</w:t>
       </w:r>
     </w:p>
-    <w:bookmarkEnd w:id="107"/>
-    <w:bookmarkStart w:id="108" w:name="zhaq-the-lost-province"/>
+    <w:bookmarkEnd w:id="108"/>
+    <w:bookmarkStart w:id="109" w:name="zhaq-the-lost-province"/>
     <w:p>
       <w:pPr>
         <w:pStyle w:val="Heading3"/>
@@ -20706,9 +21467,9 @@
         <w:t xml:space="preserve">Their continuing resistance has become a symbol for separatist movements throughout imperial space.</w:t>
       </w:r>
     </w:p>
-    <w:bookmarkEnd w:id="108"/>
     <w:bookmarkEnd w:id="109"/>
-    <w:bookmarkStart w:id="125" w:name="X7cf45656e26c6332fca34295f43177ee2dc74b7"/>
+    <w:bookmarkEnd w:id="110"/>
+    <w:bookmarkStart w:id="126" w:name="X7cf45656e26c6332fca34295f43177ee2dc74b7"/>
     <w:p>
       <w:pPr>
         <w:pStyle w:val="Heading2"/>
@@ -20717,7 +21478,7 @@
         <w:t xml:space="preserve">Independent civilizations and regional powers</w:t>
       </w:r>
     </w:p>
-    <w:bookmarkStart w:id="110" w:name="veyari-the-memory-keepers"/>
+    <w:bookmarkStart w:id="111" w:name="veyari-the-memory-keepers"/>
     <w:p>
       <w:pPr>
         <w:pStyle w:val="Heading3"/>
@@ -20774,8 +21535,8 @@
         <w:t xml:space="preserve">Their greatest strength is knowledge. Their greatest vulnerability is the assumption that knowledge should be preserved even when powerful civilizations would prefer it forgotten.</w:t>
       </w:r>
     </w:p>
-    <w:bookmarkEnd w:id="110"/>
-    <w:bookmarkStart w:id="111" w:name="eshuum-the-distributed-minds"/>
+    <w:bookmarkEnd w:id="111"/>
+    <w:bookmarkStart w:id="112" w:name="eshuum-the-distributed-minds"/>
     <w:p>
       <w:pPr>
         <w:pStyle w:val="Heading3"/>
@@ -20832,8 +21593,8 @@
         <w:t xml:space="preserve">Their political institutions strongly oppose forced separation, biological experimentation without consent, and the ownership of intelligent organisms. These positions have brought them into direct conflict with several Hegemony research authorities.</w:t>
       </w:r>
     </w:p>
-    <w:bookmarkEnd w:id="111"/>
-    <w:bookmarkStart w:id="112" w:name="khaum-the-deep-dwellers"/>
+    <w:bookmarkEnd w:id="112"/>
+    <w:bookmarkStart w:id="113" w:name="khaum-the-deep-dwellers"/>
     <w:p>
       <w:pPr>
         <w:pStyle w:val="Heading3"/>
@@ -20898,8 +21659,8 @@
         <w:t xml:space="preserve">Their underground refuges have sheltered refugees from multiple Hegemony campaigns.</w:t>
       </w:r>
     </w:p>
-    <w:bookmarkEnd w:id="112"/>
-    <w:bookmarkStart w:id="113" w:name="vael-the-living-fleets"/>
+    <w:bookmarkEnd w:id="113"/>
+    <w:bookmarkStart w:id="114" w:name="vael-the-living-fleets"/>
     <w:p>
       <w:pPr>
         <w:pStyle w:val="Heading3"/>
@@ -20956,8 +21717,8 @@
         <w:t xml:space="preserve">Vael flotillas have repeatedly been caught between Hegemony forces and separatist territories. Their determination to remain politically independent has made them both valuable intermediaries and frequent targets of suspicion.</w:t>
       </w:r>
     </w:p>
-    <w:bookmarkEnd w:id="113"/>
-    <w:bookmarkStart w:id="114" w:name="thrum-the-resonant-people"/>
+    <w:bookmarkEnd w:id="114"/>
+    <w:bookmarkStart w:id="115" w:name="thrum-the-resonant-people"/>
     <w:p>
       <w:pPr>
         <w:pStyle w:val="Heading3"/>
@@ -21022,8 +21783,8 @@
         <w:t xml:space="preserve">Their technology is widely respected, although their reluctance to permit military applications has strained relations with several governments.</w:t>
       </w:r>
     </w:p>
-    <w:bookmarkEnd w:id="114"/>
-    <w:bookmarkStart w:id="115" w:name="corvani-the-ecological-architects"/>
+    <w:bookmarkEnd w:id="115"/>
+    <w:bookmarkStart w:id="116" w:name="corvani-the-ecological-architects"/>
     <w:p>
       <w:pPr>
         <w:pStyle w:val="Heading3"/>
@@ -21080,8 +21841,8 @@
         <w:t xml:space="preserve">Corvani restoration teams operate on worlds devastated by Hegemony industrial extraction, although their insistence on ecological safeguards frequently brings them into conflict with mining corporations and colonial governments.</w:t>
       </w:r>
     </w:p>
-    <w:bookmarkEnd w:id="115"/>
-    <w:bookmarkStart w:id="116" w:name="uxarra-the-shifting-ones"/>
+    <w:bookmarkEnd w:id="116"/>
+    <w:bookmarkStart w:id="117" w:name="uxarra-the-shifting-ones"/>
     <w:p>
       <w:pPr>
         <w:pStyle w:val="Heading3"/>
@@ -21138,8 +21899,8 @@
         <w:t xml:space="preserve">Uxarra explorers and rescue specialists are highly valued for operations in unstable environments, particularly worlds affected by corridor disruptions or natural disasters.</w:t>
       </w:r>
     </w:p>
-    <w:bookmarkEnd w:id="116"/>
-    <w:bookmarkStart w:id="117" w:name="sen-the-patient-observers"/>
+    <w:bookmarkEnd w:id="117"/>
+    <w:bookmarkStart w:id="118" w:name="sen-the-patient-observers"/>
     <w:p>
       <w:pPr>
         <w:pStyle w:val="Heading3"/>
@@ -21204,8 +21965,8 @@
         <w:t xml:space="preserve">Their governments rarely intervene in external affairs, but their warnings concerning corridor instability carry considerable weight among navigators and scientists.</w:t>
       </w:r>
     </w:p>
-    <w:bookmarkEnd w:id="117"/>
-    <w:bookmarkStart w:id="118" w:name="joruun-the-borderland-confederates"/>
+    <w:bookmarkEnd w:id="118"/>
+    <w:bookmarkStart w:id="119" w:name="joruun-the-borderland-confederates"/>
     <w:p>
       <w:pPr>
         <w:pStyle w:val="Heading3"/>
@@ -21270,8 +22031,8 @@
         <w:t xml:space="preserve">Their greatest political challenge is maintaining unity during periods when the imperial threat appears to recede.</w:t>
       </w:r>
     </w:p>
-    <w:bookmarkEnd w:id="118"/>
-    <w:bookmarkStart w:id="119" w:name="qor-the-silicon-minds"/>
+    <w:bookmarkEnd w:id="119"/>
+    <w:bookmarkStart w:id="120" w:name="qor-the-silicon-minds"/>
     <w:p>
       <w:pPr>
         <w:pStyle w:val="Heading3"/>
@@ -21344,8 +22105,8 @@
         <w:t xml:space="preserve">Their relationship with the Tessan is complex: Tessan capital has helped expand Qor industry, but Qor political leaders refuse to permit debt arrangements that threaten planetary sovereignty.</w:t>
       </w:r>
     </w:p>
-    <w:bookmarkEnd w:id="119"/>
-    <w:bookmarkStart w:id="120" w:name="ommek-the-makers-of-machines"/>
+    <w:bookmarkEnd w:id="120"/>
+    <w:bookmarkStart w:id="121" w:name="ommek-the-makers-of-machines"/>
     <w:p>
       <w:pPr>
         <w:pStyle w:val="Heading3"/>
@@ -21418,8 +22179,8 @@
         <w:t xml:space="preserve">Ommek defensive systems have made direct conquest prohibitively expensive.</w:t>
       </w:r>
     </w:p>
-    <w:bookmarkEnd w:id="120"/>
-    <w:bookmarkStart w:id="121" w:name="vesh-the-newcomers"/>
+    <w:bookmarkEnd w:id="121"/>
+    <w:bookmarkStart w:id="122" w:name="vesh-the-newcomers"/>
     <w:p>
       <w:pPr>
         <w:pStyle w:val="Heading3"/>
@@ -21492,8 +22253,8 @@
         <w:t xml:space="preserve">Human diplomats have developed a particularly strong interest in Vesh affairs, recognizing many of the difficulties humanity experienced during its own early expansion.</w:t>
       </w:r>
     </w:p>
-    <w:bookmarkEnd w:id="121"/>
-    <w:bookmarkStart w:id="122" w:name="uth-the-refugees-of-empire"/>
+    <w:bookmarkEnd w:id="122"/>
+    <w:bookmarkStart w:id="123" w:name="uth-the-refugees-of-empire"/>
     <w:p>
       <w:pPr>
         <w:pStyle w:val="Heading3"/>
@@ -21566,8 +22327,8 @@
         <w:t xml:space="preserve">Uth activists are prominent in anti-Hegemony movements, although many Uth reject the idea that their people should be defined exclusively by historical suffering.</w:t>
       </w:r>
     </w:p>
-    <w:bookmarkEnd w:id="122"/>
-    <w:bookmarkStart w:id="123" w:name="draelin-the-corridor-cartographers"/>
+    <w:bookmarkEnd w:id="123"/>
+    <w:bookmarkStart w:id="124" w:name="draelin-the-corridor-cartographers"/>
     <w:p>
       <w:pPr>
         <w:pStyle w:val="Heading3"/>
@@ -21648,8 +22409,8 @@
         <w:t xml:space="preserve">Their internal politics are shaped by a central question: whether knowledge of safe passage should be treated as a public good or a commercial asset.</w:t>
       </w:r>
     </w:p>
-    <w:bookmarkEnd w:id="123"/>
-    <w:bookmarkStart w:id="124" w:name="zethri-the-children-of-the-collapse"/>
+    <w:bookmarkEnd w:id="124"/>
+    <w:bookmarkStart w:id="125" w:name="zethri-the-children-of-the-collapse"/>
     <w:p>
       <w:pPr>
         <w:pStyle w:val="Heading3"/>
@@ -21730,10 +22491,10 @@
         <w:t xml:space="preserve">Zethri engineers and planners specialize in building settlements capable of surviving prolonged isolation.</w:t>
       </w:r>
     </w:p>
-    <w:bookmarkEnd w:id="124"/>
     <w:bookmarkEnd w:id="125"/>
     <w:bookmarkEnd w:id="126"/>
-    <w:bookmarkStart w:id="130" w:name="X3145843e1df3f61def4f8ab8c5430269a2a5813"/>
+    <w:bookmarkEnd w:id="127"/>
+    <w:bookmarkStart w:id="131" w:name="X3145843e1df3f61def4f8ab8c5430269a2a5813"/>
     <w:p>
       <w:pPr>
         <w:pStyle w:val="Heading1"/>
@@ -21750,7 +22511,7 @@
         <w:t xml:space="preserve">The Hegemony deserves particular attention because its decline influences nearly every civilization in Fracture Lines.</w:t>
       </w:r>
     </w:p>
-    <w:bookmarkStart w:id="127" w:name="the-five-eras"/>
+    <w:bookmarkStart w:id="128" w:name="the-five-eras"/>
     <w:p>
       <w:pPr>
         <w:pStyle w:val="Heading2"/>
@@ -21763,7 +22524,7 @@
       <w:pPr>
         <w:numPr>
           <w:ilvl w:val="0"/>
-          <w:numId w:val="1019"/>
+          <w:numId w:val="1021"/>
         </w:numPr>
       </w:pPr>
       <w:r>
@@ -21784,7 +22545,7 @@
       <w:pPr>
         <w:numPr>
           <w:ilvl w:val="0"/>
-          <w:numId w:val="1019"/>
+          <w:numId w:val="1021"/>
         </w:numPr>
       </w:pPr>
       <w:r>
@@ -21805,7 +22566,7 @@
       <w:pPr>
         <w:numPr>
           <w:ilvl w:val="0"/>
-          <w:numId w:val="1019"/>
+          <w:numId w:val="1021"/>
         </w:numPr>
       </w:pPr>
       <w:r>
@@ -21826,7 +22587,7 @@
       <w:pPr>
         <w:numPr>
           <w:ilvl w:val="0"/>
-          <w:numId w:val="1019"/>
+          <w:numId w:val="1021"/>
         </w:numPr>
       </w:pPr>
       <w:r>
@@ -21847,7 +22608,7 @@
       <w:pPr>
         <w:numPr>
           <w:ilvl w:val="0"/>
-          <w:numId w:val="1019"/>
+          <w:numId w:val="1021"/>
         </w:numPr>
       </w:pPr>
       <w:r>
@@ -21928,8 +22689,8 @@
         <w:t xml:space="preserve">And an imperial fleet may emerge to announce that the worlds beyond it still belong to the Emperor.</w:t>
       </w:r>
     </w:p>
-    <w:bookmarkEnd w:id="127"/>
-    <w:bookmarkStart w:id="128" w:name="species-and-political-affiliations"/>
+    <w:bookmarkEnd w:id="128"/>
+    <w:bookmarkStart w:id="129" w:name="species-and-political-affiliations"/>
     <w:p>
       <w:pPr>
         <w:pStyle w:val="Heading2"/>
@@ -22238,8 +22999,8 @@
         </w:tc>
       </w:tr>
     </w:tbl>
-    <w:bookmarkEnd w:id="128"/>
-    <w:bookmarkStart w:id="129" w:name="the-galaxy-as-a-setting-for-adventure"/>
+    <w:bookmarkEnd w:id="129"/>
+    <w:bookmarkStart w:id="130" w:name="the-galaxy-as-a-setting-for-adventure"/>
     <w:p>
       <w:pPr>
         <w:pStyle w:val="Heading2"/>
@@ -22296,9 +23057,9 @@
         <w:t xml:space="preserve">The central conflict of Fracture Lines is not simply the struggle between civilizations. It is the struggle between established power and an interstellar order that refuses to remain static.</w:t>
       </w:r>
     </w:p>
-    <w:bookmarkEnd w:id="129"/>
     <w:bookmarkEnd w:id="130"/>
-    <w:bookmarkStart w:id="131" w:name="psionics-and-the-mandates"/>
+    <w:bookmarkEnd w:id="131"/>
+    <w:bookmarkStart w:id="132" w:name="psionics-and-the-mandates"/>
     <w:p>
       <w:pPr>
         <w:pStyle w:val="Heading1"/>
@@ -22385,7 +23146,7 @@
       <w:pPr>
         <w:numPr>
           <w:ilvl w:val="0"/>
-          <w:numId w:val="1020"/>
+          <w:numId w:val="1022"/>
         </w:numPr>
         <w:pStyle w:val="Compact"/>
       </w:pPr>
@@ -22471,7 +23232,7 @@
       <w:pPr>
         <w:numPr>
           <w:ilvl w:val="0"/>
-          <w:numId w:val="1020"/>
+          <w:numId w:val="1022"/>
         </w:numPr>
         <w:pStyle w:val="Compact"/>
       </w:pPr>
@@ -22506,7 +23267,7 @@
       <w:pPr>
         <w:numPr>
           <w:ilvl w:val="0"/>
-          <w:numId w:val="1020"/>
+          <w:numId w:val="1022"/>
         </w:numPr>
         <w:pStyle w:val="Compact"/>
       </w:pPr>
@@ -22544,7 +23305,7 @@
       <w:pPr>
         <w:numPr>
           <w:ilvl w:val="0"/>
-          <w:numId w:val="1020"/>
+          <w:numId w:val="1022"/>
         </w:numPr>
         <w:pStyle w:val="Compact"/>
       </w:pPr>
@@ -23019,8 +23780,8 @@
         </w:tc>
       </w:tr>
     </w:tbl>
-    <w:bookmarkEnd w:id="131"/>
-    <w:bookmarkStart w:id="132" w:name="technology"/>
+    <w:bookmarkEnd w:id="132"/>
+    <w:bookmarkStart w:id="133" w:name="technology"/>
     <w:p>
       <w:pPr>
         <w:pStyle w:val="Heading1"/>
@@ -23033,7 +23794,7 @@
       <w:pPr>
         <w:numPr>
           <w:ilvl w:val="0"/>
-          <w:numId w:val="1021"/>
+          <w:numId w:val="1023"/>
         </w:numPr>
         <w:pStyle w:val="Compact"/>
       </w:pPr>
@@ -23103,7 +23864,7 @@
       <w:pPr>
         <w:numPr>
           <w:ilvl w:val="0"/>
-          <w:numId w:val="1021"/>
+          <w:numId w:val="1023"/>
         </w:numPr>
         <w:pStyle w:val="Compact"/>
       </w:pPr>
@@ -23173,7 +23934,7 @@
       <w:pPr>
         <w:numPr>
           <w:ilvl w:val="0"/>
-          <w:numId w:val="1021"/>
+          <w:numId w:val="1023"/>
         </w:numPr>
         <w:pStyle w:val="Compact"/>
       </w:pPr>
@@ -23195,7 +23956,7 @@
       <w:pPr>
         <w:numPr>
           <w:ilvl w:val="0"/>
-          <w:numId w:val="1021"/>
+          <w:numId w:val="1023"/>
         </w:numPr>
         <w:pStyle w:val="Compact"/>
       </w:pPr>
@@ -23233,7 +23994,7 @@
       <w:pPr>
         <w:numPr>
           <w:ilvl w:val="0"/>
-          <w:numId w:val="1021"/>
+          <w:numId w:val="1023"/>
         </w:numPr>
         <w:pStyle w:val="Compact"/>
       </w:pPr>
@@ -23280,8 +24041,8 @@
         <w:t xml:space="preserve">advantage starts the crew with a ship and a box of Debt. Ship fights and chases run as clocks, with Piloting, Engineering, Sensors and Firearms rolls.</w:t>
       </w:r>
     </w:p>
-    <w:bookmarkEnd w:id="132"/>
-    <w:bookmarkStart w:id="133" w:name="threats"/>
+    <w:bookmarkEnd w:id="133"/>
+    <w:bookmarkStart w:id="134" w:name="threats"/>
     <w:p>
       <w:pPr>
         <w:pStyle w:val="Heading1"/>
@@ -24766,8 +25527,8 @@
         <w:t xml:space="preserve">For a tougher version, add +1 to its targets and one box; for a weaker one, subtract.</w:t>
       </w:r>
     </w:p>
-    <w:bookmarkEnd w:id="133"/>
-    <w:bookmarkStart w:id="141" w:name="ready-made-characters"/>
+    <w:bookmarkEnd w:id="134"/>
+    <w:bookmarkStart w:id="142" w:name="ready-made-characters"/>
     <w:p>
       <w:pPr>
         <w:pStyle w:val="Heading1"/>
@@ -24784,7 +25545,7 @@
         <w:t xml:space="preserve">Characters ready to play, for one-shots, new players, or a group in a hurry. Each follows the creation rules exactly, and their connections tie them together. In the creator, choose one from the ready-made list to open it and make it your own.</w:t>
       </w:r>
     </w:p>
-    <w:bookmarkStart w:id="134" w:name="thessk-varo-hun"/>
+    <w:bookmarkStart w:id="135" w:name="thessk-varo-hun"/>
     <w:p>
       <w:pPr>
         <w:pStyle w:val="Heading2"/>
@@ -24815,7 +25576,7 @@
       <w:pPr>
         <w:numPr>
           <w:ilvl w:val="0"/>
-          <w:numId w:val="1022"/>
+          <w:numId w:val="1024"/>
         </w:numPr>
         <w:pStyle w:val="Compact"/>
       </w:pPr>
@@ -24853,7 +25614,7 @@
       <w:pPr>
         <w:numPr>
           <w:ilvl w:val="0"/>
-          <w:numId w:val="1022"/>
+          <w:numId w:val="1024"/>
         </w:numPr>
         <w:pStyle w:val="Compact"/>
       </w:pPr>
@@ -24875,7 +25636,7 @@
       <w:pPr>
         <w:numPr>
           <w:ilvl w:val="0"/>
-          <w:numId w:val="1022"/>
+          <w:numId w:val="1024"/>
         </w:numPr>
         <w:pStyle w:val="Compact"/>
       </w:pPr>
@@ -24897,7 +25658,7 @@
       <w:pPr>
         <w:numPr>
           <w:ilvl w:val="0"/>
-          <w:numId w:val="1022"/>
+          <w:numId w:val="1024"/>
         </w:numPr>
         <w:pStyle w:val="Compact"/>
       </w:pPr>
@@ -24935,7 +25696,7 @@
       <w:pPr>
         <w:numPr>
           <w:ilvl w:val="0"/>
-          <w:numId w:val="1022"/>
+          <w:numId w:val="1024"/>
         </w:numPr>
         <w:pStyle w:val="Compact"/>
       </w:pPr>
@@ -24969,8 +25730,8 @@
         <w:t xml:space="preserve">She sold Mara Okonkwo the first debt Mara forgave. Neither regrets it.</w:t>
       </w:r>
     </w:p>
-    <w:bookmarkEnd w:id="134"/>
-    <w:bookmarkStart w:id="135" w:name="kesh-of-the-seventh-hive"/>
+    <w:bookmarkEnd w:id="135"/>
+    <w:bookmarkStart w:id="136" w:name="kesh-of-the-seventh-hive"/>
     <w:p>
       <w:pPr>
         <w:pStyle w:val="Heading2"/>
@@ -25001,7 +25762,7 @@
       <w:pPr>
         <w:numPr>
           <w:ilvl w:val="0"/>
-          <w:numId w:val="1023"/>
+          <w:numId w:val="1025"/>
         </w:numPr>
         <w:pStyle w:val="Compact"/>
       </w:pPr>
@@ -25039,7 +25800,7 @@
       <w:pPr>
         <w:numPr>
           <w:ilvl w:val="0"/>
-          <w:numId w:val="1023"/>
+          <w:numId w:val="1025"/>
         </w:numPr>
         <w:pStyle w:val="Compact"/>
       </w:pPr>
@@ -25061,7 +25822,7 @@
       <w:pPr>
         <w:numPr>
           <w:ilvl w:val="0"/>
-          <w:numId w:val="1023"/>
+          <w:numId w:val="1025"/>
         </w:numPr>
         <w:pStyle w:val="Compact"/>
       </w:pPr>
@@ -25083,7 +25844,7 @@
       <w:pPr>
         <w:numPr>
           <w:ilvl w:val="0"/>
-          <w:numId w:val="1023"/>
+          <w:numId w:val="1025"/>
         </w:numPr>
         <w:pStyle w:val="Compact"/>
       </w:pPr>
@@ -25121,7 +25882,7 @@
       <w:pPr>
         <w:numPr>
           <w:ilvl w:val="0"/>
-          <w:numId w:val="1023"/>
+          <w:numId w:val="1025"/>
         </w:numPr>
         <w:pStyle w:val="Compact"/>
       </w:pPr>
@@ -25155,8 +25916,8 @@
         <w:t xml:space="preserve">Ilvi Saradh’s AI found the corridor Kesh’s hive needed; Kesh owes them both.</w:t>
       </w:r>
     </w:p>
-    <w:bookmarkEnd w:id="135"/>
-    <w:bookmarkStart w:id="136" w:name="rook"/>
+    <w:bookmarkEnd w:id="136"/>
+    <w:bookmarkStart w:id="137" w:name="rook"/>
     <w:p>
       <w:pPr>
         <w:pStyle w:val="Heading2"/>
@@ -25187,7 +25948,7 @@
       <w:pPr>
         <w:numPr>
           <w:ilvl w:val="0"/>
-          <w:numId w:val="1024"/>
+          <w:numId w:val="1026"/>
         </w:numPr>
         <w:pStyle w:val="Compact"/>
       </w:pPr>
@@ -25225,7 +25986,7 @@
       <w:pPr>
         <w:numPr>
           <w:ilvl w:val="0"/>
-          <w:numId w:val="1024"/>
+          <w:numId w:val="1026"/>
         </w:numPr>
         <w:pStyle w:val="Compact"/>
       </w:pPr>
@@ -25247,7 +26008,7 @@
       <w:pPr>
         <w:numPr>
           <w:ilvl w:val="0"/>
-          <w:numId w:val="1024"/>
+          <w:numId w:val="1026"/>
         </w:numPr>
         <w:pStyle w:val="Compact"/>
       </w:pPr>
@@ -25269,7 +26030,7 @@
       <w:pPr>
         <w:numPr>
           <w:ilvl w:val="0"/>
-          <w:numId w:val="1024"/>
+          <w:numId w:val="1026"/>
         </w:numPr>
         <w:pStyle w:val="Compact"/>
       </w:pPr>
@@ -25307,7 +26068,7 @@
       <w:pPr>
         <w:numPr>
           <w:ilvl w:val="0"/>
-          <w:numId w:val="1024"/>
+          <w:numId w:val="1026"/>
         </w:numPr>
         <w:pStyle w:val="Compact"/>
       </w:pPr>
@@ -25341,8 +26102,8 @@
         <w:t xml:space="preserve">Brakka was on the other side of that border war. They found out over a drink, and stayed friends.</w:t>
       </w:r>
     </w:p>
-    <w:bookmarkEnd w:id="136"/>
-    <w:bookmarkStart w:id="137" w:name="ilvi-saradh"/>
+    <w:bookmarkEnd w:id="137"/>
+    <w:bookmarkStart w:id="138" w:name="ilvi-saradh"/>
     <w:p>
       <w:pPr>
         <w:pStyle w:val="Heading2"/>
@@ -25373,7 +26134,7 @@
       <w:pPr>
         <w:numPr>
           <w:ilvl w:val="0"/>
-          <w:numId w:val="1025"/>
+          <w:numId w:val="1027"/>
         </w:numPr>
         <w:pStyle w:val="Compact"/>
       </w:pPr>
@@ -25411,7 +26172,7 @@
       <w:pPr>
         <w:numPr>
           <w:ilvl w:val="0"/>
-          <w:numId w:val="1025"/>
+          <w:numId w:val="1027"/>
         </w:numPr>
         <w:pStyle w:val="Compact"/>
       </w:pPr>
@@ -25433,7 +26194,7 @@
       <w:pPr>
         <w:numPr>
           <w:ilvl w:val="0"/>
-          <w:numId w:val="1025"/>
+          <w:numId w:val="1027"/>
         </w:numPr>
         <w:pStyle w:val="Compact"/>
       </w:pPr>
@@ -25455,7 +26216,7 @@
       <w:pPr>
         <w:numPr>
           <w:ilvl w:val="0"/>
-          <w:numId w:val="1025"/>
+          <w:numId w:val="1027"/>
         </w:numPr>
         <w:pStyle w:val="Compact"/>
       </w:pPr>
@@ -25493,7 +26254,7 @@
       <w:pPr>
         <w:numPr>
           <w:ilvl w:val="0"/>
-          <w:numId w:val="1025"/>
+          <w:numId w:val="1027"/>
         </w:numPr>
         <w:pStyle w:val="Compact"/>
       </w:pPr>
@@ -25527,8 +26288,8 @@
         <w:t xml:space="preserve">Quill found the corridor Kesh’s hive needed. Ilvi never told the guild.</w:t>
       </w:r>
     </w:p>
-    <w:bookmarkEnd w:id="137"/>
-    <w:bookmarkStart w:id="138" w:name="dr.-anwe-tal"/>
+    <w:bookmarkEnd w:id="138"/>
+    <w:bookmarkStart w:id="139" w:name="dr.-anwe-tal"/>
     <w:p>
       <w:pPr>
         <w:pStyle w:val="Heading2"/>
@@ -25559,7 +26320,7 @@
       <w:pPr>
         <w:numPr>
           <w:ilvl w:val="0"/>
-          <w:numId w:val="1026"/>
+          <w:numId w:val="1028"/>
         </w:numPr>
         <w:pStyle w:val="Compact"/>
       </w:pPr>
@@ -25597,7 +26358,7 @@
       <w:pPr>
         <w:numPr>
           <w:ilvl w:val="0"/>
-          <w:numId w:val="1026"/>
+          <w:numId w:val="1028"/>
         </w:numPr>
         <w:pStyle w:val="Compact"/>
       </w:pPr>
@@ -25619,7 +26380,7 @@
       <w:pPr>
         <w:numPr>
           <w:ilvl w:val="0"/>
-          <w:numId w:val="1026"/>
+          <w:numId w:val="1028"/>
         </w:numPr>
         <w:pStyle w:val="Compact"/>
       </w:pPr>
@@ -25641,7 +26402,7 @@
       <w:pPr>
         <w:numPr>
           <w:ilvl w:val="0"/>
-          <w:numId w:val="1026"/>
+          <w:numId w:val="1028"/>
         </w:numPr>
         <w:pStyle w:val="Compact"/>
       </w:pPr>
@@ -25679,7 +26440,7 @@
       <w:pPr>
         <w:numPr>
           <w:ilvl w:val="0"/>
-          <w:numId w:val="1026"/>
+          <w:numId w:val="1028"/>
         </w:numPr>
         <w:pStyle w:val="Compact"/>
       </w:pPr>
@@ -25713,8 +26474,8 @@
         <w:t xml:space="preserve">Sable cleaned up the corporation’s files that proved Anwe’s case, and asked nothing for it.</w:t>
       </w:r>
     </w:p>
-    <w:bookmarkEnd w:id="138"/>
-    <w:bookmarkStart w:id="139" w:name="brakka"/>
+    <w:bookmarkEnd w:id="139"/>
+    <w:bookmarkStart w:id="140" w:name="brakka"/>
     <w:p>
       <w:pPr>
         <w:pStyle w:val="Heading2"/>
@@ -25745,7 +26506,7 @@
       <w:pPr>
         <w:numPr>
           <w:ilvl w:val="0"/>
-          <w:numId w:val="1027"/>
+          <w:numId w:val="1029"/>
         </w:numPr>
         <w:pStyle w:val="Compact"/>
       </w:pPr>
@@ -25783,7 +26544,7 @@
       <w:pPr>
         <w:numPr>
           <w:ilvl w:val="0"/>
-          <w:numId w:val="1027"/>
+          <w:numId w:val="1029"/>
         </w:numPr>
         <w:pStyle w:val="Compact"/>
       </w:pPr>
@@ -25805,7 +26566,7 @@
       <w:pPr>
         <w:numPr>
           <w:ilvl w:val="0"/>
-          <w:numId w:val="1027"/>
+          <w:numId w:val="1029"/>
         </w:numPr>
         <w:pStyle w:val="Compact"/>
       </w:pPr>
@@ -25827,7 +26588,7 @@
       <w:pPr>
         <w:numPr>
           <w:ilvl w:val="0"/>
-          <w:numId w:val="1027"/>
+          <w:numId w:val="1029"/>
         </w:numPr>
         <w:pStyle w:val="Compact"/>
       </w:pPr>
@@ -25865,7 +26626,7 @@
       <w:pPr>
         <w:numPr>
           <w:ilvl w:val="0"/>
-          <w:numId w:val="1027"/>
+          <w:numId w:val="1029"/>
         </w:numPr>
         <w:pStyle w:val="Compact"/>
       </w:pPr>
@@ -25899,8 +26660,8 @@
         <w:t xml:space="preserve">Rook fought him across the Zhaq border once. Now Rook watches his back.</w:t>
       </w:r>
     </w:p>
-    <w:bookmarkEnd w:id="139"/>
-    <w:bookmarkStart w:id="140" w:name="sable"/>
+    <w:bookmarkEnd w:id="140"/>
+    <w:bookmarkStart w:id="141" w:name="sable"/>
     <w:p>
       <w:pPr>
         <w:pStyle w:val="Heading2"/>
@@ -25931,7 +26692,7 @@
       <w:pPr>
         <w:numPr>
           <w:ilvl w:val="0"/>
-          <w:numId w:val="1028"/>
+          <w:numId w:val="1030"/>
         </w:numPr>
         <w:pStyle w:val="Compact"/>
       </w:pPr>
@@ -25969,7 +26730,7 @@
       <w:pPr>
         <w:numPr>
           <w:ilvl w:val="0"/>
-          <w:numId w:val="1028"/>
+          <w:numId w:val="1030"/>
         </w:numPr>
         <w:pStyle w:val="Compact"/>
       </w:pPr>
@@ -25991,7 +26752,7 @@
       <w:pPr>
         <w:numPr>
           <w:ilvl w:val="0"/>
-          <w:numId w:val="1028"/>
+          <w:numId w:val="1030"/>
         </w:numPr>
         <w:pStyle w:val="Compact"/>
       </w:pPr>
@@ -26013,7 +26774,7 @@
       <w:pPr>
         <w:numPr>
           <w:ilvl w:val="0"/>
-          <w:numId w:val="1028"/>
+          <w:numId w:val="1030"/>
         </w:numPr>
         <w:pStyle w:val="Compact"/>
       </w:pPr>
@@ -26051,7 +26812,7 @@
       <w:pPr>
         <w:numPr>
           <w:ilvl w:val="0"/>
-          <w:numId w:val="1028"/>
+          <w:numId w:val="1030"/>
         </w:numPr>
         <w:pStyle w:val="Compact"/>
       </w:pPr>
@@ -26085,9 +26846,9 @@
         <w:t xml:space="preserve">Sable cleaned up the files that proved Dr. Anwe Tal’s case, for nothing. Anwe wonders why.</w:t>
       </w:r>
     </w:p>
-    <w:bookmarkEnd w:id="140"/>
     <w:bookmarkEnd w:id="141"/>
-    <w:bookmarkStart w:id="142" w:name="advantages"/>
+    <w:bookmarkEnd w:id="142"/>
+    <w:bookmarkStart w:id="143" w:name="advantages"/>
     <w:p>
       <w:pPr>
         <w:pStyle w:val="Heading1"/>
@@ -26986,8 +27747,8 @@
         <w:t xml:space="preserve">belongs to the whole crew once it’s taken.</w:t>
       </w:r>
     </w:p>
-    <w:bookmarkEnd w:id="142"/>
-    <w:bookmarkStart w:id="168" w:name="species"/>
+    <w:bookmarkEnd w:id="143"/>
+    <w:bookmarkStart w:id="169" w:name="species"/>
     <w:p>
       <w:pPr>
         <w:pStyle w:val="Heading1"/>
@@ -28670,7 +29431,7 @@
         </w:tc>
       </w:tr>
     </w:tbl>
-    <w:bookmarkStart w:id="143" w:name="human"/>
+    <w:bookmarkStart w:id="144" w:name="human"/>
     <w:p>
       <w:pPr>
         <w:pStyle w:val="Heading2"/>
@@ -28983,8 +29744,8 @@
         </w:tc>
       </w:tr>
     </w:tbl>
-    <w:bookmarkEnd w:id="143"/>
-    <w:bookmarkStart w:id="144" w:name="vesh"/>
+    <w:bookmarkEnd w:id="144"/>
+    <w:bookmarkStart w:id="145" w:name="vesh"/>
     <w:p>
       <w:pPr>
         <w:pStyle w:val="Heading2"/>
@@ -29297,8 +30058,8 @@
         </w:tc>
       </w:tr>
     </w:tbl>
-    <w:bookmarkEnd w:id="144"/>
-    <w:bookmarkStart w:id="145" w:name="brulvek"/>
+    <w:bookmarkEnd w:id="145"/>
+    <w:bookmarkStart w:id="146" w:name="brulvek"/>
     <w:p>
       <w:pPr>
         <w:pStyle w:val="Heading2"/>
@@ -29343,7 +30104,7 @@
       <w:pPr>
         <w:numPr>
           <w:ilvl w:val="0"/>
-          <w:numId w:val="1029"/>
+          <w:numId w:val="1031"/>
         </w:numPr>
         <w:pStyle w:val="Compact"/>
       </w:pPr>
@@ -29635,8 +30396,8 @@
         </w:tc>
       </w:tr>
     </w:tbl>
-    <w:bookmarkEnd w:id="145"/>
-    <w:bookmarkStart w:id="146" w:name="corvani"/>
+    <w:bookmarkEnd w:id="146"/>
+    <w:bookmarkStart w:id="147" w:name="corvani"/>
     <w:p>
       <w:pPr>
         <w:pStyle w:val="Heading2"/>
@@ -29681,7 +30442,7 @@
       <w:pPr>
         <w:numPr>
           <w:ilvl w:val="0"/>
-          <w:numId w:val="1030"/>
+          <w:numId w:val="1032"/>
         </w:numPr>
         <w:pStyle w:val="Compact"/>
       </w:pPr>
@@ -29973,8 +30734,8 @@
         </w:tc>
       </w:tr>
     </w:tbl>
-    <w:bookmarkEnd w:id="146"/>
-    <w:bookmarkStart w:id="147" w:name="draelin"/>
+    <w:bookmarkEnd w:id="147"/>
+    <w:bookmarkStart w:id="148" w:name="draelin"/>
     <w:p>
       <w:pPr>
         <w:pStyle w:val="Heading2"/>
@@ -30019,7 +30780,7 @@
       <w:pPr>
         <w:numPr>
           <w:ilvl w:val="0"/>
-          <w:numId w:val="1031"/>
+          <w:numId w:val="1033"/>
         </w:numPr>
         <w:pStyle w:val="Compact"/>
       </w:pPr>
@@ -30031,7 +30792,7 @@
       <w:pPr>
         <w:numPr>
           <w:ilvl w:val="0"/>
-          <w:numId w:val="1031"/>
+          <w:numId w:val="1033"/>
         </w:numPr>
         <w:pStyle w:val="Compact"/>
       </w:pPr>
@@ -30341,8 +31102,8 @@
         </w:tc>
       </w:tr>
     </w:tbl>
-    <w:bookmarkEnd w:id="147"/>
-    <w:bookmarkStart w:id="148" w:name="joruun"/>
+    <w:bookmarkEnd w:id="148"/>
+    <w:bookmarkStart w:id="149" w:name="joruun"/>
     <w:p>
       <w:pPr>
         <w:pStyle w:val="Heading2"/>
@@ -30387,7 +31148,7 @@
       <w:pPr>
         <w:numPr>
           <w:ilvl w:val="0"/>
-          <w:numId w:val="1032"/>
+          <w:numId w:val="1034"/>
         </w:numPr>
         <w:pStyle w:val="Compact"/>
       </w:pPr>
@@ -30679,8 +31440,8 @@
         </w:tc>
       </w:tr>
     </w:tbl>
-    <w:bookmarkEnd w:id="148"/>
-    <w:bookmarkStart w:id="149" w:name="kel-1"/>
+    <w:bookmarkEnd w:id="149"/>
+    <w:bookmarkStart w:id="150" w:name="kel-1"/>
     <w:p>
       <w:pPr>
         <w:pStyle w:val="Heading2"/>
@@ -30725,7 +31486,7 @@
       <w:pPr>
         <w:numPr>
           <w:ilvl w:val="0"/>
-          <w:numId w:val="1033"/>
+          <w:numId w:val="1035"/>
         </w:numPr>
         <w:pStyle w:val="Compact"/>
       </w:pPr>
@@ -30737,7 +31498,7 @@
       <w:pPr>
         <w:numPr>
           <w:ilvl w:val="0"/>
-          <w:numId w:val="1033"/>
+          <w:numId w:val="1035"/>
         </w:numPr>
         <w:pStyle w:val="Compact"/>
       </w:pPr>
@@ -31029,8 +31790,8 @@
         </w:tc>
       </w:tr>
     </w:tbl>
-    <w:bookmarkEnd w:id="149"/>
-    <w:bookmarkStart w:id="150" w:name="mirrun-1"/>
+    <w:bookmarkEnd w:id="150"/>
+    <w:bookmarkStart w:id="151" w:name="mirrun-1"/>
     <w:p>
       <w:pPr>
         <w:pStyle w:val="Heading2"/>
@@ -31075,7 +31836,7 @@
       <w:pPr>
         <w:numPr>
           <w:ilvl w:val="0"/>
-          <w:numId w:val="1034"/>
+          <w:numId w:val="1036"/>
         </w:numPr>
         <w:pStyle w:val="Compact"/>
       </w:pPr>
@@ -31367,8 +32128,8 @@
         </w:tc>
       </w:tr>
     </w:tbl>
-    <w:bookmarkEnd w:id="150"/>
-    <w:bookmarkStart w:id="151" w:name="ommek"/>
+    <w:bookmarkEnd w:id="151"/>
+    <w:bookmarkStart w:id="152" w:name="ommek"/>
     <w:p>
       <w:pPr>
         <w:pStyle w:val="Heading2"/>
@@ -31413,7 +32174,7 @@
       <w:pPr>
         <w:numPr>
           <w:ilvl w:val="0"/>
-          <w:numId w:val="1035"/>
+          <w:numId w:val="1037"/>
         </w:numPr>
         <w:pStyle w:val="Compact"/>
       </w:pPr>
@@ -31723,8 +32484,8 @@
         </w:tc>
       </w:tr>
     </w:tbl>
-    <w:bookmarkEnd w:id="151"/>
-    <w:bookmarkStart w:id="152" w:name="shivar"/>
+    <w:bookmarkEnd w:id="152"/>
+    <w:bookmarkStart w:id="153" w:name="shivar"/>
     <w:p>
       <w:pPr>
         <w:pStyle w:val="Heading2"/>
@@ -31769,7 +32530,7 @@
       <w:pPr>
         <w:numPr>
           <w:ilvl w:val="0"/>
-          <w:numId w:val="1036"/>
+          <w:numId w:val="1038"/>
         </w:numPr>
         <w:pStyle w:val="Compact"/>
       </w:pPr>
@@ -32061,8 +32822,8 @@
         </w:tc>
       </w:tr>
     </w:tbl>
-    <w:bookmarkEnd w:id="152"/>
-    <w:bookmarkStart w:id="153" w:name="tessan-1"/>
+    <w:bookmarkEnd w:id="153"/>
+    <w:bookmarkStart w:id="154" w:name="tessan-1"/>
     <w:p>
       <w:pPr>
         <w:pStyle w:val="Heading2"/>
@@ -32107,7 +32868,7 @@
       <w:pPr>
         <w:numPr>
           <w:ilvl w:val="0"/>
-          <w:numId w:val="1037"/>
+          <w:numId w:val="1039"/>
         </w:numPr>
         <w:pStyle w:val="Compact"/>
       </w:pPr>
@@ -32119,7 +32880,7 @@
       <w:pPr>
         <w:numPr>
           <w:ilvl w:val="0"/>
-          <w:numId w:val="1037"/>
+          <w:numId w:val="1039"/>
         </w:numPr>
         <w:pStyle w:val="Compact"/>
       </w:pPr>
@@ -32411,8 +33172,8 @@
         </w:tc>
       </w:tr>
     </w:tbl>
-    <w:bookmarkEnd w:id="153"/>
-    <w:bookmarkStart w:id="154" w:name="thrum"/>
+    <w:bookmarkEnd w:id="154"/>
+    <w:bookmarkStart w:id="155" w:name="thrum"/>
     <w:p>
       <w:pPr>
         <w:pStyle w:val="Heading2"/>
@@ -32457,7 +33218,7 @@
       <w:pPr>
         <w:numPr>
           <w:ilvl w:val="0"/>
-          <w:numId w:val="1038"/>
+          <w:numId w:val="1040"/>
         </w:numPr>
         <w:pStyle w:val="Compact"/>
       </w:pPr>
@@ -32749,8 +33510,8 @@
         </w:tc>
       </w:tr>
     </w:tbl>
-    <w:bookmarkEnd w:id="154"/>
-    <w:bookmarkStart w:id="155" w:name="uth"/>
+    <w:bookmarkEnd w:id="155"/>
+    <w:bookmarkStart w:id="156" w:name="uth"/>
     <w:p>
       <w:pPr>
         <w:pStyle w:val="Heading2"/>
@@ -32795,7 +33556,7 @@
       <w:pPr>
         <w:numPr>
           <w:ilvl w:val="0"/>
-          <w:numId w:val="1039"/>
+          <w:numId w:val="1041"/>
         </w:numPr>
         <w:pStyle w:val="Compact"/>
       </w:pPr>
@@ -33087,8 +33848,8 @@
         </w:tc>
       </w:tr>
     </w:tbl>
-    <w:bookmarkEnd w:id="155"/>
-    <w:bookmarkStart w:id="156" w:name="uxarra"/>
+    <w:bookmarkEnd w:id="156"/>
+    <w:bookmarkStart w:id="157" w:name="uxarra"/>
     <w:p>
       <w:pPr>
         <w:pStyle w:val="Heading2"/>
@@ -33133,7 +33894,7 @@
       <w:pPr>
         <w:numPr>
           <w:ilvl w:val="0"/>
-          <w:numId w:val="1040"/>
+          <w:numId w:val="1042"/>
         </w:numPr>
         <w:pStyle w:val="Compact"/>
       </w:pPr>
@@ -33425,8 +34186,8 @@
         </w:tc>
       </w:tr>
     </w:tbl>
-    <w:bookmarkEnd w:id="156"/>
-    <w:bookmarkStart w:id="157" w:name="vael"/>
+    <w:bookmarkEnd w:id="157"/>
+    <w:bookmarkStart w:id="158" w:name="vael"/>
     <w:p>
       <w:pPr>
         <w:pStyle w:val="Heading2"/>
@@ -33471,7 +34232,7 @@
       <w:pPr>
         <w:numPr>
           <w:ilvl w:val="0"/>
-          <w:numId w:val="1041"/>
+          <w:numId w:val="1043"/>
         </w:numPr>
         <w:pStyle w:val="Compact"/>
       </w:pPr>
@@ -33483,7 +34244,7 @@
       <w:pPr>
         <w:numPr>
           <w:ilvl w:val="0"/>
-          <w:numId w:val="1041"/>
+          <w:numId w:val="1043"/>
         </w:numPr>
         <w:pStyle w:val="Compact"/>
       </w:pPr>
@@ -33775,8 +34536,8 @@
         </w:tc>
       </w:tr>
     </w:tbl>
-    <w:bookmarkEnd w:id="157"/>
-    <w:bookmarkStart w:id="158" w:name="veyari"/>
+    <w:bookmarkEnd w:id="158"/>
+    <w:bookmarkStart w:id="159" w:name="veyari"/>
     <w:p>
       <w:pPr>
         <w:pStyle w:val="Heading2"/>
@@ -33821,7 +34582,7 @@
       <w:pPr>
         <w:numPr>
           <w:ilvl w:val="0"/>
-          <w:numId w:val="1042"/>
+          <w:numId w:val="1044"/>
         </w:numPr>
         <w:pStyle w:val="Compact"/>
       </w:pPr>
@@ -34113,8 +34874,8 @@
         </w:tc>
       </w:tr>
     </w:tbl>
-    <w:bookmarkEnd w:id="158"/>
-    <w:bookmarkStart w:id="159" w:name="ylith-1"/>
+    <w:bookmarkEnd w:id="159"/>
+    <w:bookmarkStart w:id="160" w:name="ylith-1"/>
     <w:p>
       <w:pPr>
         <w:pStyle w:val="Heading2"/>
@@ -34159,7 +34920,7 @@
       <w:pPr>
         <w:numPr>
           <w:ilvl w:val="0"/>
-          <w:numId w:val="1043"/>
+          <w:numId w:val="1045"/>
         </w:numPr>
         <w:pStyle w:val="Compact"/>
       </w:pPr>
@@ -34171,7 +34932,7 @@
       <w:pPr>
         <w:numPr>
           <w:ilvl w:val="0"/>
-          <w:numId w:val="1043"/>
+          <w:numId w:val="1045"/>
         </w:numPr>
         <w:pStyle w:val="Compact"/>
       </w:pPr>
@@ -34463,8 +35224,8 @@
         </w:tc>
       </w:tr>
     </w:tbl>
-    <w:bookmarkEnd w:id="159"/>
-    <w:bookmarkStart w:id="160" w:name="zethri"/>
+    <w:bookmarkEnd w:id="160"/>
+    <w:bookmarkStart w:id="161" w:name="zethri"/>
     <w:p>
       <w:pPr>
         <w:pStyle w:val="Heading2"/>
@@ -34509,7 +35270,7 @@
       <w:pPr>
         <w:numPr>
           <w:ilvl w:val="0"/>
-          <w:numId w:val="1044"/>
+          <w:numId w:val="1046"/>
         </w:numPr>
         <w:pStyle w:val="Compact"/>
       </w:pPr>
@@ -34801,8 +35562,8 @@
         </w:tc>
       </w:tr>
     </w:tbl>
-    <w:bookmarkEnd w:id="160"/>
-    <w:bookmarkStart w:id="161" w:name="zhaq"/>
+    <w:bookmarkEnd w:id="161"/>
+    <w:bookmarkStart w:id="162" w:name="zhaq"/>
     <w:p>
       <w:pPr>
         <w:pStyle w:val="Heading2"/>
@@ -34847,7 +35608,7 @@
       <w:pPr>
         <w:numPr>
           <w:ilvl w:val="0"/>
-          <w:numId w:val="1045"/>
+          <w:numId w:val="1047"/>
         </w:numPr>
         <w:pStyle w:val="Compact"/>
       </w:pPr>
@@ -34859,7 +35620,7 @@
       <w:pPr>
         <w:numPr>
           <w:ilvl w:val="0"/>
-          <w:numId w:val="1045"/>
+          <w:numId w:val="1047"/>
         </w:numPr>
         <w:pStyle w:val="Compact"/>
       </w:pPr>
@@ -35151,8 +35912,8 @@
         </w:tc>
       </w:tr>
     </w:tbl>
-    <w:bookmarkEnd w:id="161"/>
-    <w:bookmarkStart w:id="162" w:name="dresh"/>
+    <w:bookmarkEnd w:id="162"/>
+    <w:bookmarkStart w:id="163" w:name="dresh"/>
     <w:p>
       <w:pPr>
         <w:pStyle w:val="Heading2"/>
@@ -35197,7 +35958,7 @@
       <w:pPr>
         <w:numPr>
           <w:ilvl w:val="0"/>
-          <w:numId w:val="1046"/>
+          <w:numId w:val="1048"/>
         </w:numPr>
         <w:pStyle w:val="Compact"/>
       </w:pPr>
@@ -35209,7 +35970,7 @@
       <w:pPr>
         <w:numPr>
           <w:ilvl w:val="0"/>
-          <w:numId w:val="1046"/>
+          <w:numId w:val="1048"/>
         </w:numPr>
         <w:pStyle w:val="Compact"/>
       </w:pPr>
@@ -35221,7 +35982,7 @@
       <w:pPr>
         <w:numPr>
           <w:ilvl w:val="0"/>
-          <w:numId w:val="1046"/>
+          <w:numId w:val="1048"/>
         </w:numPr>
         <w:pStyle w:val="Compact"/>
       </w:pPr>
@@ -35513,8 +36274,8 @@
         </w:tc>
       </w:tr>
     </w:tbl>
-    <w:bookmarkEnd w:id="162"/>
-    <w:bookmarkStart w:id="163" w:name="eshuum"/>
+    <w:bookmarkEnd w:id="163"/>
+    <w:bookmarkStart w:id="164" w:name="eshuum"/>
     <w:p>
       <w:pPr>
         <w:pStyle w:val="Heading2"/>
@@ -35559,7 +36320,7 @@
       <w:pPr>
         <w:numPr>
           <w:ilvl w:val="0"/>
-          <w:numId w:val="1047"/>
+          <w:numId w:val="1049"/>
         </w:numPr>
         <w:pStyle w:val="Compact"/>
       </w:pPr>
@@ -35571,7 +36332,7 @@
       <w:pPr>
         <w:numPr>
           <w:ilvl w:val="0"/>
-          <w:numId w:val="1047"/>
+          <w:numId w:val="1049"/>
         </w:numPr>
         <w:pStyle w:val="Compact"/>
       </w:pPr>
@@ -35863,8 +36624,8 @@
         </w:tc>
       </w:tr>
     </w:tbl>
-    <w:bookmarkEnd w:id="163"/>
-    <w:bookmarkStart w:id="164" w:name="khaum"/>
+    <w:bookmarkEnd w:id="164"/>
+    <w:bookmarkStart w:id="165" w:name="khaum"/>
     <w:p>
       <w:pPr>
         <w:pStyle w:val="Heading2"/>
@@ -35909,7 +36670,7 @@
       <w:pPr>
         <w:numPr>
           <w:ilvl w:val="0"/>
-          <w:numId w:val="1048"/>
+          <w:numId w:val="1050"/>
         </w:numPr>
         <w:pStyle w:val="Compact"/>
       </w:pPr>
@@ -35921,7 +36682,7 @@
       <w:pPr>
         <w:numPr>
           <w:ilvl w:val="0"/>
-          <w:numId w:val="1048"/>
+          <w:numId w:val="1050"/>
         </w:numPr>
         <w:pStyle w:val="Compact"/>
       </w:pPr>
@@ -35933,7 +36694,7 @@
       <w:pPr>
         <w:numPr>
           <w:ilvl w:val="0"/>
-          <w:numId w:val="1048"/>
+          <w:numId w:val="1050"/>
         </w:numPr>
         <w:pStyle w:val="Compact"/>
       </w:pPr>
@@ -36225,8 +36986,8 @@
         </w:tc>
       </w:tr>
     </w:tbl>
-    <w:bookmarkEnd w:id="164"/>
-    <w:bookmarkStart w:id="165" w:name="ozhvek"/>
+    <w:bookmarkEnd w:id="165"/>
+    <w:bookmarkStart w:id="166" w:name="ozhvek"/>
     <w:p>
       <w:pPr>
         <w:pStyle w:val="Heading2"/>
@@ -36271,7 +37032,7 @@
       <w:pPr>
         <w:numPr>
           <w:ilvl w:val="0"/>
-          <w:numId w:val="1049"/>
+          <w:numId w:val="1051"/>
         </w:numPr>
         <w:pStyle w:val="Compact"/>
       </w:pPr>
@@ -36283,7 +37044,7 @@
       <w:pPr>
         <w:numPr>
           <w:ilvl w:val="0"/>
-          <w:numId w:val="1049"/>
+          <w:numId w:val="1051"/>
         </w:numPr>
         <w:pStyle w:val="Compact"/>
       </w:pPr>
@@ -36575,8 +37336,8 @@
         </w:tc>
       </w:tr>
     </w:tbl>
-    <w:bookmarkEnd w:id="165"/>
-    <w:bookmarkStart w:id="166" w:name="qor"/>
+    <w:bookmarkEnd w:id="166"/>
+    <w:bookmarkStart w:id="167" w:name="qor"/>
     <w:p>
       <w:pPr>
         <w:pStyle w:val="Heading2"/>
@@ -36621,7 +37382,7 @@
       <w:pPr>
         <w:numPr>
           <w:ilvl w:val="0"/>
-          <w:numId w:val="1050"/>
+          <w:numId w:val="1052"/>
         </w:numPr>
         <w:pStyle w:val="Compact"/>
       </w:pPr>
@@ -36633,7 +37394,7 @@
       <w:pPr>
         <w:numPr>
           <w:ilvl w:val="0"/>
-          <w:numId w:val="1050"/>
+          <w:numId w:val="1052"/>
         </w:numPr>
         <w:pStyle w:val="Compact"/>
       </w:pPr>
@@ -36925,8 +37686,8 @@
         </w:tc>
       </w:tr>
     </w:tbl>
-    <w:bookmarkEnd w:id="166"/>
-    <w:bookmarkStart w:id="167" w:name="sen"/>
+    <w:bookmarkEnd w:id="167"/>
+    <w:bookmarkStart w:id="168" w:name="sen"/>
     <w:p>
       <w:pPr>
         <w:pStyle w:val="Heading2"/>
@@ -36971,7 +37732,7 @@
       <w:pPr>
         <w:numPr>
           <w:ilvl w:val="0"/>
-          <w:numId w:val="1051"/>
+          <w:numId w:val="1053"/>
         </w:numPr>
         <w:pStyle w:val="Compact"/>
       </w:pPr>
@@ -36983,7 +37744,7 @@
       <w:pPr>
         <w:numPr>
           <w:ilvl w:val="0"/>
-          <w:numId w:val="1051"/>
+          <w:numId w:val="1053"/>
         </w:numPr>
         <w:pStyle w:val="Compact"/>
       </w:pPr>
@@ -37275,9 +38036,9 @@
         </w:tc>
       </w:tr>
     </w:tbl>
-    <w:bookmarkEnd w:id="167"/>
     <w:bookmarkEnd w:id="168"/>
-    <w:bookmarkStart w:id="179" w:name="making-your-own"/>
+    <w:bookmarkEnd w:id="169"/>
+    <w:bookmarkStart w:id="180" w:name="making-your-own"/>
     <w:p>
       <w:pPr>
         <w:pStyle w:val="Heading1"/>
@@ -37310,7 +38071,7 @@
         <w:t xml:space="preserve">option at the end of each list, and its checklist holds a custom choice to the same rules as everything else.</w:t>
       </w:r>
     </w:p>
-    <w:bookmarkStart w:id="169" w:name="a-custom-calling"/>
+    <w:bookmarkStart w:id="170" w:name="a-custom-calling"/>
     <w:p>
       <w:pPr>
         <w:pStyle w:val="Heading2"/>
@@ -37331,7 +38092,7 @@
       <w:pPr>
         <w:numPr>
           <w:ilvl w:val="0"/>
-          <w:numId w:val="1052"/>
+          <w:numId w:val="1054"/>
         </w:numPr>
         <w:pStyle w:val="Compact"/>
       </w:pPr>
@@ -37377,7 +38138,7 @@
       <w:pPr>
         <w:numPr>
           <w:ilvl w:val="0"/>
-          <w:numId w:val="1052"/>
+          <w:numId w:val="1054"/>
         </w:numPr>
         <w:pStyle w:val="Compact"/>
       </w:pPr>
@@ -37399,7 +38160,7 @@
       <w:pPr>
         <w:numPr>
           <w:ilvl w:val="0"/>
-          <w:numId w:val="1052"/>
+          <w:numId w:val="1054"/>
         </w:numPr>
         <w:pStyle w:val="Compact"/>
       </w:pPr>
@@ -37421,7 +38182,7 @@
       <w:pPr>
         <w:numPr>
           <w:ilvl w:val="0"/>
-          <w:numId w:val="1052"/>
+          <w:numId w:val="1054"/>
         </w:numPr>
         <w:pStyle w:val="Compact"/>
       </w:pPr>
@@ -37486,8 +38247,8 @@
         <w:t xml:space="preserve">.</w:t>
       </w:r>
     </w:p>
-    <w:bookmarkEnd w:id="169"/>
-    <w:bookmarkStart w:id="178" w:name="a-custom-species"/>
+    <w:bookmarkEnd w:id="170"/>
+    <w:bookmarkStart w:id="179" w:name="a-custom-species"/>
     <w:p>
       <w:pPr>
         <w:pStyle w:val="Heading2"/>
@@ -37504,7 +38265,7 @@
         <w:t xml:space="preserve">Build it with the GM, one step at a time.</w:t>
       </w:r>
     </w:p>
-    <w:bookmarkStart w:id="170" w:name="the-concept"/>
+    <w:bookmarkStart w:id="171" w:name="the-concept"/>
     <w:p>
       <w:pPr>
         <w:pStyle w:val="Heading3"/>
@@ -37521,8 +38282,8 @@
         <w:t xml:space="preserve">Two or three sentences: where they come from, what sets them apart, and how others see them. It should be something the species in this book don’t already cover.</w:t>
       </w:r>
     </w:p>
-    <w:bookmarkEnd w:id="170"/>
-    <w:bookmarkStart w:id="171" w:name="the-tier"/>
+    <w:bookmarkEnd w:id="171"/>
+    <w:bookmarkStart w:id="172" w:name="the-tier"/>
     <w:p>
       <w:pPr>
         <w:pStyle w:val="Heading3"/>
@@ -37819,8 +38580,8 @@
         <w:t xml:space="preserve">When in doubt, choose the higher tier.</w:t>
       </w:r>
     </w:p>
-    <w:bookmarkEnd w:id="171"/>
-    <w:bookmarkStart w:id="172" w:name="attribute-adjustments"/>
+    <w:bookmarkEnd w:id="172"/>
+    <w:bookmarkStart w:id="173" w:name="attribute-adjustments"/>
     <w:p>
       <w:pPr>
         <w:pStyle w:val="Heading3"/>
@@ -37866,8 +38627,8 @@
         <w:t xml:space="preserve">: a +2 needs a −2 or two −1s. The adjustments move the attribute’s base (+1 starts it at 11) and raise its starting maximum (13 plus the bonus). Most species change two to four attributes.</w:t>
       </w:r>
     </w:p>
-    <w:bookmarkEnd w:id="172"/>
-    <w:bookmarkStart w:id="173" w:name="core-rules-tier-1-and-up"/>
+    <w:bookmarkEnd w:id="173"/>
+    <w:bookmarkStart w:id="174" w:name="core-rules-tier-1-and-up"/>
     <w:p>
       <w:pPr>
         <w:pStyle w:val="Heading3"/>
@@ -37884,8 +38645,8 @@
         <w:t xml:space="preserve">One to three short rules that always apply: what they can do (see in the dark, resist cold, a free Trained skill) and what it costs (a weakness, a people’s distrust, a hazard they can’t abide). A strength with no drawback is worth more than it looks, so price it a tier higher.</w:t>
       </w:r>
     </w:p>
-    <w:bookmarkEnd w:id="173"/>
-    <w:bookmarkStart w:id="174" w:name="species-advantages"/>
+    <w:bookmarkEnd w:id="174"/>
+    <w:bookmarkStart w:id="175" w:name="species-advantages"/>
     <w:p>
       <w:pPr>
         <w:pStyle w:val="Heading3"/>
@@ -37940,8 +38701,8 @@
         <w:t xml:space="preserve">: a problem the trait causes, with a clear trigger and a real consequence, which earns a Resolve point when it bites, like any complication. A character takes one advantage, general or species, so make them distinct choices.</w:t>
       </w:r>
     </w:p>
-    <w:bookmarkEnd w:id="174"/>
-    <w:bookmarkStart w:id="175" w:name="an-alternate-form-optional-tier-2-or-3"/>
+    <w:bookmarkEnd w:id="175"/>
+    <w:bookmarkStart w:id="176" w:name="an-alternate-form-optional-tier-2-or-3"/>
     <w:p>
       <w:pPr>
         <w:pStyle w:val="Heading3"/>
@@ -37974,8 +38735,8 @@
         <w:t xml:space="preserve">apply.</w:t>
       </w:r>
     </w:p>
-    <w:bookmarkEnd w:id="175"/>
-    <w:bookmarkStart w:id="176" w:name="in-the-creator"/>
+    <w:bookmarkEnd w:id="176"/>
+    <w:bookmarkStart w:id="177" w:name="in-the-creator"/>
     <w:p>
       <w:pPr>
         <w:pStyle w:val="Heading3"/>
@@ -37988,7 +38749,7 @@
       <w:pPr>
         <w:numPr>
           <w:ilvl w:val="0"/>
-          <w:numId w:val="1053"/>
+          <w:numId w:val="1055"/>
         </w:numPr>
         <w:pStyle w:val="Compact"/>
       </w:pPr>
@@ -38016,7 +38777,7 @@
       <w:pPr>
         <w:numPr>
           <w:ilvl w:val="0"/>
-          <w:numId w:val="1053"/>
+          <w:numId w:val="1055"/>
         </w:numPr>
         <w:pStyle w:val="Compact"/>
       </w:pPr>
@@ -38028,7 +38789,7 @@
       <w:pPr>
         <w:numPr>
           <w:ilvl w:val="0"/>
-          <w:numId w:val="1053"/>
+          <w:numId w:val="1055"/>
         </w:numPr>
         <w:pStyle w:val="Compact"/>
       </w:pPr>
@@ -38056,7 +38817,7 @@
       <w:pPr>
         <w:numPr>
           <w:ilvl w:val="0"/>
-          <w:numId w:val="1053"/>
+          <w:numId w:val="1055"/>
         </w:numPr>
         <w:pStyle w:val="Compact"/>
       </w:pPr>
@@ -38080,8 +38841,8 @@
         <w:t xml:space="preserve">and enter the advantage and its companion complication.</w:t>
       </w:r>
     </w:p>
-    <w:bookmarkEnd w:id="176"/>
-    <w:bookmarkStart w:id="177" w:name="example"/>
+    <w:bookmarkEnd w:id="177"/>
+    <w:bookmarkStart w:id="178" w:name="example"/>
     <w:p>
       <w:pPr>
         <w:pStyle w:val="Heading3"/>
@@ -38186,10 +38947,10 @@
         <w:t xml:space="preserve">: your family’s dynasty calls on you; accept the errand.</w:t>
       </w:r>
     </w:p>
-    <w:bookmarkEnd w:id="177"/>
     <w:bookmarkEnd w:id="178"/>
     <w:bookmarkEnd w:id="179"/>
-    <w:bookmarkStart w:id="180" w:name="complications"/>
+    <w:bookmarkEnd w:id="180"/>
+    <w:bookmarkStart w:id="181" w:name="complications"/>
     <w:p>
       <w:pPr>
         <w:pStyle w:val="Heading1"/>
@@ -38894,8 +39655,8 @@
         </w:tc>
       </w:tr>
     </w:tbl>
-    <w:bookmarkEnd w:id="180"/>
-    <w:bookmarkStart w:id="182" w:name="quick-reference"/>
+    <w:bookmarkEnd w:id="181"/>
+    <w:bookmarkStart w:id="183" w:name="quick-reference"/>
     <w:p>
       <w:pPr>
         <w:pStyle w:val="Heading1"/>
@@ -39086,7 +39847,7 @@
       <w:r>
         <w:t xml:space="preserve"> </w:t>
       </w:r>
-      <w:hyperlink r:id="rId181">
+      <w:hyperlink r:id="rId182">
         <w:r>
           <w:rPr>
             <w:rStyle w:val="Hyperlink"/>
@@ -39098,7 +39859,7 @@
         <w:t xml:space="preserve">. You may share, adapt, and use it for any purpose, including commercially, as long as you give appropriate credit to the author.</w:t>
       </w:r>
     </w:p>
-    <w:bookmarkEnd w:id="182"/>
+    <w:bookmarkEnd w:id="183"/>
     <w:sectPr/>
   </w:body>
 </w:document>
@@ -39463,6 +40224,12 @@
     <w:abstractNumId w:val="991"/>
   </w:num>
   <w:num w:numId="1014">
+    <w:abstractNumId w:val="991"/>
+  </w:num>
+  <w:num w:numId="1015">
+    <w:abstractNumId w:val="991"/>
+  </w:num>
+  <w:num w:numId="1016">
     <w:abstractNumId w:val="99411"/>
     <w:lvlOverride w:ilvl="0">
       <w:startOverride w:val="1"/>
@@ -39492,12 +40259,6 @@
       <w:startOverride w:val="1"/>
     </w:lvlOverride>
   </w:num>
-  <w:num w:numId="1015">
-    <w:abstractNumId w:val="991"/>
-  </w:num>
-  <w:num w:numId="1016">
-    <w:abstractNumId w:val="991"/>
-  </w:num>
   <w:num w:numId="1017">
     <w:abstractNumId w:val="991"/>
   </w:num>
@@ -39505,6 +40266,12 @@
     <w:abstractNumId w:val="991"/>
   </w:num>
   <w:num w:numId="1019">
+    <w:abstractNumId w:val="991"/>
+  </w:num>
+  <w:num w:numId="1020">
+    <w:abstractNumId w:val="991"/>
+  </w:num>
+  <w:num w:numId="1021">
     <w:abstractNumId w:val="99411"/>
     <w:lvlOverride w:ilvl="0">
       <w:startOverride w:val="1"/>
@@ -39533,12 +40300,6 @@
     <w:lvlOverride w:ilvl="8">
       <w:startOverride w:val="1"/>
     </w:lvlOverride>
-  </w:num>
-  <w:num w:numId="1020">
-    <w:abstractNumId w:val="991"/>
-  </w:num>
-  <w:num w:numId="1021">
-    <w:abstractNumId w:val="991"/>
   </w:num>
   <w:num w:numId="1022">
     <w:abstractNumId w:val="991"/>
@@ -39631,6 +40392,12 @@
     <w:abstractNumId w:val="991"/>
   </w:num>
   <w:num w:numId="1052">
+    <w:abstractNumId w:val="991"/>
+  </w:num>
+  <w:num w:numId="1053">
+    <w:abstractNumId w:val="991"/>
+  </w:num>
+  <w:num w:numId="1054">
     <w:abstractNumId w:val="99411"/>
     <w:lvlOverride w:ilvl="0">
       <w:startOverride w:val="1"/>
@@ -39660,7 +40427,7 @@
       <w:startOverride w:val="1"/>
     </w:lvlOverride>
   </w:num>
-  <w:num w:numId="1053">
+  <w:num w:numId="1055">
     <w:abstractNumId w:val="99411"/>
     <w:lvlOverride w:ilvl="0">
       <w:startOverride w:val="1"/>

</xml_diff>